<commit_message>
near TetMeshGenerator.cs (bump & wrinkles)
</commit_message>
<xml_diff>
--- a/Assets/Soft_Tricks.docx
+++ b/Assets/Soft_Tricks.docx
@@ -4,7 +4,7 @@
   <w:body>
     <w:p>
       <w:pPr>
-        <w:pStyle w:val="139"/>
+        <w:pStyle w:val="834"/>
         <w:pBdr>
           <w:top w:val="none" w:color="000000" w:sz="4" w:space="0"/>
           <w:left w:val="none" w:color="000000" w:sz="4" w:space="0"/>
@@ -146,7 +146,7 @@
                         </pic:cNvPicPr>
                         <pic:nvPr/>
                       </pic:nvPicPr>
-                      <pic:blipFill>
+                      <pic:blipFill rotWithShape="1">
                         <a:blip r:embed="rId9"/>
                         <a:stretch/>
                       </pic:blipFill>
@@ -206,29 +206,8 @@
       <w:r>
         <w:rPr>
           <w:rFonts w:ascii="Times New Roman" w:hAnsi="Times New Roman" w:eastAsia="Times New Roman" w:cs="Times New Roman"/>
-          <w:b/>
-          <w:color w:val="000000"/>
           <w:sz w:val="24"/>
-          <w:highlight w:val="none"/>
-        </w:rPr>
-      </w:r>
-      <w:r/>
-      <w:r>
-        <w:rPr>
-          <w:rFonts w:ascii="Times New Roman" w:hAnsi="Times New Roman" w:eastAsia="Times New Roman" w:cs="Times New Roman"/>
-          <w:b/>
-          <w:color w:val="000000"/>
-          <w:sz w:val="24"/>
-          <w:highlight w:val="none"/>
-        </w:rPr>
-      </w:r>
-      <w:r>
-        <w:rPr>
-          <w:rFonts w:ascii="Times New Roman" w:hAnsi="Times New Roman" w:eastAsia="Times New Roman" w:cs="Times New Roman"/>
-          <w:b/>
-          <w:color w:val="000000"/>
-          <w:sz w:val="24"/>
-          <w:highlight w:val="none"/>
+          <w:szCs w:val="24"/>
         </w:rPr>
       </w:r>
     </w:p>
@@ -261,7 +240,17 @@
         </w:rPr>
         <w:t xml:space="preserve">Crystal clear.</w:t>
       </w:r>
-      <w:r/>
+      <w:r>
+        <w:rPr>
+          <w:rFonts w:ascii="Times New Roman" w:hAnsi="Times New Roman" w:eastAsia="Times New Roman" w:cs="Times New Roman"/>
+          <w:b/>
+          <w:bCs/>
+          <w:color w:val="000000"/>
+          <w:sz w:val="24"/>
+          <w:szCs w:val="24"/>
+          <w:highlight w:val="none"/>
+        </w:rPr>
+      </w:r>
     </w:p>
     <w:p>
       <w:pPr>
@@ -304,6 +293,7 @@
     </w:p>
     <w:tbl>
       <w:tblPr>
+        <w:tblStyle w:val="707"/>
         <w:tblInd w:w="0" w:type="dxa"/>
         <w:tblW w:w="0" w:type="auto"/>
         <w:tblBorders>
@@ -316,7 +306,6 @@
         </w:tblBorders>
         <w:tblLayout w:type="autofit"/>
         <w:tblLook w:val="04A0" w:firstRow="1" w:lastRow="0" w:firstColumn="1" w:lastColumn="0" w:noHBand="0" w:noVBand="1"/>
-        <w:tblStyle w:val="11"/>
       </w:tblPr>
       <w:tblGrid>
         <w:gridCol w:w="946"/>
@@ -342,7 +331,7 @@
           <w:p>
             <w:pPr>
               <w:pBdr/>
-              <w:spacing w:after="0" w:before="0" w:line="240"/>
+              <w:spacing w:after="0" w:before="0" w:line="240" w:lineRule="auto"/>
               <w:ind/>
               <w:jc w:val="center"/>
               <w:rPr/>
@@ -376,7 +365,7 @@
           <w:p>
             <w:pPr>
               <w:pBdr/>
-              <w:spacing w:after="0" w:before="0" w:line="240"/>
+              <w:spacing w:after="0" w:before="0" w:line="240" w:lineRule="auto"/>
               <w:ind/>
               <w:jc w:val="center"/>
               <w:rPr/>
@@ -410,7 +399,7 @@
           <w:p>
             <w:pPr>
               <w:pBdr/>
-              <w:spacing w:after="0" w:before="0" w:line="240"/>
+              <w:spacing w:after="0" w:before="0" w:line="240" w:lineRule="auto"/>
               <w:ind/>
               <w:jc w:val="center"/>
               <w:rPr/>
@@ -447,7 +436,7 @@
           <w:p>
             <w:pPr>
               <w:pBdr/>
-              <w:spacing w:after="0" w:before="0" w:line="240"/>
+              <w:spacing w:after="0" w:before="0" w:line="240" w:lineRule="auto"/>
               <w:ind/>
               <w:rPr/>
             </w:pPr>
@@ -479,7 +468,7 @@
           <w:p>
             <w:pPr>
               <w:pBdr/>
-              <w:spacing w:after="0" w:before="0" w:line="240"/>
+              <w:spacing w:after="0" w:before="0" w:line="240" w:lineRule="auto"/>
               <w:ind/>
               <w:rPr/>
             </w:pPr>
@@ -512,7 +501,7 @@
           <w:p>
             <w:pPr>
               <w:pBdr/>
-              <w:spacing w:after="0" w:before="0" w:line="240"/>
+              <w:spacing w:after="0" w:before="0" w:line="240" w:lineRule="auto"/>
               <w:ind/>
               <w:rPr/>
             </w:pPr>
@@ -547,7 +536,7 @@
           <w:p>
             <w:pPr>
               <w:pBdr/>
-              <w:spacing w:after="0" w:before="0" w:line="240"/>
+              <w:spacing w:after="0" w:before="0" w:line="240" w:lineRule="auto"/>
               <w:ind/>
               <w:rPr/>
             </w:pPr>
@@ -579,7 +568,7 @@
           <w:p>
             <w:pPr>
               <w:pBdr/>
-              <w:spacing w:after="0" w:before="0" w:line="240"/>
+              <w:spacing w:after="0" w:before="0" w:line="240" w:lineRule="auto"/>
               <w:ind/>
               <w:rPr/>
             </w:pPr>
@@ -612,7 +601,7 @@
           <w:p>
             <w:pPr>
               <w:pBdr/>
-              <w:spacing w:after="0" w:before="0" w:line="240"/>
+              <w:spacing w:after="0" w:before="0" w:line="240" w:lineRule="auto"/>
               <w:ind/>
               <w:rPr/>
             </w:pPr>
@@ -647,7 +636,7 @@
           <w:p>
             <w:pPr>
               <w:pBdr/>
-              <w:spacing w:after="0" w:before="0" w:line="240"/>
+              <w:spacing w:after="0" w:before="0" w:line="240" w:lineRule="auto"/>
               <w:ind/>
               <w:rPr/>
             </w:pPr>
@@ -679,7 +668,7 @@
           <w:p>
             <w:pPr>
               <w:pBdr/>
-              <w:spacing w:after="0" w:before="0" w:line="240"/>
+              <w:spacing w:after="0" w:before="0" w:line="240" w:lineRule="auto"/>
               <w:ind/>
               <w:rPr/>
             </w:pPr>
@@ -712,7 +701,7 @@
           <w:p>
             <w:pPr>
               <w:pBdr/>
-              <w:spacing w:after="0" w:before="0" w:line="240"/>
+              <w:spacing w:after="0" w:before="0" w:line="240" w:lineRule="auto"/>
               <w:ind/>
               <w:rPr/>
             </w:pPr>
@@ -747,7 +736,7 @@
           <w:p>
             <w:pPr>
               <w:pBdr/>
-              <w:spacing w:after="0" w:before="0" w:line="240"/>
+              <w:spacing w:after="0" w:before="0" w:line="240" w:lineRule="auto"/>
               <w:ind/>
               <w:rPr/>
             </w:pPr>
@@ -779,7 +768,7 @@
           <w:p>
             <w:pPr>
               <w:pBdr/>
-              <w:spacing w:after="0" w:before="0" w:line="240"/>
+              <w:spacing w:after="0" w:before="0" w:line="240" w:lineRule="auto"/>
               <w:ind/>
               <w:rPr/>
             </w:pPr>
@@ -812,7 +801,7 @@
           <w:p>
             <w:pPr>
               <w:pBdr/>
-              <w:spacing w:after="0" w:before="0" w:line="240"/>
+              <w:spacing w:after="0" w:before="0" w:line="240" w:lineRule="auto"/>
               <w:ind/>
               <w:rPr/>
             </w:pPr>
@@ -853,7 +842,7 @@
     </w:p>
     <w:p>
       <w:pPr>
-        <w:pStyle w:val="668"/>
+        <w:pStyle w:val="896"/>
         <w:numPr>
           <w:ilvl w:val="0"/>
           <w:numId w:val="1"/>
@@ -896,7 +885,7 @@
     </w:p>
     <w:p>
       <w:pPr>
-        <w:pStyle w:val="668"/>
+        <w:pStyle w:val="896"/>
         <w:numPr>
           <w:ilvl w:val="0"/>
           <w:numId w:val="1"/>
@@ -948,7 +937,7 @@
     </w:p>
     <w:p>
       <w:pPr>
-        <w:pStyle w:val="668"/>
+        <w:pStyle w:val="896"/>
         <w:numPr>
           <w:ilvl w:val="1"/>
           <w:numId w:val="2"/>
@@ -1000,7 +989,7 @@
     </w:p>
     <w:p>
       <w:pPr>
-        <w:pStyle w:val="668"/>
+        <w:pStyle w:val="896"/>
         <w:numPr>
           <w:ilvl w:val="1"/>
           <w:numId w:val="2"/>
@@ -1060,7 +1049,7 @@
     </w:p>
     <w:p>
       <w:pPr>
-        <w:pStyle w:val="668"/>
+        <w:pStyle w:val="896"/>
         <w:numPr>
           <w:ilvl w:val="0"/>
           <w:numId w:val="3"/>
@@ -1107,7 +1096,17 @@
           <w:color w:val="000000"/>
           <w:sz w:val="24"/>
         </w:rPr>
-        <w:t xml:space="preserve">One Face Per Tet ✅</w:t>
+        <w:t xml:space="preserve">One Face Per Tet </w:t>
+      </w:r>
+      <w:r>
+        <w:rPr>
+          <w:rFonts w:ascii="Times New Roman" w:hAnsi="Times New Roman" w:eastAsia="Times New Roman" w:cs="Times New Roman"/>
+          <w:b/>
+          <w:color w:val="000000"/>
+          <w:sz w:val="24"/>
+          <w:lang w:val="zh-CN"/>
+        </w:rPr>
+        <w:t xml:space="preserve">checked</w:t>
       </w:r>
       <w:r/>
     </w:p>
@@ -1118,7 +1117,6 @@
         <w:ind/>
         <w:rPr/>
       </w:pPr>
-      <w:r/>
       <w:r>
         <mc:AlternateContent>
           <mc:Choice Requires="wpg">
@@ -1140,7 +1138,7 @@
                         </pic:cNvPicPr>
                         <pic:nvPr/>
                       </pic:nvPicPr>
-                      <pic:blipFill>
+                      <pic:blipFill rotWithShape="1">
                         <a:blip r:embed="rId10"/>
                         <a:stretch/>
                       </pic:blipFill>
@@ -1189,7 +1187,6 @@
         </mc:AlternateContent>
       </w:r>
       <w:r/>
-      <w:r/>
     </w:p>
     <w:sectPr>
       <w:footnotePr/>
@@ -1213,7 +1210,6 @@
         <w:ind/>
         <w:rPr/>
       </w:pPr>
-      <w:r/>
       <w:r>
         <w:separator/>
       </w:r>
@@ -1228,7 +1224,6 @@
         <w:ind/>
         <w:rPr/>
       </w:pPr>
-      <w:r/>
       <w:r>
         <w:continuationSeparator/>
       </w:r>
@@ -1248,7 +1243,6 @@
         <w:ind/>
         <w:rPr/>
       </w:pPr>
-      <w:r/>
       <w:r>
         <w:separator/>
       </w:r>
@@ -1263,7 +1257,6 @@
         <w:ind/>
         <w:rPr/>
       </w:pPr>
-      <w:r/>
       <w:r>
         <w:continuationSeparator/>
       </w:r>
@@ -1851,9 +1844,9 @@
     <w:lsdException w:name="Bibliography" w:uiPriority="37"/>
     <w:lsdException w:name="TOC Heading" w:uiPriority="39" w:qFormat="1"/>
   </w:latentStyles>
-  <w:style w:type="table" w:styleId="11">
+  <w:style w:type="table" w:styleId="707">
     <w:name w:val="Table Grid"/>
-    <w:basedOn w:val="665"/>
+    <w:basedOn w:val="893"/>
     <w:uiPriority w:val="59"/>
     <w:pPr>
       <w:pBdr/>
@@ -2050,9 +2043,9 @@
       </w:tcPr>
     </w:tblStylePr>
   </w:style>
-  <w:style w:type="table" w:styleId="12">
+  <w:style w:type="table" w:styleId="708">
     <w:name w:val="Table Grid Light"/>
-    <w:basedOn w:val="665"/>
+    <w:basedOn w:val="893"/>
     <w:uiPriority w:val="59"/>
     <w:pPr>
       <w:pBdr/>
@@ -2249,9 +2242,9 @@
       </w:tcPr>
     </w:tblStylePr>
   </w:style>
-  <w:style w:type="table" w:styleId="13">
+  <w:style w:type="table" w:styleId="709">
     <w:name w:val="Plain Table 1"/>
-    <w:basedOn w:val="665"/>
+    <w:basedOn w:val="893"/>
     <w:uiPriority w:val="59"/>
     <w:pPr>
       <w:pBdr/>
@@ -2474,9 +2467,9 @@
       </w:tcPr>
     </w:tblStylePr>
   </w:style>
-  <w:style w:type="table" w:styleId="14">
+  <w:style w:type="table" w:styleId="710">
     <w:name w:val="Plain Table 2"/>
-    <w:basedOn w:val="665"/>
+    <w:basedOn w:val="893"/>
     <w:uiPriority w:val="59"/>
     <w:pPr>
       <w:pBdr/>
@@ -2707,9 +2700,9 @@
       </w:tcPr>
     </w:tblStylePr>
   </w:style>
-  <w:style w:type="table" w:styleId="15">
+  <w:style w:type="table" w:styleId="711">
     <w:name w:val="Plain Table 3"/>
-    <w:basedOn w:val="665"/>
+    <w:basedOn w:val="893"/>
     <w:uiPriority w:val="99"/>
     <w:pPr>
       <w:pBdr/>
@@ -2937,9 +2930,9 @@
       </w:tcPr>
     </w:tblStylePr>
   </w:style>
-  <w:style w:type="table" w:styleId="16">
+  <w:style w:type="table" w:styleId="712">
     <w:name w:val="Plain Table 4"/>
-    <w:basedOn w:val="665"/>
+    <w:basedOn w:val="893"/>
     <w:uiPriority w:val="99"/>
     <w:pPr>
       <w:pBdr/>
@@ -3153,9 +3146,9 @@
       </w:tcPr>
     </w:tblStylePr>
   </w:style>
-  <w:style w:type="table" w:styleId="17">
+  <w:style w:type="table" w:styleId="713">
     <w:name w:val="Plain Table 5"/>
-    <w:basedOn w:val="665"/>
+    <w:basedOn w:val="893"/>
     <w:uiPriority w:val="99"/>
     <w:pPr>
       <w:pBdr/>
@@ -3386,9 +3379,9 @@
       </w:tcPr>
     </w:tblStylePr>
   </w:style>
-  <w:style w:type="table" w:styleId="18">
+  <w:style w:type="table" w:styleId="714">
     <w:name w:val="Grid Table 1 Light"/>
-    <w:basedOn w:val="665"/>
+    <w:basedOn w:val="893"/>
     <w:uiPriority w:val="99"/>
     <w:pPr>
       <w:pBdr/>
@@ -3609,9 +3602,9 @@
       </w:tcPr>
     </w:tblStylePr>
   </w:style>
-  <w:style w:type="table" w:styleId="19">
+  <w:style w:type="table" w:styleId="715">
     <w:name w:val="Grid Table 1 Light - Accent 1"/>
-    <w:basedOn w:val="665"/>
+    <w:basedOn w:val="893"/>
     <w:uiPriority w:val="99"/>
     <w:pPr>
       <w:pBdr/>
@@ -3832,9 +3825,9 @@
       </w:tcPr>
     </w:tblStylePr>
   </w:style>
-  <w:style w:type="table" w:styleId="20">
+  <w:style w:type="table" w:styleId="716">
     <w:name w:val="Grid Table 1 Light - Accent 2"/>
-    <w:basedOn w:val="665"/>
+    <w:basedOn w:val="893"/>
     <w:uiPriority w:val="99"/>
     <w:pPr>
       <w:pBdr/>
@@ -4055,9 +4048,9 @@
       </w:tcPr>
     </w:tblStylePr>
   </w:style>
-  <w:style w:type="table" w:styleId="21">
+  <w:style w:type="table" w:styleId="717">
     <w:name w:val="Grid Table 1 Light - Accent 3"/>
-    <w:basedOn w:val="665"/>
+    <w:basedOn w:val="893"/>
     <w:uiPriority w:val="99"/>
     <w:pPr>
       <w:pBdr/>
@@ -4278,9 +4271,9 @@
       </w:tcPr>
     </w:tblStylePr>
   </w:style>
-  <w:style w:type="table" w:styleId="22">
+  <w:style w:type="table" w:styleId="718">
     <w:name w:val="Grid Table 1 Light - Accent 4"/>
-    <w:basedOn w:val="665"/>
+    <w:basedOn w:val="893"/>
     <w:uiPriority w:val="99"/>
     <w:pPr>
       <w:pBdr/>
@@ -4501,9 +4494,9 @@
       </w:tcPr>
     </w:tblStylePr>
   </w:style>
-  <w:style w:type="table" w:styleId="23">
+  <w:style w:type="table" w:styleId="719">
     <w:name w:val="Grid Table 1 Light - Accent 5"/>
-    <w:basedOn w:val="665"/>
+    <w:basedOn w:val="893"/>
     <w:uiPriority w:val="99"/>
     <w:pPr>
       <w:pBdr/>
@@ -4724,9 +4717,9 @@
       </w:tcPr>
     </w:tblStylePr>
   </w:style>
-  <w:style w:type="table" w:styleId="24">
+  <w:style w:type="table" w:styleId="720">
     <w:name w:val="Grid Table 1 Light - Accent 6"/>
-    <w:basedOn w:val="665"/>
+    <w:basedOn w:val="893"/>
     <w:uiPriority w:val="99"/>
     <w:pPr>
       <w:pBdr/>
@@ -4947,9 +4940,9 @@
       </w:tcPr>
     </w:tblStylePr>
   </w:style>
-  <w:style w:type="table" w:styleId="25">
+  <w:style w:type="table" w:styleId="721">
     <w:name w:val="Grid Table 2"/>
-    <w:basedOn w:val="665"/>
+    <w:basedOn w:val="893"/>
     <w:uiPriority w:val="99"/>
     <w:pPr>
       <w:pBdr/>
@@ -5179,9 +5172,9 @@
       </w:tcPr>
     </w:tblStylePr>
   </w:style>
-  <w:style w:type="table" w:styleId="26">
+  <w:style w:type="table" w:styleId="722">
     <w:name w:val="Grid Table 2 - Accent 1"/>
-    <w:basedOn w:val="665"/>
+    <w:basedOn w:val="893"/>
     <w:uiPriority w:val="99"/>
     <w:pPr>
       <w:pBdr/>
@@ -5411,9 +5404,9 @@
       </w:tcPr>
     </w:tblStylePr>
   </w:style>
-  <w:style w:type="table" w:styleId="27">
+  <w:style w:type="table" w:styleId="723">
     <w:name w:val="Grid Table 2 - Accent 2"/>
-    <w:basedOn w:val="665"/>
+    <w:basedOn w:val="893"/>
     <w:uiPriority w:val="99"/>
     <w:pPr>
       <w:pBdr/>
@@ -5643,9 +5636,9 @@
       </w:tcPr>
     </w:tblStylePr>
   </w:style>
-  <w:style w:type="table" w:styleId="28">
+  <w:style w:type="table" w:styleId="724">
     <w:name w:val="Grid Table 2 - Accent 3"/>
-    <w:basedOn w:val="665"/>
+    <w:basedOn w:val="893"/>
     <w:uiPriority w:val="99"/>
     <w:pPr>
       <w:pBdr/>
@@ -5875,9 +5868,9 @@
       </w:tcPr>
     </w:tblStylePr>
   </w:style>
-  <w:style w:type="table" w:styleId="29">
+  <w:style w:type="table" w:styleId="725">
     <w:name w:val="Grid Table 2 - Accent 4"/>
-    <w:basedOn w:val="665"/>
+    <w:basedOn w:val="893"/>
     <w:uiPriority w:val="99"/>
     <w:pPr>
       <w:pBdr/>
@@ -6107,9 +6100,9 @@
       </w:tcPr>
     </w:tblStylePr>
   </w:style>
-  <w:style w:type="table" w:styleId="30">
+  <w:style w:type="table" w:styleId="726">
     <w:name w:val="Grid Table 2 - Accent 5"/>
-    <w:basedOn w:val="665"/>
+    <w:basedOn w:val="893"/>
     <w:uiPriority w:val="99"/>
     <w:pPr>
       <w:pBdr/>
@@ -6339,9 +6332,9 @@
       </w:tcPr>
     </w:tblStylePr>
   </w:style>
-  <w:style w:type="table" w:styleId="31">
+  <w:style w:type="table" w:styleId="727">
     <w:name w:val="Grid Table 2 - Accent 6"/>
-    <w:basedOn w:val="665"/>
+    <w:basedOn w:val="893"/>
     <w:uiPriority w:val="99"/>
     <w:pPr>
       <w:pBdr/>
@@ -6571,9 +6564,9 @@
       </w:tcPr>
     </w:tblStylePr>
   </w:style>
-  <w:style w:type="table" w:styleId="32">
+  <w:style w:type="table" w:styleId="728">
     <w:name w:val="Grid Table 3"/>
-    <w:basedOn w:val="665"/>
+    <w:basedOn w:val="893"/>
     <w:uiPriority w:val="99"/>
     <w:pPr>
       <w:pBdr/>
@@ -6672,29 +6665,6 @@
         <w:tblBorders/>
       </w:tblPr>
       <w:tcPr>
-        <w:shd w:color="ffffff"/>
-        <w:tcBorders>
-          <w:top w:val="none" w:color="000000" w:sz="4" w:space="0"/>
-          <w:left w:val="none" w:color="000000" w:sz="4" w:space="0"/>
-          <w:bottom w:val="none" w:color="000000" w:sz="4" w:space="0"/>
-          <w:right w:val="none" w:color="000000" w:sz="4" w:space="0"/>
-        </w:tcBorders>
-      </w:tcPr>
-    </w:tblStylePr>
-    <w:tblStylePr w:type="firstRow">
-      <w:rPr>
-        <w:b/>
-        <w:color w:val="404040"/>
-      </w:rPr>
-      <w:pPr>
-        <w:pBdr/>
-        <w:spacing/>
-        <w:ind/>
-      </w:pPr>
-      <w:tblPr>
-        <w:tblBorders/>
-      </w:tblPr>
-      <w:tcPr>
         <w:shd w:val="clear" w:color="ffffff"/>
         <w:tcBorders>
           <w:top w:val="none" w:color="000000" w:sz="4" w:space="0"/>
@@ -6704,30 +6674,7 @@
         </w:tcBorders>
       </w:tcPr>
     </w:tblStylePr>
-    <w:tblStylePr w:type="lastCol">
-      <w:rPr>
-        <w:i/>
-        <w:color w:val="404040"/>
-      </w:rPr>
-      <w:pPr>
-        <w:pBdr/>
-        <w:spacing/>
-        <w:ind/>
-      </w:pPr>
-      <w:tblPr>
-        <w:tblBorders/>
-      </w:tblPr>
-      <w:tcPr>
-        <w:shd w:color="ffffff"/>
-        <w:tcBorders>
-          <w:top w:val="none" w:color="000000" w:sz="4" w:space="0"/>
-          <w:left w:val="none" w:color="000000" w:sz="4" w:space="0"/>
-          <w:bottom w:val="none" w:color="000000" w:sz="4" w:space="0"/>
-          <w:right w:val="none" w:color="000000" w:sz="4" w:space="0"/>
-        </w:tcBorders>
-      </w:tcPr>
-    </w:tblStylePr>
-    <w:tblStylePr w:type="lastRow">
+    <w:tblStylePr w:type="firstRow">
       <w:rPr>
         <w:b/>
         <w:color w:val="404040"/>
@@ -6750,6 +6697,52 @@
         </w:tcBorders>
       </w:tcPr>
     </w:tblStylePr>
+    <w:tblStylePr w:type="lastCol">
+      <w:rPr>
+        <w:i/>
+        <w:color w:val="404040"/>
+      </w:rPr>
+      <w:pPr>
+        <w:pBdr/>
+        <w:spacing/>
+        <w:ind/>
+      </w:pPr>
+      <w:tblPr>
+        <w:tblBorders/>
+      </w:tblPr>
+      <w:tcPr>
+        <w:shd w:val="clear" w:color="ffffff"/>
+        <w:tcBorders>
+          <w:top w:val="none" w:color="000000" w:sz="4" w:space="0"/>
+          <w:left w:val="none" w:color="000000" w:sz="4" w:space="0"/>
+          <w:bottom w:val="none" w:color="000000" w:sz="4" w:space="0"/>
+          <w:right w:val="none" w:color="000000" w:sz="4" w:space="0"/>
+        </w:tcBorders>
+      </w:tcPr>
+    </w:tblStylePr>
+    <w:tblStylePr w:type="lastRow">
+      <w:rPr>
+        <w:b/>
+        <w:color w:val="404040"/>
+      </w:rPr>
+      <w:pPr>
+        <w:pBdr/>
+        <w:spacing/>
+        <w:ind/>
+      </w:pPr>
+      <w:tblPr>
+        <w:tblBorders/>
+      </w:tblPr>
+      <w:tcPr>
+        <w:shd w:val="clear" w:color="ffffff"/>
+        <w:tcBorders>
+          <w:top w:val="none" w:color="000000" w:sz="4" w:space="0"/>
+          <w:left w:val="none" w:color="000000" w:sz="4" w:space="0"/>
+          <w:bottom w:val="none" w:color="000000" w:sz="4" w:space="0"/>
+          <w:right w:val="none" w:color="000000" w:sz="4" w:space="0"/>
+        </w:tcBorders>
+      </w:tcPr>
+    </w:tblStylePr>
     <w:tblStylePr w:type="nwCell">
       <w:pPr>
         <w:pBdr/>
@@ -6816,9 +6809,9 @@
       </w:tcPr>
     </w:tblStylePr>
   </w:style>
-  <w:style w:type="table" w:styleId="33">
+  <w:style w:type="table" w:styleId="729">
     <w:name w:val="Grid Table 3 - Accent 1"/>
-    <w:basedOn w:val="665"/>
+    <w:basedOn w:val="893"/>
     <w:uiPriority w:val="99"/>
     <w:pPr>
       <w:pBdr/>
@@ -6917,29 +6910,6 @@
         <w:tblBorders/>
       </w:tblPr>
       <w:tcPr>
-        <w:shd w:color="ffffff"/>
-        <w:tcBorders>
-          <w:top w:val="none" w:color="000000" w:sz="4" w:space="0"/>
-          <w:left w:val="none" w:color="000000" w:sz="4" w:space="0"/>
-          <w:bottom w:val="none" w:color="000000" w:sz="4" w:space="0"/>
-          <w:right w:val="none" w:color="000000" w:sz="4" w:space="0"/>
-        </w:tcBorders>
-      </w:tcPr>
-    </w:tblStylePr>
-    <w:tblStylePr w:type="firstRow">
-      <w:rPr>
-        <w:b/>
-        <w:color w:val="404040"/>
-      </w:rPr>
-      <w:pPr>
-        <w:pBdr/>
-        <w:spacing/>
-        <w:ind/>
-      </w:pPr>
-      <w:tblPr>
-        <w:tblBorders/>
-      </w:tblPr>
-      <w:tcPr>
         <w:shd w:val="clear" w:color="ffffff"/>
         <w:tcBorders>
           <w:top w:val="none" w:color="000000" w:sz="4" w:space="0"/>
@@ -6949,30 +6919,7 @@
         </w:tcBorders>
       </w:tcPr>
     </w:tblStylePr>
-    <w:tblStylePr w:type="lastCol">
-      <w:rPr>
-        <w:i/>
-        <w:color w:val="404040"/>
-      </w:rPr>
-      <w:pPr>
-        <w:pBdr/>
-        <w:spacing/>
-        <w:ind/>
-      </w:pPr>
-      <w:tblPr>
-        <w:tblBorders/>
-      </w:tblPr>
-      <w:tcPr>
-        <w:shd w:color="ffffff"/>
-        <w:tcBorders>
-          <w:top w:val="none" w:color="000000" w:sz="4" w:space="0"/>
-          <w:left w:val="none" w:color="000000" w:sz="4" w:space="0"/>
-          <w:bottom w:val="none" w:color="000000" w:sz="4" w:space="0"/>
-          <w:right w:val="none" w:color="000000" w:sz="4" w:space="0"/>
-        </w:tcBorders>
-      </w:tcPr>
-    </w:tblStylePr>
-    <w:tblStylePr w:type="lastRow">
+    <w:tblStylePr w:type="firstRow">
       <w:rPr>
         <w:b/>
         <w:color w:val="404040"/>
@@ -6995,6 +6942,52 @@
         </w:tcBorders>
       </w:tcPr>
     </w:tblStylePr>
+    <w:tblStylePr w:type="lastCol">
+      <w:rPr>
+        <w:i/>
+        <w:color w:val="404040"/>
+      </w:rPr>
+      <w:pPr>
+        <w:pBdr/>
+        <w:spacing/>
+        <w:ind/>
+      </w:pPr>
+      <w:tblPr>
+        <w:tblBorders/>
+      </w:tblPr>
+      <w:tcPr>
+        <w:shd w:val="clear" w:color="ffffff"/>
+        <w:tcBorders>
+          <w:top w:val="none" w:color="000000" w:sz="4" w:space="0"/>
+          <w:left w:val="none" w:color="000000" w:sz="4" w:space="0"/>
+          <w:bottom w:val="none" w:color="000000" w:sz="4" w:space="0"/>
+          <w:right w:val="none" w:color="000000" w:sz="4" w:space="0"/>
+        </w:tcBorders>
+      </w:tcPr>
+    </w:tblStylePr>
+    <w:tblStylePr w:type="lastRow">
+      <w:rPr>
+        <w:b/>
+        <w:color w:val="404040"/>
+      </w:rPr>
+      <w:pPr>
+        <w:pBdr/>
+        <w:spacing/>
+        <w:ind/>
+      </w:pPr>
+      <w:tblPr>
+        <w:tblBorders/>
+      </w:tblPr>
+      <w:tcPr>
+        <w:shd w:val="clear" w:color="ffffff"/>
+        <w:tcBorders>
+          <w:top w:val="none" w:color="000000" w:sz="4" w:space="0"/>
+          <w:left w:val="none" w:color="000000" w:sz="4" w:space="0"/>
+          <w:bottom w:val="none" w:color="000000" w:sz="4" w:space="0"/>
+          <w:right w:val="none" w:color="000000" w:sz="4" w:space="0"/>
+        </w:tcBorders>
+      </w:tcPr>
+    </w:tblStylePr>
     <w:tblStylePr w:type="nwCell">
       <w:pPr>
         <w:pBdr/>
@@ -7061,9 +7054,9 @@
       </w:tcPr>
     </w:tblStylePr>
   </w:style>
-  <w:style w:type="table" w:styleId="34">
+  <w:style w:type="table" w:styleId="730">
     <w:name w:val="Grid Table 3 - Accent 2"/>
-    <w:basedOn w:val="665"/>
+    <w:basedOn w:val="893"/>
     <w:uiPriority w:val="99"/>
     <w:pPr>
       <w:pBdr/>
@@ -7162,29 +7155,6 @@
         <w:tblBorders/>
       </w:tblPr>
       <w:tcPr>
-        <w:shd w:color="ffffff"/>
-        <w:tcBorders>
-          <w:top w:val="none" w:color="000000" w:sz="4" w:space="0"/>
-          <w:left w:val="none" w:color="000000" w:sz="4" w:space="0"/>
-          <w:bottom w:val="none" w:color="000000" w:sz="4" w:space="0"/>
-          <w:right w:val="none" w:color="000000" w:sz="4" w:space="0"/>
-        </w:tcBorders>
-      </w:tcPr>
-    </w:tblStylePr>
-    <w:tblStylePr w:type="firstRow">
-      <w:rPr>
-        <w:b/>
-        <w:color w:val="404040"/>
-      </w:rPr>
-      <w:pPr>
-        <w:pBdr/>
-        <w:spacing/>
-        <w:ind/>
-      </w:pPr>
-      <w:tblPr>
-        <w:tblBorders/>
-      </w:tblPr>
-      <w:tcPr>
         <w:shd w:val="clear" w:color="ffffff"/>
         <w:tcBorders>
           <w:top w:val="none" w:color="000000" w:sz="4" w:space="0"/>
@@ -7194,30 +7164,7 @@
         </w:tcBorders>
       </w:tcPr>
     </w:tblStylePr>
-    <w:tblStylePr w:type="lastCol">
-      <w:rPr>
-        <w:i/>
-        <w:color w:val="404040"/>
-      </w:rPr>
-      <w:pPr>
-        <w:pBdr/>
-        <w:spacing/>
-        <w:ind/>
-      </w:pPr>
-      <w:tblPr>
-        <w:tblBorders/>
-      </w:tblPr>
-      <w:tcPr>
-        <w:shd w:color="ffffff"/>
-        <w:tcBorders>
-          <w:top w:val="none" w:color="000000" w:sz="4" w:space="0"/>
-          <w:left w:val="none" w:color="000000" w:sz="4" w:space="0"/>
-          <w:bottom w:val="none" w:color="000000" w:sz="4" w:space="0"/>
-          <w:right w:val="none" w:color="000000" w:sz="4" w:space="0"/>
-        </w:tcBorders>
-      </w:tcPr>
-    </w:tblStylePr>
-    <w:tblStylePr w:type="lastRow">
+    <w:tblStylePr w:type="firstRow">
       <w:rPr>
         <w:b/>
         <w:color w:val="404040"/>
@@ -7240,6 +7187,52 @@
         </w:tcBorders>
       </w:tcPr>
     </w:tblStylePr>
+    <w:tblStylePr w:type="lastCol">
+      <w:rPr>
+        <w:i/>
+        <w:color w:val="404040"/>
+      </w:rPr>
+      <w:pPr>
+        <w:pBdr/>
+        <w:spacing/>
+        <w:ind/>
+      </w:pPr>
+      <w:tblPr>
+        <w:tblBorders/>
+      </w:tblPr>
+      <w:tcPr>
+        <w:shd w:val="clear" w:color="ffffff"/>
+        <w:tcBorders>
+          <w:top w:val="none" w:color="000000" w:sz="4" w:space="0"/>
+          <w:left w:val="none" w:color="000000" w:sz="4" w:space="0"/>
+          <w:bottom w:val="none" w:color="000000" w:sz="4" w:space="0"/>
+          <w:right w:val="none" w:color="000000" w:sz="4" w:space="0"/>
+        </w:tcBorders>
+      </w:tcPr>
+    </w:tblStylePr>
+    <w:tblStylePr w:type="lastRow">
+      <w:rPr>
+        <w:b/>
+        <w:color w:val="404040"/>
+      </w:rPr>
+      <w:pPr>
+        <w:pBdr/>
+        <w:spacing/>
+        <w:ind/>
+      </w:pPr>
+      <w:tblPr>
+        <w:tblBorders/>
+      </w:tblPr>
+      <w:tcPr>
+        <w:shd w:val="clear" w:color="ffffff"/>
+        <w:tcBorders>
+          <w:top w:val="none" w:color="000000" w:sz="4" w:space="0"/>
+          <w:left w:val="none" w:color="000000" w:sz="4" w:space="0"/>
+          <w:bottom w:val="none" w:color="000000" w:sz="4" w:space="0"/>
+          <w:right w:val="none" w:color="000000" w:sz="4" w:space="0"/>
+        </w:tcBorders>
+      </w:tcPr>
+    </w:tblStylePr>
     <w:tblStylePr w:type="nwCell">
       <w:pPr>
         <w:pBdr/>
@@ -7306,9 +7299,9 @@
       </w:tcPr>
     </w:tblStylePr>
   </w:style>
-  <w:style w:type="table" w:styleId="35">
+  <w:style w:type="table" w:styleId="731">
     <w:name w:val="Grid Table 3 - Accent 3"/>
-    <w:basedOn w:val="665"/>
+    <w:basedOn w:val="893"/>
     <w:uiPriority w:val="99"/>
     <w:pPr>
       <w:pBdr/>
@@ -7407,29 +7400,6 @@
         <w:tblBorders/>
       </w:tblPr>
       <w:tcPr>
-        <w:shd w:color="ffffff"/>
-        <w:tcBorders>
-          <w:top w:val="none" w:color="000000" w:sz="4" w:space="0"/>
-          <w:left w:val="none" w:color="000000" w:sz="4" w:space="0"/>
-          <w:bottom w:val="none" w:color="000000" w:sz="4" w:space="0"/>
-          <w:right w:val="none" w:color="000000" w:sz="4" w:space="0"/>
-        </w:tcBorders>
-      </w:tcPr>
-    </w:tblStylePr>
-    <w:tblStylePr w:type="firstRow">
-      <w:rPr>
-        <w:b/>
-        <w:color w:val="404040"/>
-      </w:rPr>
-      <w:pPr>
-        <w:pBdr/>
-        <w:spacing/>
-        <w:ind/>
-      </w:pPr>
-      <w:tblPr>
-        <w:tblBorders/>
-      </w:tblPr>
-      <w:tcPr>
         <w:shd w:val="clear" w:color="ffffff"/>
         <w:tcBorders>
           <w:top w:val="none" w:color="000000" w:sz="4" w:space="0"/>
@@ -7439,30 +7409,7 @@
         </w:tcBorders>
       </w:tcPr>
     </w:tblStylePr>
-    <w:tblStylePr w:type="lastCol">
-      <w:rPr>
-        <w:i/>
-        <w:color w:val="404040"/>
-      </w:rPr>
-      <w:pPr>
-        <w:pBdr/>
-        <w:spacing/>
-        <w:ind/>
-      </w:pPr>
-      <w:tblPr>
-        <w:tblBorders/>
-      </w:tblPr>
-      <w:tcPr>
-        <w:shd w:color="ffffff"/>
-        <w:tcBorders>
-          <w:top w:val="none" w:color="000000" w:sz="4" w:space="0"/>
-          <w:left w:val="none" w:color="000000" w:sz="4" w:space="0"/>
-          <w:bottom w:val="none" w:color="000000" w:sz="4" w:space="0"/>
-          <w:right w:val="none" w:color="000000" w:sz="4" w:space="0"/>
-        </w:tcBorders>
-      </w:tcPr>
-    </w:tblStylePr>
-    <w:tblStylePr w:type="lastRow">
+    <w:tblStylePr w:type="firstRow">
       <w:rPr>
         <w:b/>
         <w:color w:val="404040"/>
@@ -7485,6 +7432,52 @@
         </w:tcBorders>
       </w:tcPr>
     </w:tblStylePr>
+    <w:tblStylePr w:type="lastCol">
+      <w:rPr>
+        <w:i/>
+        <w:color w:val="404040"/>
+      </w:rPr>
+      <w:pPr>
+        <w:pBdr/>
+        <w:spacing/>
+        <w:ind/>
+      </w:pPr>
+      <w:tblPr>
+        <w:tblBorders/>
+      </w:tblPr>
+      <w:tcPr>
+        <w:shd w:val="clear" w:color="ffffff"/>
+        <w:tcBorders>
+          <w:top w:val="none" w:color="000000" w:sz="4" w:space="0"/>
+          <w:left w:val="none" w:color="000000" w:sz="4" w:space="0"/>
+          <w:bottom w:val="none" w:color="000000" w:sz="4" w:space="0"/>
+          <w:right w:val="none" w:color="000000" w:sz="4" w:space="0"/>
+        </w:tcBorders>
+      </w:tcPr>
+    </w:tblStylePr>
+    <w:tblStylePr w:type="lastRow">
+      <w:rPr>
+        <w:b/>
+        <w:color w:val="404040"/>
+      </w:rPr>
+      <w:pPr>
+        <w:pBdr/>
+        <w:spacing/>
+        <w:ind/>
+      </w:pPr>
+      <w:tblPr>
+        <w:tblBorders/>
+      </w:tblPr>
+      <w:tcPr>
+        <w:shd w:val="clear" w:color="ffffff"/>
+        <w:tcBorders>
+          <w:top w:val="none" w:color="000000" w:sz="4" w:space="0"/>
+          <w:left w:val="none" w:color="000000" w:sz="4" w:space="0"/>
+          <w:bottom w:val="none" w:color="000000" w:sz="4" w:space="0"/>
+          <w:right w:val="none" w:color="000000" w:sz="4" w:space="0"/>
+        </w:tcBorders>
+      </w:tcPr>
+    </w:tblStylePr>
     <w:tblStylePr w:type="nwCell">
       <w:pPr>
         <w:pBdr/>
@@ -7551,9 +7544,9 @@
       </w:tcPr>
     </w:tblStylePr>
   </w:style>
-  <w:style w:type="table" w:styleId="36">
+  <w:style w:type="table" w:styleId="732">
     <w:name w:val="Grid Table 3 - Accent 4"/>
-    <w:basedOn w:val="665"/>
+    <w:basedOn w:val="893"/>
     <w:uiPriority w:val="99"/>
     <w:pPr>
       <w:pBdr/>
@@ -7652,29 +7645,6 @@
         <w:tblBorders/>
       </w:tblPr>
       <w:tcPr>
-        <w:shd w:color="ffffff"/>
-        <w:tcBorders>
-          <w:top w:val="none" w:color="000000" w:sz="4" w:space="0"/>
-          <w:left w:val="none" w:color="000000" w:sz="4" w:space="0"/>
-          <w:bottom w:val="none" w:color="000000" w:sz="4" w:space="0"/>
-          <w:right w:val="none" w:color="000000" w:sz="4" w:space="0"/>
-        </w:tcBorders>
-      </w:tcPr>
-    </w:tblStylePr>
-    <w:tblStylePr w:type="firstRow">
-      <w:rPr>
-        <w:b/>
-        <w:color w:val="404040"/>
-      </w:rPr>
-      <w:pPr>
-        <w:pBdr/>
-        <w:spacing/>
-        <w:ind/>
-      </w:pPr>
-      <w:tblPr>
-        <w:tblBorders/>
-      </w:tblPr>
-      <w:tcPr>
         <w:shd w:val="clear" w:color="ffffff"/>
         <w:tcBorders>
           <w:top w:val="none" w:color="000000" w:sz="4" w:space="0"/>
@@ -7684,30 +7654,7 @@
         </w:tcBorders>
       </w:tcPr>
     </w:tblStylePr>
-    <w:tblStylePr w:type="lastCol">
-      <w:rPr>
-        <w:i/>
-        <w:color w:val="404040"/>
-      </w:rPr>
-      <w:pPr>
-        <w:pBdr/>
-        <w:spacing/>
-        <w:ind/>
-      </w:pPr>
-      <w:tblPr>
-        <w:tblBorders/>
-      </w:tblPr>
-      <w:tcPr>
-        <w:shd w:color="ffffff"/>
-        <w:tcBorders>
-          <w:top w:val="none" w:color="000000" w:sz="4" w:space="0"/>
-          <w:left w:val="none" w:color="000000" w:sz="4" w:space="0"/>
-          <w:bottom w:val="none" w:color="000000" w:sz="4" w:space="0"/>
-          <w:right w:val="none" w:color="000000" w:sz="4" w:space="0"/>
-        </w:tcBorders>
-      </w:tcPr>
-    </w:tblStylePr>
-    <w:tblStylePr w:type="lastRow">
+    <w:tblStylePr w:type="firstRow">
       <w:rPr>
         <w:b/>
         <w:color w:val="404040"/>
@@ -7730,6 +7677,52 @@
         </w:tcBorders>
       </w:tcPr>
     </w:tblStylePr>
+    <w:tblStylePr w:type="lastCol">
+      <w:rPr>
+        <w:i/>
+        <w:color w:val="404040"/>
+      </w:rPr>
+      <w:pPr>
+        <w:pBdr/>
+        <w:spacing/>
+        <w:ind/>
+      </w:pPr>
+      <w:tblPr>
+        <w:tblBorders/>
+      </w:tblPr>
+      <w:tcPr>
+        <w:shd w:val="clear" w:color="ffffff"/>
+        <w:tcBorders>
+          <w:top w:val="none" w:color="000000" w:sz="4" w:space="0"/>
+          <w:left w:val="none" w:color="000000" w:sz="4" w:space="0"/>
+          <w:bottom w:val="none" w:color="000000" w:sz="4" w:space="0"/>
+          <w:right w:val="none" w:color="000000" w:sz="4" w:space="0"/>
+        </w:tcBorders>
+      </w:tcPr>
+    </w:tblStylePr>
+    <w:tblStylePr w:type="lastRow">
+      <w:rPr>
+        <w:b/>
+        <w:color w:val="404040"/>
+      </w:rPr>
+      <w:pPr>
+        <w:pBdr/>
+        <w:spacing/>
+        <w:ind/>
+      </w:pPr>
+      <w:tblPr>
+        <w:tblBorders/>
+      </w:tblPr>
+      <w:tcPr>
+        <w:shd w:val="clear" w:color="ffffff"/>
+        <w:tcBorders>
+          <w:top w:val="none" w:color="000000" w:sz="4" w:space="0"/>
+          <w:left w:val="none" w:color="000000" w:sz="4" w:space="0"/>
+          <w:bottom w:val="none" w:color="000000" w:sz="4" w:space="0"/>
+          <w:right w:val="none" w:color="000000" w:sz="4" w:space="0"/>
+        </w:tcBorders>
+      </w:tcPr>
+    </w:tblStylePr>
     <w:tblStylePr w:type="nwCell">
       <w:pPr>
         <w:pBdr/>
@@ -7796,9 +7789,9 @@
       </w:tcPr>
     </w:tblStylePr>
   </w:style>
-  <w:style w:type="table" w:styleId="37">
+  <w:style w:type="table" w:styleId="733">
     <w:name w:val="Grid Table 3 - Accent 5"/>
-    <w:basedOn w:val="665"/>
+    <w:basedOn w:val="893"/>
     <w:uiPriority w:val="99"/>
     <w:pPr>
       <w:pBdr/>
@@ -7897,29 +7890,6 @@
         <w:tblBorders/>
       </w:tblPr>
       <w:tcPr>
-        <w:shd w:color="ffffff"/>
-        <w:tcBorders>
-          <w:top w:val="none" w:color="000000" w:sz="4" w:space="0"/>
-          <w:left w:val="none" w:color="000000" w:sz="4" w:space="0"/>
-          <w:bottom w:val="none" w:color="000000" w:sz="4" w:space="0"/>
-          <w:right w:val="none" w:color="000000" w:sz="4" w:space="0"/>
-        </w:tcBorders>
-      </w:tcPr>
-    </w:tblStylePr>
-    <w:tblStylePr w:type="firstRow">
-      <w:rPr>
-        <w:b/>
-        <w:color w:val="404040"/>
-      </w:rPr>
-      <w:pPr>
-        <w:pBdr/>
-        <w:spacing/>
-        <w:ind/>
-      </w:pPr>
-      <w:tblPr>
-        <w:tblBorders/>
-      </w:tblPr>
-      <w:tcPr>
         <w:shd w:val="clear" w:color="ffffff"/>
         <w:tcBorders>
           <w:top w:val="none" w:color="000000" w:sz="4" w:space="0"/>
@@ -7929,30 +7899,7 @@
         </w:tcBorders>
       </w:tcPr>
     </w:tblStylePr>
-    <w:tblStylePr w:type="lastCol">
-      <w:rPr>
-        <w:i/>
-        <w:color w:val="404040"/>
-      </w:rPr>
-      <w:pPr>
-        <w:pBdr/>
-        <w:spacing/>
-        <w:ind/>
-      </w:pPr>
-      <w:tblPr>
-        <w:tblBorders/>
-      </w:tblPr>
-      <w:tcPr>
-        <w:shd w:color="ffffff"/>
-        <w:tcBorders>
-          <w:top w:val="none" w:color="000000" w:sz="4" w:space="0"/>
-          <w:left w:val="none" w:color="000000" w:sz="4" w:space="0"/>
-          <w:bottom w:val="none" w:color="000000" w:sz="4" w:space="0"/>
-          <w:right w:val="none" w:color="000000" w:sz="4" w:space="0"/>
-        </w:tcBorders>
-      </w:tcPr>
-    </w:tblStylePr>
-    <w:tblStylePr w:type="lastRow">
+    <w:tblStylePr w:type="firstRow">
       <w:rPr>
         <w:b/>
         <w:color w:val="404040"/>
@@ -7975,6 +7922,52 @@
         </w:tcBorders>
       </w:tcPr>
     </w:tblStylePr>
+    <w:tblStylePr w:type="lastCol">
+      <w:rPr>
+        <w:i/>
+        <w:color w:val="404040"/>
+      </w:rPr>
+      <w:pPr>
+        <w:pBdr/>
+        <w:spacing/>
+        <w:ind/>
+      </w:pPr>
+      <w:tblPr>
+        <w:tblBorders/>
+      </w:tblPr>
+      <w:tcPr>
+        <w:shd w:val="clear" w:color="ffffff"/>
+        <w:tcBorders>
+          <w:top w:val="none" w:color="000000" w:sz="4" w:space="0"/>
+          <w:left w:val="none" w:color="000000" w:sz="4" w:space="0"/>
+          <w:bottom w:val="none" w:color="000000" w:sz="4" w:space="0"/>
+          <w:right w:val="none" w:color="000000" w:sz="4" w:space="0"/>
+        </w:tcBorders>
+      </w:tcPr>
+    </w:tblStylePr>
+    <w:tblStylePr w:type="lastRow">
+      <w:rPr>
+        <w:b/>
+        <w:color w:val="404040"/>
+      </w:rPr>
+      <w:pPr>
+        <w:pBdr/>
+        <w:spacing/>
+        <w:ind/>
+      </w:pPr>
+      <w:tblPr>
+        <w:tblBorders/>
+      </w:tblPr>
+      <w:tcPr>
+        <w:shd w:val="clear" w:color="ffffff"/>
+        <w:tcBorders>
+          <w:top w:val="none" w:color="000000" w:sz="4" w:space="0"/>
+          <w:left w:val="none" w:color="000000" w:sz="4" w:space="0"/>
+          <w:bottom w:val="none" w:color="000000" w:sz="4" w:space="0"/>
+          <w:right w:val="none" w:color="000000" w:sz="4" w:space="0"/>
+        </w:tcBorders>
+      </w:tcPr>
+    </w:tblStylePr>
     <w:tblStylePr w:type="nwCell">
       <w:pPr>
         <w:pBdr/>
@@ -8041,9 +8034,9 @@
       </w:tcPr>
     </w:tblStylePr>
   </w:style>
-  <w:style w:type="table" w:styleId="38">
+  <w:style w:type="table" w:styleId="734">
     <w:name w:val="Grid Table 3 - Accent 6"/>
-    <w:basedOn w:val="665"/>
+    <w:basedOn w:val="893"/>
     <w:uiPriority w:val="99"/>
     <w:pPr>
       <w:pBdr/>
@@ -8142,29 +8135,6 @@
         <w:tblBorders/>
       </w:tblPr>
       <w:tcPr>
-        <w:shd w:color="ffffff"/>
-        <w:tcBorders>
-          <w:top w:val="none" w:color="000000" w:sz="4" w:space="0"/>
-          <w:left w:val="none" w:color="000000" w:sz="4" w:space="0"/>
-          <w:bottom w:val="none" w:color="000000" w:sz="4" w:space="0"/>
-          <w:right w:val="none" w:color="000000" w:sz="4" w:space="0"/>
-        </w:tcBorders>
-      </w:tcPr>
-    </w:tblStylePr>
-    <w:tblStylePr w:type="firstRow">
-      <w:rPr>
-        <w:b/>
-        <w:color w:val="404040"/>
-      </w:rPr>
-      <w:pPr>
-        <w:pBdr/>
-        <w:spacing/>
-        <w:ind/>
-      </w:pPr>
-      <w:tblPr>
-        <w:tblBorders/>
-      </w:tblPr>
-      <w:tcPr>
         <w:shd w:val="clear" w:color="ffffff"/>
         <w:tcBorders>
           <w:top w:val="none" w:color="000000" w:sz="4" w:space="0"/>
@@ -8174,30 +8144,7 @@
         </w:tcBorders>
       </w:tcPr>
     </w:tblStylePr>
-    <w:tblStylePr w:type="lastCol">
-      <w:rPr>
-        <w:i/>
-        <w:color w:val="404040"/>
-      </w:rPr>
-      <w:pPr>
-        <w:pBdr/>
-        <w:spacing/>
-        <w:ind/>
-      </w:pPr>
-      <w:tblPr>
-        <w:tblBorders/>
-      </w:tblPr>
-      <w:tcPr>
-        <w:shd w:color="ffffff"/>
-        <w:tcBorders>
-          <w:top w:val="none" w:color="000000" w:sz="4" w:space="0"/>
-          <w:left w:val="none" w:color="000000" w:sz="4" w:space="0"/>
-          <w:bottom w:val="none" w:color="000000" w:sz="4" w:space="0"/>
-          <w:right w:val="none" w:color="000000" w:sz="4" w:space="0"/>
-        </w:tcBorders>
-      </w:tcPr>
-    </w:tblStylePr>
-    <w:tblStylePr w:type="lastRow">
+    <w:tblStylePr w:type="firstRow">
       <w:rPr>
         <w:b/>
         <w:color w:val="404040"/>
@@ -8220,6 +8167,52 @@
         </w:tcBorders>
       </w:tcPr>
     </w:tblStylePr>
+    <w:tblStylePr w:type="lastCol">
+      <w:rPr>
+        <w:i/>
+        <w:color w:val="404040"/>
+      </w:rPr>
+      <w:pPr>
+        <w:pBdr/>
+        <w:spacing/>
+        <w:ind/>
+      </w:pPr>
+      <w:tblPr>
+        <w:tblBorders/>
+      </w:tblPr>
+      <w:tcPr>
+        <w:shd w:val="clear" w:color="ffffff"/>
+        <w:tcBorders>
+          <w:top w:val="none" w:color="000000" w:sz="4" w:space="0"/>
+          <w:left w:val="none" w:color="000000" w:sz="4" w:space="0"/>
+          <w:bottom w:val="none" w:color="000000" w:sz="4" w:space="0"/>
+          <w:right w:val="none" w:color="000000" w:sz="4" w:space="0"/>
+        </w:tcBorders>
+      </w:tcPr>
+    </w:tblStylePr>
+    <w:tblStylePr w:type="lastRow">
+      <w:rPr>
+        <w:b/>
+        <w:color w:val="404040"/>
+      </w:rPr>
+      <w:pPr>
+        <w:pBdr/>
+        <w:spacing/>
+        <w:ind/>
+      </w:pPr>
+      <w:tblPr>
+        <w:tblBorders/>
+      </w:tblPr>
+      <w:tcPr>
+        <w:shd w:val="clear" w:color="ffffff"/>
+        <w:tcBorders>
+          <w:top w:val="none" w:color="000000" w:sz="4" w:space="0"/>
+          <w:left w:val="none" w:color="000000" w:sz="4" w:space="0"/>
+          <w:bottom w:val="none" w:color="000000" w:sz="4" w:space="0"/>
+          <w:right w:val="none" w:color="000000" w:sz="4" w:space="0"/>
+        </w:tcBorders>
+      </w:tcPr>
+    </w:tblStylePr>
     <w:tblStylePr w:type="nwCell">
       <w:pPr>
         <w:pBdr/>
@@ -8286,9 +8279,9 @@
       </w:tcPr>
     </w:tblStylePr>
   </w:style>
-  <w:style w:type="table" w:styleId="39">
+  <w:style w:type="table" w:styleId="735">
     <w:name w:val="Grid Table 4"/>
-    <w:basedOn w:val="665"/>
+    <w:basedOn w:val="893"/>
     <w:uiPriority w:val="59"/>
     <w:pPr>
       <w:pBdr/>
@@ -8519,9 +8512,9 @@
       </w:tcPr>
     </w:tblStylePr>
   </w:style>
-  <w:style w:type="table" w:styleId="40">
+  <w:style w:type="table" w:styleId="736">
     <w:name w:val="Grid Table 4 - Accent 1"/>
-    <w:basedOn w:val="665"/>
+    <w:basedOn w:val="893"/>
     <w:uiPriority w:val="59"/>
     <w:pPr>
       <w:pBdr/>
@@ -8752,9 +8745,9 @@
       </w:tcPr>
     </w:tblStylePr>
   </w:style>
-  <w:style w:type="table" w:styleId="41">
+  <w:style w:type="table" w:styleId="737">
     <w:name w:val="Grid Table 4 - Accent 2"/>
-    <w:basedOn w:val="665"/>
+    <w:basedOn w:val="893"/>
     <w:uiPriority w:val="59"/>
     <w:pPr>
       <w:pBdr/>
@@ -8985,9 +8978,9 @@
       </w:tcPr>
     </w:tblStylePr>
   </w:style>
-  <w:style w:type="table" w:styleId="42">
+  <w:style w:type="table" w:styleId="738">
     <w:name w:val="Grid Table 4 - Accent 3"/>
-    <w:basedOn w:val="665"/>
+    <w:basedOn w:val="893"/>
     <w:uiPriority w:val="59"/>
     <w:pPr>
       <w:pBdr/>
@@ -9218,9 +9211,9 @@
       </w:tcPr>
     </w:tblStylePr>
   </w:style>
-  <w:style w:type="table" w:styleId="43">
+  <w:style w:type="table" w:styleId="739">
     <w:name w:val="Grid Table 4 - Accent 4"/>
-    <w:basedOn w:val="665"/>
+    <w:basedOn w:val="893"/>
     <w:uiPriority w:val="59"/>
     <w:pPr>
       <w:pBdr/>
@@ -9451,9 +9444,9 @@
       </w:tcPr>
     </w:tblStylePr>
   </w:style>
-  <w:style w:type="table" w:styleId="44">
+  <w:style w:type="table" w:styleId="740">
     <w:name w:val="Grid Table 4 - Accent 5"/>
-    <w:basedOn w:val="665"/>
+    <w:basedOn w:val="893"/>
     <w:uiPriority w:val="59"/>
     <w:pPr>
       <w:pBdr/>
@@ -9684,9 +9677,9 @@
       </w:tcPr>
     </w:tblStylePr>
   </w:style>
-  <w:style w:type="table" w:styleId="45">
+  <w:style w:type="table" w:styleId="741">
     <w:name w:val="Grid Table 4 - Accent 6"/>
-    <w:basedOn w:val="665"/>
+    <w:basedOn w:val="893"/>
     <w:uiPriority w:val="59"/>
     <w:pPr>
       <w:pBdr/>
@@ -9917,9 +9910,9 @@
       </w:tcPr>
     </w:tblStylePr>
   </w:style>
-  <w:style w:type="table" w:styleId="46">
+  <w:style w:type="table" w:styleId="742">
     <w:name w:val="Grid Table 5 Dark"/>
-    <w:basedOn w:val="665"/>
+    <w:basedOn w:val="893"/>
     <w:uiPriority w:val="99"/>
     <w:pPr>
       <w:pBdr/>
@@ -10145,9 +10138,9 @@
       </w:tcPr>
     </w:tblStylePr>
   </w:style>
-  <w:style w:type="table" w:styleId="47">
+  <w:style w:type="table" w:styleId="743">
     <w:name w:val="Grid Table 5 Dark- Accent 1"/>
-    <w:basedOn w:val="665"/>
+    <w:basedOn w:val="893"/>
     <w:uiPriority w:val="99"/>
     <w:pPr>
       <w:pBdr/>
@@ -10373,9 +10366,9 @@
       </w:tcPr>
     </w:tblStylePr>
   </w:style>
-  <w:style w:type="table" w:styleId="48">
+  <w:style w:type="table" w:styleId="744">
     <w:name w:val="Grid Table 5 Dark - Accent 2"/>
-    <w:basedOn w:val="665"/>
+    <w:basedOn w:val="893"/>
     <w:uiPriority w:val="99"/>
     <w:pPr>
       <w:pBdr/>
@@ -10601,9 +10594,9 @@
       </w:tcPr>
     </w:tblStylePr>
   </w:style>
-  <w:style w:type="table" w:styleId="49">
+  <w:style w:type="table" w:styleId="745">
     <w:name w:val="Grid Table 5 Dark - Accent 3"/>
-    <w:basedOn w:val="665"/>
+    <w:basedOn w:val="893"/>
     <w:uiPriority w:val="99"/>
     <w:pPr>
       <w:pBdr/>
@@ -10829,9 +10822,9 @@
       </w:tcPr>
     </w:tblStylePr>
   </w:style>
-  <w:style w:type="table" w:styleId="50">
+  <w:style w:type="table" w:styleId="746">
     <w:name w:val="Grid Table 5 Dark- Accent 4"/>
-    <w:basedOn w:val="665"/>
+    <w:basedOn w:val="893"/>
     <w:uiPriority w:val="99"/>
     <w:pPr>
       <w:pBdr/>
@@ -11057,9 +11050,9 @@
       </w:tcPr>
     </w:tblStylePr>
   </w:style>
-  <w:style w:type="table" w:styleId="51">
+  <w:style w:type="table" w:styleId="747">
     <w:name w:val="Grid Table 5 Dark - Accent 5"/>
-    <w:basedOn w:val="665"/>
+    <w:basedOn w:val="893"/>
     <w:uiPriority w:val="99"/>
     <w:pPr>
       <w:pBdr/>
@@ -11285,9 +11278,9 @@
       </w:tcPr>
     </w:tblStylePr>
   </w:style>
-  <w:style w:type="table" w:styleId="52">
+  <w:style w:type="table" w:styleId="748">
     <w:name w:val="Grid Table 5 Dark - Accent 6"/>
-    <w:basedOn w:val="665"/>
+    <w:basedOn w:val="893"/>
     <w:uiPriority w:val="99"/>
     <w:pPr>
       <w:pBdr/>
@@ -11513,9 +11506,9 @@
       </w:tcPr>
     </w:tblStylePr>
   </w:style>
-  <w:style w:type="table" w:styleId="53">
+  <w:style w:type="table" w:styleId="749">
     <w:name w:val="Grid Table 6 Colorful"/>
-    <w:basedOn w:val="665"/>
+    <w:basedOn w:val="893"/>
     <w:uiPriority w:val="99"/>
     <w:pPr>
       <w:pBdr/>
@@ -11743,9 +11736,9 @@
       </w:tcPr>
     </w:tblStylePr>
   </w:style>
-  <w:style w:type="table" w:styleId="54">
+  <w:style w:type="table" w:styleId="750">
     <w:name w:val="Grid Table 6 Colorful - Accent 1"/>
-    <w:basedOn w:val="665"/>
+    <w:basedOn w:val="893"/>
     <w:uiPriority w:val="99"/>
     <w:pPr>
       <w:pBdr/>
@@ -11973,9 +11966,9 @@
       </w:tcPr>
     </w:tblStylePr>
   </w:style>
-  <w:style w:type="table" w:styleId="55">
+  <w:style w:type="table" w:styleId="751">
     <w:name w:val="Grid Table 6 Colorful - Accent 2"/>
-    <w:basedOn w:val="665"/>
+    <w:basedOn w:val="893"/>
     <w:uiPriority w:val="99"/>
     <w:pPr>
       <w:pBdr/>
@@ -12203,9 +12196,9 @@
       </w:tcPr>
     </w:tblStylePr>
   </w:style>
-  <w:style w:type="table" w:styleId="56">
+  <w:style w:type="table" w:styleId="752">
     <w:name w:val="Grid Table 6 Colorful - Accent 3"/>
-    <w:basedOn w:val="665"/>
+    <w:basedOn w:val="893"/>
     <w:uiPriority w:val="99"/>
     <w:pPr>
       <w:pBdr/>
@@ -12433,9 +12426,9 @@
       </w:tcPr>
     </w:tblStylePr>
   </w:style>
-  <w:style w:type="table" w:styleId="57">
+  <w:style w:type="table" w:styleId="753">
     <w:name w:val="Grid Table 6 Colorful - Accent 4"/>
-    <w:basedOn w:val="665"/>
+    <w:basedOn w:val="893"/>
     <w:uiPriority w:val="99"/>
     <w:pPr>
       <w:pBdr/>
@@ -12663,9 +12656,9 @@
       </w:tcPr>
     </w:tblStylePr>
   </w:style>
-  <w:style w:type="table" w:styleId="58">
+  <w:style w:type="table" w:styleId="754">
     <w:name w:val="Grid Table 6 Colorful - Accent 5"/>
-    <w:basedOn w:val="665"/>
+    <w:basedOn w:val="893"/>
     <w:uiPriority w:val="99"/>
     <w:pPr>
       <w:pBdr/>
@@ -12893,9 +12886,9 @@
       </w:tcPr>
     </w:tblStylePr>
   </w:style>
-  <w:style w:type="table" w:styleId="59">
+  <w:style w:type="table" w:styleId="755">
     <w:name w:val="Grid Table 6 Colorful - Accent 6"/>
-    <w:basedOn w:val="665"/>
+    <w:basedOn w:val="893"/>
     <w:uiPriority w:val="99"/>
     <w:pPr>
       <w:pBdr/>
@@ -13123,9 +13116,9 @@
       </w:tcPr>
     </w:tblStylePr>
   </w:style>
-  <w:style w:type="table" w:styleId="60">
+  <w:style w:type="table" w:styleId="756">
     <w:name w:val="Grid Table 7 Colorful"/>
-    <w:basedOn w:val="665"/>
+    <w:basedOn w:val="893"/>
     <w:uiPriority w:val="99"/>
     <w:pPr>
       <w:pBdr/>
@@ -13227,11 +13220,11 @@
         <w:tblBorders/>
       </w:tblPr>
       <w:tcPr>
-        <w:shd w:color="ffffff"/>
+        <w:shd w:val="clear" w:color="ffffff"/>
         <w:tcBorders>
-          <w:top w:val="none"/>
-          <w:left w:val="none"/>
-          <w:bottom w:val="none"/>
+          <w:top w:val="none" w:color="000000" w:sz="4" w:space="0"/>
+          <w:left w:val="none" w:color="000000" w:sz="4" w:space="0"/>
+          <w:bottom w:val="none" w:color="000000" w:sz="4" w:space="0"/>
           <w:right w:val="single" w:color="000000" w:themeColor="text1" w:themeTint="80" w:sz="4" w:space="0"/>
         </w:tcBorders>
       </w:tcPr>
@@ -13254,10 +13247,10 @@
       <w:tcPr>
         <w:shd w:val="clear" w:color="ffffff" w:themeColor="light1" w:fill="ffffff" w:themeFill="light1"/>
         <w:tcBorders>
-          <w:top w:val="none"/>
-          <w:left w:val="none"/>
+          <w:top w:val="none" w:color="000000" w:sz="4" w:space="0"/>
+          <w:left w:val="none" w:color="000000" w:sz="4" w:space="0"/>
           <w:bottom w:val="single" w:color="000000" w:themeColor="text1" w:themeTint="80" w:sz="4" w:space="0"/>
-          <w:right w:val="none"/>
+          <w:right w:val="none" w:color="000000" w:sz="4" w:space="0"/>
         </w:tcBorders>
       </w:tcPr>
     </w:tblStylePr>
@@ -13277,12 +13270,12 @@
         <w:tblBorders/>
       </w:tblPr>
       <w:tcPr>
-        <w:shd w:color="ffffff"/>
+        <w:shd w:val="clear" w:color="ffffff"/>
         <w:tcBorders>
-          <w:top w:val="none"/>
+          <w:top w:val="none" w:color="000000" w:sz="4" w:space="0"/>
           <w:left w:val="single" w:color="000000" w:themeColor="text1" w:themeTint="80" w:sz="4" w:space="0"/>
-          <w:bottom w:val="none"/>
-          <w:right w:val="none"/>
+          <w:bottom w:val="none" w:color="000000" w:sz="4" w:space="0"/>
+          <w:right w:val="none" w:color="000000" w:sz="4" w:space="0"/>
         </w:tcBorders>
       </w:tcPr>
     </w:tblStylePr>
@@ -13305,9 +13298,9 @@
         <w:shd w:val="clear" w:color="ffffff" w:themeColor="light1" w:fill="ffffff" w:themeFill="light1"/>
         <w:tcBorders>
           <w:top w:val="single" w:color="000000" w:themeColor="text1" w:themeTint="80" w:sz="4" w:space="0"/>
-          <w:left w:val="none"/>
-          <w:bottom w:val="none"/>
-          <w:right w:val="none"/>
+          <w:left w:val="none" w:color="000000" w:sz="4" w:space="0"/>
+          <w:bottom w:val="none" w:color="000000" w:sz="4" w:space="0"/>
+          <w:right w:val="none" w:color="000000" w:sz="4" w:space="0"/>
         </w:tcBorders>
       </w:tcPr>
     </w:tblStylePr>
@@ -13377,9 +13370,9 @@
       </w:tcPr>
     </w:tblStylePr>
   </w:style>
-  <w:style w:type="table" w:styleId="61">
+  <w:style w:type="table" w:styleId="757">
     <w:name w:val="Grid Table 7 Colorful - Accent 1"/>
-    <w:basedOn w:val="665"/>
+    <w:basedOn w:val="893"/>
     <w:uiPriority w:val="99"/>
     <w:pPr>
       <w:pBdr/>
@@ -13481,11 +13474,11 @@
         <w:tblBorders/>
       </w:tblPr>
       <w:tcPr>
-        <w:shd w:color="ffffff"/>
+        <w:shd w:val="clear" w:color="ffffff"/>
         <w:tcBorders>
-          <w:top w:val="none"/>
-          <w:left w:val="none"/>
-          <w:bottom w:val="none"/>
+          <w:top w:val="none" w:color="000000" w:sz="4" w:space="0"/>
+          <w:left w:val="none" w:color="000000" w:sz="4" w:space="0"/>
+          <w:bottom w:val="none" w:color="000000" w:sz="4" w:space="0"/>
           <w:right w:val="single" w:color="000000" w:themeColor="accent1" w:themeTint="80" w:sz="4" w:space="0"/>
         </w:tcBorders>
       </w:tcPr>
@@ -13508,10 +13501,10 @@
       <w:tcPr>
         <w:shd w:val="clear" w:color="ffffff" w:themeColor="light1" w:fill="ffffff" w:themeFill="light1"/>
         <w:tcBorders>
-          <w:top w:val="none"/>
-          <w:left w:val="none"/>
+          <w:top w:val="none" w:color="000000" w:sz="4" w:space="0"/>
+          <w:left w:val="none" w:color="000000" w:sz="4" w:space="0"/>
           <w:bottom w:val="single" w:color="000000" w:themeColor="accent1" w:themeTint="80" w:sz="4" w:space="0"/>
-          <w:right w:val="none"/>
+          <w:right w:val="none" w:color="000000" w:sz="4" w:space="0"/>
         </w:tcBorders>
       </w:tcPr>
     </w:tblStylePr>
@@ -13531,12 +13524,12 @@
         <w:tblBorders/>
       </w:tblPr>
       <w:tcPr>
-        <w:shd w:color="ffffff"/>
+        <w:shd w:val="clear" w:color="ffffff"/>
         <w:tcBorders>
-          <w:top w:val="none"/>
+          <w:top w:val="none" w:color="000000" w:sz="4" w:space="0"/>
           <w:left w:val="single" w:color="000000" w:themeColor="accent1" w:themeTint="80" w:sz="4" w:space="0"/>
-          <w:bottom w:val="none"/>
-          <w:right w:val="none"/>
+          <w:bottom w:val="none" w:color="000000" w:sz="4" w:space="0"/>
+          <w:right w:val="none" w:color="000000" w:sz="4" w:space="0"/>
         </w:tcBorders>
       </w:tcPr>
     </w:tblStylePr>
@@ -13559,9 +13552,9 @@
         <w:shd w:val="clear" w:color="ffffff" w:themeColor="light1" w:fill="ffffff" w:themeFill="light1"/>
         <w:tcBorders>
           <w:top w:val="single" w:color="000000" w:themeColor="accent1" w:themeTint="80" w:sz="4" w:space="0"/>
-          <w:left w:val="none"/>
-          <w:bottom w:val="none"/>
-          <w:right w:val="none"/>
+          <w:left w:val="none" w:color="000000" w:sz="4" w:space="0"/>
+          <w:bottom w:val="none" w:color="000000" w:sz="4" w:space="0"/>
+          <w:right w:val="none" w:color="000000" w:sz="4" w:space="0"/>
         </w:tcBorders>
       </w:tcPr>
     </w:tblStylePr>
@@ -13631,9 +13624,9 @@
       </w:tcPr>
     </w:tblStylePr>
   </w:style>
-  <w:style w:type="table" w:styleId="62">
+  <w:style w:type="table" w:styleId="758">
     <w:name w:val="Grid Table 7 Colorful - Accent 2"/>
-    <w:basedOn w:val="665"/>
+    <w:basedOn w:val="893"/>
     <w:uiPriority w:val="99"/>
     <w:pPr>
       <w:pBdr/>
@@ -13735,11 +13728,11 @@
         <w:tblBorders/>
       </w:tblPr>
       <w:tcPr>
-        <w:shd w:color="ffffff"/>
+        <w:shd w:val="clear" w:color="ffffff"/>
         <w:tcBorders>
-          <w:top w:val="none"/>
-          <w:left w:val="none"/>
-          <w:bottom w:val="none"/>
+          <w:top w:val="none" w:color="000000" w:sz="4" w:space="0"/>
+          <w:left w:val="none" w:color="000000" w:sz="4" w:space="0"/>
+          <w:bottom w:val="none" w:color="000000" w:sz="4" w:space="0"/>
           <w:right w:val="single" w:color="000000" w:themeColor="accent2" w:themeTint="97" w:sz="4" w:space="0"/>
         </w:tcBorders>
       </w:tcPr>
@@ -13762,10 +13755,10 @@
       <w:tcPr>
         <w:shd w:val="clear" w:color="ffffff" w:themeColor="light1" w:fill="ffffff" w:themeFill="light1"/>
         <w:tcBorders>
-          <w:top w:val="none"/>
-          <w:left w:val="none"/>
+          <w:top w:val="none" w:color="000000" w:sz="4" w:space="0"/>
+          <w:left w:val="none" w:color="000000" w:sz="4" w:space="0"/>
           <w:bottom w:val="single" w:color="000000" w:themeColor="accent2" w:themeTint="97" w:sz="4" w:space="0"/>
-          <w:right w:val="none"/>
+          <w:right w:val="none" w:color="000000" w:sz="4" w:space="0"/>
         </w:tcBorders>
       </w:tcPr>
     </w:tblStylePr>
@@ -13785,12 +13778,12 @@
         <w:tblBorders/>
       </w:tblPr>
       <w:tcPr>
-        <w:shd w:color="ffffff"/>
+        <w:shd w:val="clear" w:color="ffffff"/>
         <w:tcBorders>
-          <w:top w:val="none"/>
+          <w:top w:val="none" w:color="000000" w:sz="4" w:space="0"/>
           <w:left w:val="single" w:color="000000" w:themeColor="accent2" w:themeTint="97" w:sz="4" w:space="0"/>
-          <w:bottom w:val="none"/>
-          <w:right w:val="none"/>
+          <w:bottom w:val="none" w:color="000000" w:sz="4" w:space="0"/>
+          <w:right w:val="none" w:color="000000" w:sz="4" w:space="0"/>
         </w:tcBorders>
       </w:tcPr>
     </w:tblStylePr>
@@ -13813,9 +13806,9 @@
         <w:shd w:val="clear" w:color="ffffff" w:themeColor="light1" w:fill="ffffff" w:themeFill="light1"/>
         <w:tcBorders>
           <w:top w:val="single" w:color="000000" w:themeColor="accent2" w:themeTint="97" w:sz="4" w:space="0"/>
-          <w:left w:val="none"/>
-          <w:bottom w:val="none"/>
-          <w:right w:val="none"/>
+          <w:left w:val="none" w:color="000000" w:sz="4" w:space="0"/>
+          <w:bottom w:val="none" w:color="000000" w:sz="4" w:space="0"/>
+          <w:right w:val="none" w:color="000000" w:sz="4" w:space="0"/>
         </w:tcBorders>
       </w:tcPr>
     </w:tblStylePr>
@@ -13885,9 +13878,9 @@
       </w:tcPr>
     </w:tblStylePr>
   </w:style>
-  <w:style w:type="table" w:styleId="63">
+  <w:style w:type="table" w:styleId="759">
     <w:name w:val="Grid Table 7 Colorful - Accent 3"/>
-    <w:basedOn w:val="665"/>
+    <w:basedOn w:val="893"/>
     <w:uiPriority w:val="99"/>
     <w:pPr>
       <w:pBdr/>
@@ -13989,11 +13982,11 @@
         <w:tblBorders/>
       </w:tblPr>
       <w:tcPr>
-        <w:shd w:color="ffffff"/>
+        <w:shd w:val="clear" w:color="ffffff"/>
         <w:tcBorders>
-          <w:top w:val="none"/>
-          <w:left w:val="none"/>
-          <w:bottom w:val="none"/>
+          <w:top w:val="none" w:color="000000" w:sz="4" w:space="0"/>
+          <w:left w:val="none" w:color="000000" w:sz="4" w:space="0"/>
+          <w:bottom w:val="none" w:color="000000" w:sz="4" w:space="0"/>
           <w:right w:val="single" w:color="000000" w:themeColor="accent3" w:themeTint="FE" w:sz="4" w:space="0"/>
         </w:tcBorders>
       </w:tcPr>
@@ -14016,10 +14009,10 @@
       <w:tcPr>
         <w:shd w:val="clear" w:color="ffffff" w:themeColor="light1" w:fill="ffffff" w:themeFill="light1"/>
         <w:tcBorders>
-          <w:top w:val="none"/>
-          <w:left w:val="none"/>
+          <w:top w:val="none" w:color="000000" w:sz="4" w:space="0"/>
+          <w:left w:val="none" w:color="000000" w:sz="4" w:space="0"/>
           <w:bottom w:val="single" w:color="000000" w:themeColor="accent3" w:themeTint="FE" w:sz="4" w:space="0"/>
-          <w:right w:val="none"/>
+          <w:right w:val="none" w:color="000000" w:sz="4" w:space="0"/>
         </w:tcBorders>
       </w:tcPr>
     </w:tblStylePr>
@@ -14039,12 +14032,12 @@
         <w:tblBorders/>
       </w:tblPr>
       <w:tcPr>
-        <w:shd w:color="ffffff"/>
+        <w:shd w:val="clear" w:color="ffffff"/>
         <w:tcBorders>
-          <w:top w:val="none"/>
+          <w:top w:val="none" w:color="000000" w:sz="4" w:space="0"/>
           <w:left w:val="single" w:color="000000" w:themeColor="accent3" w:themeTint="FE" w:sz="4" w:space="0"/>
-          <w:bottom w:val="none"/>
-          <w:right w:val="none"/>
+          <w:bottom w:val="none" w:color="000000" w:sz="4" w:space="0"/>
+          <w:right w:val="none" w:color="000000" w:sz="4" w:space="0"/>
         </w:tcBorders>
       </w:tcPr>
     </w:tblStylePr>
@@ -14067,9 +14060,9 @@
         <w:shd w:val="clear" w:color="ffffff" w:themeColor="light1" w:fill="ffffff" w:themeFill="light1"/>
         <w:tcBorders>
           <w:top w:val="single" w:color="000000" w:themeColor="accent3" w:themeTint="FE" w:sz="4" w:space="0"/>
-          <w:left w:val="none"/>
-          <w:bottom w:val="none"/>
-          <w:right w:val="none"/>
+          <w:left w:val="none" w:color="000000" w:sz="4" w:space="0"/>
+          <w:bottom w:val="none" w:color="000000" w:sz="4" w:space="0"/>
+          <w:right w:val="none" w:color="000000" w:sz="4" w:space="0"/>
         </w:tcBorders>
       </w:tcPr>
     </w:tblStylePr>
@@ -14139,9 +14132,9 @@
       </w:tcPr>
     </w:tblStylePr>
   </w:style>
-  <w:style w:type="table" w:styleId="64">
+  <w:style w:type="table" w:styleId="760">
     <w:name w:val="Grid Table 7 Colorful - Accent 4"/>
-    <w:basedOn w:val="665"/>
+    <w:basedOn w:val="893"/>
     <w:uiPriority w:val="99"/>
     <w:pPr>
       <w:pBdr/>
@@ -14243,11 +14236,11 @@
         <w:tblBorders/>
       </w:tblPr>
       <w:tcPr>
-        <w:shd w:color="ffffff"/>
+        <w:shd w:val="clear" w:color="ffffff"/>
         <w:tcBorders>
-          <w:top w:val="none"/>
-          <w:left w:val="none"/>
-          <w:bottom w:val="none"/>
+          <w:top w:val="none" w:color="000000" w:sz="4" w:space="0"/>
+          <w:left w:val="none" w:color="000000" w:sz="4" w:space="0"/>
+          <w:bottom w:val="none" w:color="000000" w:sz="4" w:space="0"/>
           <w:right w:val="single" w:color="000000" w:themeColor="accent4" w:themeTint="9A" w:sz="4" w:space="0"/>
         </w:tcBorders>
       </w:tcPr>
@@ -14270,10 +14263,10 @@
       <w:tcPr>
         <w:shd w:val="clear" w:color="ffffff" w:themeColor="light1" w:fill="ffffff" w:themeFill="light1"/>
         <w:tcBorders>
-          <w:top w:val="none"/>
-          <w:left w:val="none"/>
+          <w:top w:val="none" w:color="000000" w:sz="4" w:space="0"/>
+          <w:left w:val="none" w:color="000000" w:sz="4" w:space="0"/>
           <w:bottom w:val="single" w:color="000000" w:themeColor="accent4" w:themeTint="9A" w:sz="4" w:space="0"/>
-          <w:right w:val="none"/>
+          <w:right w:val="none" w:color="000000" w:sz="4" w:space="0"/>
         </w:tcBorders>
       </w:tcPr>
     </w:tblStylePr>
@@ -14293,12 +14286,12 @@
         <w:tblBorders/>
       </w:tblPr>
       <w:tcPr>
-        <w:shd w:color="ffffff"/>
+        <w:shd w:val="clear" w:color="ffffff"/>
         <w:tcBorders>
-          <w:top w:val="none"/>
+          <w:top w:val="none" w:color="000000" w:sz="4" w:space="0"/>
           <w:left w:val="single" w:color="000000" w:themeColor="accent4" w:themeTint="9A" w:sz="4" w:space="0"/>
-          <w:bottom w:val="none"/>
-          <w:right w:val="none"/>
+          <w:bottom w:val="none" w:color="000000" w:sz="4" w:space="0"/>
+          <w:right w:val="none" w:color="000000" w:sz="4" w:space="0"/>
         </w:tcBorders>
       </w:tcPr>
     </w:tblStylePr>
@@ -14321,9 +14314,9 @@
         <w:shd w:val="clear" w:color="ffffff" w:themeColor="light1" w:fill="ffffff" w:themeFill="light1"/>
         <w:tcBorders>
           <w:top w:val="single" w:color="000000" w:themeColor="accent4" w:themeTint="9A" w:sz="4" w:space="0"/>
-          <w:left w:val="none"/>
-          <w:bottom w:val="none"/>
-          <w:right w:val="none"/>
+          <w:left w:val="none" w:color="000000" w:sz="4" w:space="0"/>
+          <w:bottom w:val="none" w:color="000000" w:sz="4" w:space="0"/>
+          <w:right w:val="none" w:color="000000" w:sz="4" w:space="0"/>
         </w:tcBorders>
       </w:tcPr>
     </w:tblStylePr>
@@ -14393,9 +14386,9 @@
       </w:tcPr>
     </w:tblStylePr>
   </w:style>
-  <w:style w:type="table" w:styleId="65">
+  <w:style w:type="table" w:styleId="761">
     <w:name w:val="Grid Table 7 Colorful - Accent 5"/>
-    <w:basedOn w:val="665"/>
+    <w:basedOn w:val="893"/>
     <w:uiPriority w:val="99"/>
     <w:pPr>
       <w:pBdr/>
@@ -14497,11 +14490,11 @@
         <w:tblBorders/>
       </w:tblPr>
       <w:tcPr>
-        <w:shd w:color="ffffff"/>
+        <w:shd w:val="clear" w:color="ffffff"/>
         <w:tcBorders>
-          <w:top w:val="none"/>
-          <w:left w:val="none"/>
-          <w:bottom w:val="none"/>
+          <w:top w:val="none" w:color="000000" w:sz="4" w:space="0"/>
+          <w:left w:val="none" w:color="000000" w:sz="4" w:space="0"/>
+          <w:bottom w:val="none" w:color="000000" w:sz="4" w:space="0"/>
           <w:right w:val="single" w:color="000000" w:themeColor="accent5" w:themeTint="90" w:sz="4" w:space="0"/>
         </w:tcBorders>
       </w:tcPr>
@@ -14524,10 +14517,10 @@
       <w:tcPr>
         <w:shd w:val="clear" w:color="ffffff" w:themeColor="light1" w:fill="ffffff" w:themeFill="light1"/>
         <w:tcBorders>
-          <w:top w:val="none"/>
-          <w:left w:val="none"/>
+          <w:top w:val="none" w:color="000000" w:sz="4" w:space="0"/>
+          <w:left w:val="none" w:color="000000" w:sz="4" w:space="0"/>
           <w:bottom w:val="single" w:color="000000" w:themeColor="accent5" w:themeTint="90" w:sz="4" w:space="0"/>
-          <w:right w:val="none"/>
+          <w:right w:val="none" w:color="000000" w:sz="4" w:space="0"/>
         </w:tcBorders>
       </w:tcPr>
     </w:tblStylePr>
@@ -14547,12 +14540,12 @@
         <w:tblBorders/>
       </w:tblPr>
       <w:tcPr>
-        <w:shd w:color="ffffff"/>
+        <w:shd w:val="clear" w:color="ffffff"/>
         <w:tcBorders>
-          <w:top w:val="none"/>
+          <w:top w:val="none" w:color="000000" w:sz="4" w:space="0"/>
           <w:left w:val="single" w:color="000000" w:themeColor="accent5" w:themeTint="90" w:sz="4" w:space="0"/>
-          <w:bottom w:val="none"/>
-          <w:right w:val="none"/>
+          <w:bottom w:val="none" w:color="000000" w:sz="4" w:space="0"/>
+          <w:right w:val="none" w:color="000000" w:sz="4" w:space="0"/>
         </w:tcBorders>
       </w:tcPr>
     </w:tblStylePr>
@@ -14575,9 +14568,9 @@
         <w:shd w:val="clear" w:color="ffffff" w:themeColor="light1" w:fill="ffffff" w:themeFill="light1"/>
         <w:tcBorders>
           <w:top w:val="single" w:color="000000" w:themeColor="accent5" w:themeTint="90" w:sz="4" w:space="0"/>
-          <w:left w:val="none"/>
-          <w:bottom w:val="none"/>
-          <w:right w:val="none"/>
+          <w:left w:val="none" w:color="000000" w:sz="4" w:space="0"/>
+          <w:bottom w:val="none" w:color="000000" w:sz="4" w:space="0"/>
+          <w:right w:val="none" w:color="000000" w:sz="4" w:space="0"/>
         </w:tcBorders>
       </w:tcPr>
     </w:tblStylePr>
@@ -14647,9 +14640,9 @@
       </w:tcPr>
     </w:tblStylePr>
   </w:style>
-  <w:style w:type="table" w:styleId="66">
+  <w:style w:type="table" w:styleId="762">
     <w:name w:val="Grid Table 7 Colorful - Accent 6"/>
-    <w:basedOn w:val="665"/>
+    <w:basedOn w:val="893"/>
     <w:uiPriority w:val="99"/>
     <w:pPr>
       <w:pBdr/>
@@ -14751,11 +14744,11 @@
         <w:tblBorders/>
       </w:tblPr>
       <w:tcPr>
-        <w:shd w:color="ffffff"/>
+        <w:shd w:val="clear" w:color="ffffff"/>
         <w:tcBorders>
-          <w:top w:val="none"/>
-          <w:left w:val="none"/>
-          <w:bottom w:val="none"/>
+          <w:top w:val="none" w:color="000000" w:sz="4" w:space="0"/>
+          <w:left w:val="none" w:color="000000" w:sz="4" w:space="0"/>
+          <w:bottom w:val="none" w:color="000000" w:sz="4" w:space="0"/>
           <w:right w:val="single" w:color="000000" w:themeColor="accent6" w:themeTint="90" w:sz="4" w:space="0"/>
         </w:tcBorders>
       </w:tcPr>
@@ -14778,10 +14771,10 @@
       <w:tcPr>
         <w:shd w:val="clear" w:color="ffffff" w:themeColor="light1" w:fill="ffffff" w:themeFill="light1"/>
         <w:tcBorders>
-          <w:top w:val="none"/>
-          <w:left w:val="none"/>
+          <w:top w:val="none" w:color="000000" w:sz="4" w:space="0"/>
+          <w:left w:val="none" w:color="000000" w:sz="4" w:space="0"/>
           <w:bottom w:val="single" w:color="000000" w:themeColor="accent6" w:themeTint="90" w:sz="4" w:space="0"/>
-          <w:right w:val="none"/>
+          <w:right w:val="none" w:color="000000" w:sz="4" w:space="0"/>
         </w:tcBorders>
       </w:tcPr>
     </w:tblStylePr>
@@ -14801,12 +14794,12 @@
         <w:tblBorders/>
       </w:tblPr>
       <w:tcPr>
-        <w:shd w:color="ffffff"/>
+        <w:shd w:val="clear" w:color="ffffff"/>
         <w:tcBorders>
-          <w:top w:val="none"/>
+          <w:top w:val="none" w:color="000000" w:sz="4" w:space="0"/>
           <w:left w:val="single" w:color="000000" w:themeColor="accent6" w:themeTint="90" w:sz="4" w:space="0"/>
-          <w:bottom w:val="none"/>
-          <w:right w:val="none"/>
+          <w:bottom w:val="none" w:color="000000" w:sz="4" w:space="0"/>
+          <w:right w:val="none" w:color="000000" w:sz="4" w:space="0"/>
         </w:tcBorders>
       </w:tcPr>
     </w:tblStylePr>
@@ -14829,9 +14822,9 @@
         <w:shd w:val="clear" w:color="ffffff" w:themeColor="light1" w:fill="ffffff" w:themeFill="light1"/>
         <w:tcBorders>
           <w:top w:val="single" w:color="000000" w:themeColor="accent6" w:themeTint="90" w:sz="4" w:space="0"/>
-          <w:left w:val="none"/>
-          <w:bottom w:val="none"/>
-          <w:right w:val="none"/>
+          <w:left w:val="none" w:color="000000" w:sz="4" w:space="0"/>
+          <w:bottom w:val="none" w:color="000000" w:sz="4" w:space="0"/>
+          <w:right w:val="none" w:color="000000" w:sz="4" w:space="0"/>
         </w:tcBorders>
       </w:tcPr>
     </w:tblStylePr>
@@ -14901,9 +14894,9 @@
       </w:tcPr>
     </w:tblStylePr>
   </w:style>
-  <w:style w:type="table" w:styleId="67">
+  <w:style w:type="table" w:styleId="763">
     <w:name w:val="List Table 1 Light"/>
-    <w:basedOn w:val="665"/>
+    <w:basedOn w:val="893"/>
     <w:uiPriority w:val="99"/>
     <w:pPr>
       <w:pBdr/>
@@ -15117,9 +15110,9 @@
       </w:tcPr>
     </w:tblStylePr>
   </w:style>
-  <w:style w:type="table" w:styleId="68">
+  <w:style w:type="table" w:styleId="764">
     <w:name w:val="List Table 1 Light - Accent 1"/>
-    <w:basedOn w:val="665"/>
+    <w:basedOn w:val="893"/>
     <w:uiPriority w:val="99"/>
     <w:pPr>
       <w:pBdr/>
@@ -15333,9 +15326,9 @@
       </w:tcPr>
     </w:tblStylePr>
   </w:style>
-  <w:style w:type="table" w:styleId="69">
+  <w:style w:type="table" w:styleId="765">
     <w:name w:val="List Table 1 Light - Accent 2"/>
-    <w:basedOn w:val="665"/>
+    <w:basedOn w:val="893"/>
     <w:uiPriority w:val="99"/>
     <w:pPr>
       <w:pBdr/>
@@ -15549,9 +15542,9 @@
       </w:tcPr>
     </w:tblStylePr>
   </w:style>
-  <w:style w:type="table" w:styleId="70">
+  <w:style w:type="table" w:styleId="766">
     <w:name w:val="List Table 1 Light - Accent 3"/>
-    <w:basedOn w:val="665"/>
+    <w:basedOn w:val="893"/>
     <w:uiPriority w:val="99"/>
     <w:pPr>
       <w:pBdr/>
@@ -15765,9 +15758,9 @@
       </w:tcPr>
     </w:tblStylePr>
   </w:style>
-  <w:style w:type="table" w:styleId="71">
+  <w:style w:type="table" w:styleId="767">
     <w:name w:val="List Table 1 Light - Accent 4"/>
-    <w:basedOn w:val="665"/>
+    <w:basedOn w:val="893"/>
     <w:uiPriority w:val="99"/>
     <w:pPr>
       <w:pBdr/>
@@ -15981,9 +15974,9 @@
       </w:tcPr>
     </w:tblStylePr>
   </w:style>
-  <w:style w:type="table" w:styleId="72">
+  <w:style w:type="table" w:styleId="768">
     <w:name w:val="List Table 1 Light - Accent 5"/>
-    <w:basedOn w:val="665"/>
+    <w:basedOn w:val="893"/>
     <w:uiPriority w:val="99"/>
     <w:pPr>
       <w:pBdr/>
@@ -16197,9 +16190,9 @@
       </w:tcPr>
     </w:tblStylePr>
   </w:style>
-  <w:style w:type="table" w:styleId="73">
+  <w:style w:type="table" w:styleId="769">
     <w:name w:val="List Table 1 Light - Accent 6"/>
-    <w:basedOn w:val="665"/>
+    <w:basedOn w:val="893"/>
     <w:uiPriority w:val="99"/>
     <w:pPr>
       <w:pBdr/>
@@ -16413,9 +16406,9 @@
       </w:tcPr>
     </w:tblStylePr>
   </w:style>
-  <w:style w:type="table" w:styleId="74">
+  <w:style w:type="table" w:styleId="770">
     <w:name w:val="List Table 2"/>
-    <w:basedOn w:val="665"/>
+    <w:basedOn w:val="893"/>
     <w:uiPriority w:val="99"/>
     <w:pPr>
       <w:pBdr/>
@@ -16651,9 +16644,9 @@
       </w:tcPr>
     </w:tblStylePr>
   </w:style>
-  <w:style w:type="table" w:styleId="75">
+  <w:style w:type="table" w:styleId="771">
     <w:name w:val="List Table 2 - Accent 1"/>
-    <w:basedOn w:val="665"/>
+    <w:basedOn w:val="893"/>
     <w:uiPriority w:val="99"/>
     <w:pPr>
       <w:pBdr/>
@@ -16889,9 +16882,9 @@
       </w:tcPr>
     </w:tblStylePr>
   </w:style>
-  <w:style w:type="table" w:styleId="76">
+  <w:style w:type="table" w:styleId="772">
     <w:name w:val="List Table 2 - Accent 2"/>
-    <w:basedOn w:val="665"/>
+    <w:basedOn w:val="893"/>
     <w:uiPriority w:val="99"/>
     <w:pPr>
       <w:pBdr/>
@@ -17127,9 +17120,9 @@
       </w:tcPr>
     </w:tblStylePr>
   </w:style>
-  <w:style w:type="table" w:styleId="77">
+  <w:style w:type="table" w:styleId="773">
     <w:name w:val="List Table 2 - Accent 3"/>
-    <w:basedOn w:val="665"/>
+    <w:basedOn w:val="893"/>
     <w:uiPriority w:val="99"/>
     <w:pPr>
       <w:pBdr/>
@@ -17365,9 +17358,9 @@
       </w:tcPr>
     </w:tblStylePr>
   </w:style>
-  <w:style w:type="table" w:styleId="78">
+  <w:style w:type="table" w:styleId="774">
     <w:name w:val="List Table 2 - Accent 4"/>
-    <w:basedOn w:val="665"/>
+    <w:basedOn w:val="893"/>
     <w:uiPriority w:val="99"/>
     <w:pPr>
       <w:pBdr/>
@@ -17603,9 +17596,9 @@
       </w:tcPr>
     </w:tblStylePr>
   </w:style>
-  <w:style w:type="table" w:styleId="79">
+  <w:style w:type="table" w:styleId="775">
     <w:name w:val="List Table 2 - Accent 5"/>
-    <w:basedOn w:val="665"/>
+    <w:basedOn w:val="893"/>
     <w:uiPriority w:val="99"/>
     <w:pPr>
       <w:pBdr/>
@@ -17841,9 +17834,9 @@
       </w:tcPr>
     </w:tblStylePr>
   </w:style>
-  <w:style w:type="table" w:styleId="80">
+  <w:style w:type="table" w:styleId="776">
     <w:name w:val="List Table 2 - Accent 6"/>
-    <w:basedOn w:val="665"/>
+    <w:basedOn w:val="893"/>
     <w:uiPriority w:val="99"/>
     <w:pPr>
       <w:pBdr/>
@@ -18079,9 +18072,9 @@
       </w:tcPr>
     </w:tblStylePr>
   </w:style>
-  <w:style w:type="table" w:styleId="81">
+  <w:style w:type="table" w:styleId="777">
     <w:name w:val="List Table 3"/>
-    <w:basedOn w:val="665"/>
+    <w:basedOn w:val="893"/>
     <w:uiPriority w:val="99"/>
     <w:pPr>
       <w:pBdr/>
@@ -18307,9 +18300,9 @@
       </w:tcPr>
     </w:tblStylePr>
   </w:style>
-  <w:style w:type="table" w:styleId="82">
+  <w:style w:type="table" w:styleId="778">
     <w:name w:val="List Table 3 - Accent 1"/>
-    <w:basedOn w:val="665"/>
+    <w:basedOn w:val="893"/>
     <w:uiPriority w:val="99"/>
     <w:pPr>
       <w:pBdr/>
@@ -18535,9 +18528,9 @@
       </w:tcPr>
     </w:tblStylePr>
   </w:style>
-  <w:style w:type="table" w:styleId="83">
+  <w:style w:type="table" w:styleId="779">
     <w:name w:val="List Table 3 - Accent 2"/>
-    <w:basedOn w:val="665"/>
+    <w:basedOn w:val="893"/>
     <w:uiPriority w:val="99"/>
     <w:pPr>
       <w:pBdr/>
@@ -18763,9 +18756,9 @@
       </w:tcPr>
     </w:tblStylePr>
   </w:style>
-  <w:style w:type="table" w:styleId="84">
+  <w:style w:type="table" w:styleId="780">
     <w:name w:val="List Table 3 - Accent 3"/>
-    <w:basedOn w:val="665"/>
+    <w:basedOn w:val="893"/>
     <w:uiPriority w:val="99"/>
     <w:pPr>
       <w:pBdr/>
@@ -18991,9 +18984,9 @@
       </w:tcPr>
     </w:tblStylePr>
   </w:style>
-  <w:style w:type="table" w:styleId="85">
+  <w:style w:type="table" w:styleId="781">
     <w:name w:val="List Table 3 - Accent 4"/>
-    <w:basedOn w:val="665"/>
+    <w:basedOn w:val="893"/>
     <w:uiPriority w:val="99"/>
     <w:pPr>
       <w:pBdr/>
@@ -19219,9 +19212,9 @@
       </w:tcPr>
     </w:tblStylePr>
   </w:style>
-  <w:style w:type="table" w:styleId="86">
+  <w:style w:type="table" w:styleId="782">
     <w:name w:val="List Table 3 - Accent 5"/>
-    <w:basedOn w:val="665"/>
+    <w:basedOn w:val="893"/>
     <w:uiPriority w:val="99"/>
     <w:pPr>
       <w:pBdr/>
@@ -19447,9 +19440,9 @@
       </w:tcPr>
     </w:tblStylePr>
   </w:style>
-  <w:style w:type="table" w:styleId="87">
+  <w:style w:type="table" w:styleId="783">
     <w:name w:val="List Table 3 - Accent 6"/>
-    <w:basedOn w:val="665"/>
+    <w:basedOn w:val="893"/>
     <w:uiPriority w:val="99"/>
     <w:pPr>
       <w:pBdr/>
@@ -19675,9 +19668,9 @@
       </w:tcPr>
     </w:tblStylePr>
   </w:style>
-  <w:style w:type="table" w:styleId="88">
+  <w:style w:type="table" w:styleId="784">
     <w:name w:val="List Table 4"/>
-    <w:basedOn w:val="665"/>
+    <w:basedOn w:val="893"/>
     <w:uiPriority w:val="99"/>
     <w:pPr>
       <w:pBdr/>
@@ -19900,9 +19893,9 @@
       </w:tcPr>
     </w:tblStylePr>
   </w:style>
-  <w:style w:type="table" w:styleId="89">
+  <w:style w:type="table" w:styleId="785">
     <w:name w:val="List Table 4 - Accent 1"/>
-    <w:basedOn w:val="665"/>
+    <w:basedOn w:val="893"/>
     <w:uiPriority w:val="99"/>
     <w:pPr>
       <w:pBdr/>
@@ -20125,9 +20118,9 @@
       </w:tcPr>
     </w:tblStylePr>
   </w:style>
-  <w:style w:type="table" w:styleId="90">
+  <w:style w:type="table" w:styleId="786">
     <w:name w:val="List Table 4 - Accent 2"/>
-    <w:basedOn w:val="665"/>
+    <w:basedOn w:val="893"/>
     <w:uiPriority w:val="99"/>
     <w:pPr>
       <w:pBdr/>
@@ -20350,9 +20343,9 @@
       </w:tcPr>
     </w:tblStylePr>
   </w:style>
-  <w:style w:type="table" w:styleId="91">
+  <w:style w:type="table" w:styleId="787">
     <w:name w:val="List Table 4 - Accent 3"/>
-    <w:basedOn w:val="665"/>
+    <w:basedOn w:val="893"/>
     <w:uiPriority w:val="99"/>
     <w:pPr>
       <w:pBdr/>
@@ -20575,9 +20568,9 @@
       </w:tcPr>
     </w:tblStylePr>
   </w:style>
-  <w:style w:type="table" w:styleId="92">
+  <w:style w:type="table" w:styleId="788">
     <w:name w:val="List Table 4 - Accent 4"/>
-    <w:basedOn w:val="665"/>
+    <w:basedOn w:val="893"/>
     <w:uiPriority w:val="99"/>
     <w:pPr>
       <w:pBdr/>
@@ -20800,9 +20793,9 @@
       </w:tcPr>
     </w:tblStylePr>
   </w:style>
-  <w:style w:type="table" w:styleId="93">
+  <w:style w:type="table" w:styleId="789">
     <w:name w:val="List Table 4 - Accent 5"/>
-    <w:basedOn w:val="665"/>
+    <w:basedOn w:val="893"/>
     <w:uiPriority w:val="99"/>
     <w:pPr>
       <w:pBdr/>
@@ -21025,9 +21018,9 @@
       </w:tcPr>
     </w:tblStylePr>
   </w:style>
-  <w:style w:type="table" w:styleId="94">
+  <w:style w:type="table" w:styleId="790">
     <w:name w:val="List Table 4 - Accent 6"/>
-    <w:basedOn w:val="665"/>
+    <w:basedOn w:val="893"/>
     <w:uiPriority w:val="99"/>
     <w:pPr>
       <w:pBdr/>
@@ -21250,9 +21243,9 @@
       </w:tcPr>
     </w:tblStylePr>
   </w:style>
-  <w:style w:type="table" w:styleId="95">
+  <w:style w:type="table" w:styleId="791">
     <w:name w:val="List Table 5 Dark"/>
-    <w:basedOn w:val="665"/>
+    <w:basedOn w:val="893"/>
     <w:uiPriority w:val="99"/>
     <w:pPr>
       <w:pBdr/>
@@ -21492,9 +21485,9 @@
       </w:tcPr>
     </w:tblStylePr>
   </w:style>
-  <w:style w:type="table" w:styleId="96">
+  <w:style w:type="table" w:styleId="792">
     <w:name w:val="List Table 5 Dark - Accent 1"/>
-    <w:basedOn w:val="665"/>
+    <w:basedOn w:val="893"/>
     <w:uiPriority w:val="99"/>
     <w:pPr>
       <w:pBdr/>
@@ -21734,9 +21727,9 @@
       </w:tcPr>
     </w:tblStylePr>
   </w:style>
-  <w:style w:type="table" w:styleId="97">
+  <w:style w:type="table" w:styleId="793">
     <w:name w:val="List Table 5 Dark - Accent 2"/>
-    <w:basedOn w:val="665"/>
+    <w:basedOn w:val="893"/>
     <w:uiPriority w:val="99"/>
     <w:pPr>
       <w:pBdr/>
@@ -21976,9 +21969,9 @@
       </w:tcPr>
     </w:tblStylePr>
   </w:style>
-  <w:style w:type="table" w:styleId="98">
+  <w:style w:type="table" w:styleId="794">
     <w:name w:val="List Table 5 Dark - Accent 3"/>
-    <w:basedOn w:val="665"/>
+    <w:basedOn w:val="893"/>
     <w:uiPriority w:val="99"/>
     <w:pPr>
       <w:pBdr/>
@@ -22218,9 +22211,9 @@
       </w:tcPr>
     </w:tblStylePr>
   </w:style>
-  <w:style w:type="table" w:styleId="99">
+  <w:style w:type="table" w:styleId="795">
     <w:name w:val="List Table 5 Dark - Accent 4"/>
-    <w:basedOn w:val="665"/>
+    <w:basedOn w:val="893"/>
     <w:uiPriority w:val="99"/>
     <w:pPr>
       <w:pBdr/>
@@ -22460,9 +22453,9 @@
       </w:tcPr>
     </w:tblStylePr>
   </w:style>
-  <w:style w:type="table" w:styleId="100">
+  <w:style w:type="table" w:styleId="796">
     <w:name w:val="List Table 5 Dark - Accent 5"/>
-    <w:basedOn w:val="665"/>
+    <w:basedOn w:val="893"/>
     <w:uiPriority w:val="99"/>
     <w:pPr>
       <w:pBdr/>
@@ -22702,9 +22695,9 @@
       </w:tcPr>
     </w:tblStylePr>
   </w:style>
-  <w:style w:type="table" w:styleId="101">
+  <w:style w:type="table" w:styleId="797">
     <w:name w:val="List Table 5 Dark - Accent 6"/>
-    <w:basedOn w:val="665"/>
+    <w:basedOn w:val="893"/>
     <w:uiPriority w:val="99"/>
     <w:pPr>
       <w:pBdr/>
@@ -22944,9 +22937,9 @@
       </w:tcPr>
     </w:tblStylePr>
   </w:style>
-  <w:style w:type="table" w:styleId="102">
+  <w:style w:type="table" w:styleId="798">
     <w:name w:val="List Table 6 Colorful"/>
-    <w:basedOn w:val="665"/>
+    <w:basedOn w:val="893"/>
     <w:uiPriority w:val="99"/>
     <w:pPr>
       <w:pBdr/>
@@ -23167,9 +23160,9 @@
       </w:tcPr>
     </w:tblStylePr>
   </w:style>
-  <w:style w:type="table" w:styleId="103">
+  <w:style w:type="table" w:styleId="799">
     <w:name w:val="List Table 6 Colorful - Accent 1"/>
-    <w:basedOn w:val="665"/>
+    <w:basedOn w:val="893"/>
     <w:uiPriority w:val="99"/>
     <w:pPr>
       <w:pBdr/>
@@ -23390,9 +23383,9 @@
       </w:tcPr>
     </w:tblStylePr>
   </w:style>
-  <w:style w:type="table" w:styleId="104">
+  <w:style w:type="table" w:styleId="800">
     <w:name w:val="List Table 6 Colorful - Accent 2"/>
-    <w:basedOn w:val="665"/>
+    <w:basedOn w:val="893"/>
     <w:uiPriority w:val="99"/>
     <w:pPr>
       <w:pBdr/>
@@ -23613,9 +23606,9 @@
       </w:tcPr>
     </w:tblStylePr>
   </w:style>
-  <w:style w:type="table" w:styleId="105">
+  <w:style w:type="table" w:styleId="801">
     <w:name w:val="List Table 6 Colorful - Accent 3"/>
-    <w:basedOn w:val="665"/>
+    <w:basedOn w:val="893"/>
     <w:uiPriority w:val="99"/>
     <w:pPr>
       <w:pBdr/>
@@ -23836,9 +23829,9 @@
       </w:tcPr>
     </w:tblStylePr>
   </w:style>
-  <w:style w:type="table" w:styleId="106">
+  <w:style w:type="table" w:styleId="802">
     <w:name w:val="List Table 6 Colorful - Accent 4"/>
-    <w:basedOn w:val="665"/>
+    <w:basedOn w:val="893"/>
     <w:uiPriority w:val="99"/>
     <w:pPr>
       <w:pBdr/>
@@ -24059,9 +24052,9 @@
       </w:tcPr>
     </w:tblStylePr>
   </w:style>
-  <w:style w:type="table" w:styleId="107">
+  <w:style w:type="table" w:styleId="803">
     <w:name w:val="List Table 6 Colorful - Accent 5"/>
-    <w:basedOn w:val="665"/>
+    <w:basedOn w:val="893"/>
     <w:uiPriority w:val="99"/>
     <w:pPr>
       <w:pBdr/>
@@ -24282,9 +24275,9 @@
       </w:tcPr>
     </w:tblStylePr>
   </w:style>
-  <w:style w:type="table" w:styleId="108">
+  <w:style w:type="table" w:styleId="804">
     <w:name w:val="List Table 6 Colorful - Accent 6"/>
-    <w:basedOn w:val="665"/>
+    <w:basedOn w:val="893"/>
     <w:uiPriority w:val="99"/>
     <w:pPr>
       <w:pBdr/>
@@ -24505,9 +24498,9 @@
       </w:tcPr>
     </w:tblStylePr>
   </w:style>
-  <w:style w:type="table" w:styleId="109">
+  <w:style w:type="table" w:styleId="805">
     <w:name w:val="List Table 7 Colorful"/>
-    <w:basedOn w:val="665"/>
+    <w:basedOn w:val="893"/>
     <w:uiPriority w:val="99"/>
     <w:pPr>
       <w:pBdr/>
@@ -24606,11 +24599,11 @@
         <w:tblBorders/>
       </w:tblPr>
       <w:tcPr>
-        <w:shd w:color="ffffff"/>
+        <w:shd w:val="clear" w:color="ffffff"/>
         <w:tcBorders>
-          <w:top w:val="none"/>
-          <w:left w:val="none"/>
-          <w:bottom w:val="none"/>
+          <w:top w:val="none" w:color="000000" w:sz="4" w:space="0"/>
+          <w:left w:val="none" w:color="000000" w:sz="4" w:space="0"/>
+          <w:bottom w:val="none" w:color="000000" w:sz="4" w:space="0"/>
           <w:right w:val="single" w:color="000000" w:themeColor="text1" w:themeTint="80" w:sz="4" w:space="0"/>
         </w:tcBorders>
       </w:tcPr>
@@ -24633,10 +24626,10 @@
       <w:tcPr>
         <w:shd w:val="clear" w:color="ffffff" w:themeColor="light1" w:fill="ffffff" w:themeFill="light1"/>
         <w:tcBorders>
-          <w:top w:val="none"/>
-          <w:left w:val="none"/>
+          <w:top w:val="none" w:color="000000" w:sz="4" w:space="0"/>
+          <w:left w:val="none" w:color="000000" w:sz="4" w:space="0"/>
           <w:bottom w:val="single" w:color="000000" w:themeColor="text1" w:themeTint="80" w:sz="4" w:space="0"/>
-          <w:right w:val="none"/>
+          <w:right w:val="none" w:color="000000" w:sz="4" w:space="0"/>
         </w:tcBorders>
       </w:tcPr>
     </w:tblStylePr>
@@ -24656,12 +24649,12 @@
         <w:tblBorders/>
       </w:tblPr>
       <w:tcPr>
-        <w:shd w:color="ffffff"/>
+        <w:shd w:val="clear" w:color="ffffff"/>
         <w:tcBorders>
-          <w:top w:val="none"/>
+          <w:top w:val="none" w:color="000000" w:sz="4" w:space="0"/>
           <w:left w:val="single" w:color="000000" w:themeColor="text1" w:themeTint="80" w:sz="4" w:space="0"/>
-          <w:bottom w:val="none"/>
-          <w:right w:val="none"/>
+          <w:bottom w:val="none" w:color="000000" w:sz="4" w:space="0"/>
+          <w:right w:val="none" w:color="000000" w:sz="4" w:space="0"/>
         </w:tcBorders>
       </w:tcPr>
     </w:tblStylePr>
@@ -24684,9 +24677,9 @@
         <w:shd w:val="clear" w:color="ffffff" w:themeColor="light1" w:fill="ffffff" w:themeFill="light1"/>
         <w:tcBorders>
           <w:top w:val="single" w:color="000000" w:themeColor="text1" w:themeTint="80" w:sz="4" w:space="0"/>
-          <w:left w:val="none"/>
-          <w:bottom w:val="none"/>
-          <w:right w:val="none"/>
+          <w:left w:val="none" w:color="000000" w:sz="4" w:space="0"/>
+          <w:bottom w:val="none" w:color="000000" w:sz="4" w:space="0"/>
+          <w:right w:val="none" w:color="000000" w:sz="4" w:space="0"/>
         </w:tcBorders>
       </w:tcPr>
     </w:tblStylePr>
@@ -24761,9 +24754,9 @@
       </w:tcPr>
     </w:tblStylePr>
   </w:style>
-  <w:style w:type="table" w:styleId="110">
+  <w:style w:type="table" w:styleId="806">
     <w:name w:val="List Table 7 Colorful - Accent 1"/>
-    <w:basedOn w:val="665"/>
+    <w:basedOn w:val="893"/>
     <w:uiPriority w:val="99"/>
     <w:pPr>
       <w:pBdr/>
@@ -24862,11 +24855,11 @@
         <w:tblBorders/>
       </w:tblPr>
       <w:tcPr>
-        <w:shd w:color="ffffff"/>
+        <w:shd w:val="clear" w:color="ffffff"/>
         <w:tcBorders>
-          <w:top w:val="none"/>
-          <w:left w:val="none"/>
-          <w:bottom w:val="none"/>
+          <w:top w:val="none" w:color="000000" w:sz="4" w:space="0"/>
+          <w:left w:val="none" w:color="000000" w:sz="4" w:space="0"/>
+          <w:bottom w:val="none" w:color="000000" w:sz="4" w:space="0"/>
           <w:right w:val="single" w:color="000000" w:themeColor="accent1" w:sz="4" w:space="0"/>
         </w:tcBorders>
       </w:tcPr>
@@ -24889,10 +24882,10 @@
       <w:tcPr>
         <w:shd w:val="clear" w:color="ffffff" w:themeColor="light1" w:fill="ffffff" w:themeFill="light1"/>
         <w:tcBorders>
-          <w:top w:val="none"/>
-          <w:left w:val="none"/>
+          <w:top w:val="none" w:color="000000" w:sz="4" w:space="0"/>
+          <w:left w:val="none" w:color="000000" w:sz="4" w:space="0"/>
           <w:bottom w:val="single" w:color="000000" w:themeColor="accent1" w:sz="4" w:space="0"/>
-          <w:right w:val="none"/>
+          <w:right w:val="none" w:color="000000" w:sz="4" w:space="0"/>
         </w:tcBorders>
       </w:tcPr>
     </w:tblStylePr>
@@ -24912,12 +24905,12 @@
         <w:tblBorders/>
       </w:tblPr>
       <w:tcPr>
-        <w:shd w:color="ffffff"/>
+        <w:shd w:val="clear" w:color="ffffff"/>
         <w:tcBorders>
-          <w:top w:val="none"/>
+          <w:top w:val="none" w:color="000000" w:sz="4" w:space="0"/>
           <w:left w:val="single" w:color="000000" w:themeColor="accent1" w:sz="4" w:space="0"/>
-          <w:bottom w:val="none"/>
-          <w:right w:val="none"/>
+          <w:bottom w:val="none" w:color="000000" w:sz="4" w:space="0"/>
+          <w:right w:val="none" w:color="000000" w:sz="4" w:space="0"/>
         </w:tcBorders>
       </w:tcPr>
     </w:tblStylePr>
@@ -24940,9 +24933,9 @@
         <w:shd w:val="clear" w:color="ffffff" w:themeColor="light1" w:fill="ffffff" w:themeFill="light1"/>
         <w:tcBorders>
           <w:top w:val="single" w:color="000000" w:themeColor="accent1" w:sz="4" w:space="0"/>
-          <w:left w:val="none"/>
-          <w:bottom w:val="none"/>
-          <w:right w:val="none"/>
+          <w:left w:val="none" w:color="000000" w:sz="4" w:space="0"/>
+          <w:bottom w:val="none" w:color="000000" w:sz="4" w:space="0"/>
+          <w:right w:val="none" w:color="000000" w:sz="4" w:space="0"/>
         </w:tcBorders>
       </w:tcPr>
     </w:tblStylePr>
@@ -25017,9 +25010,9 @@
       </w:tcPr>
     </w:tblStylePr>
   </w:style>
-  <w:style w:type="table" w:styleId="111">
+  <w:style w:type="table" w:styleId="807">
     <w:name w:val="List Table 7 Colorful - Accent 2"/>
-    <w:basedOn w:val="665"/>
+    <w:basedOn w:val="893"/>
     <w:uiPriority w:val="99"/>
     <w:pPr>
       <w:pBdr/>
@@ -25118,11 +25111,11 @@
         <w:tblBorders/>
       </w:tblPr>
       <w:tcPr>
-        <w:shd w:color="ffffff"/>
+        <w:shd w:val="clear" w:color="ffffff"/>
         <w:tcBorders>
-          <w:top w:val="none"/>
-          <w:left w:val="none"/>
-          <w:bottom w:val="none"/>
+          <w:top w:val="none" w:color="000000" w:sz="4" w:space="0"/>
+          <w:left w:val="none" w:color="000000" w:sz="4" w:space="0"/>
+          <w:bottom w:val="none" w:color="000000" w:sz="4" w:space="0"/>
           <w:right w:val="single" w:color="000000" w:themeColor="accent2" w:themeTint="97" w:sz="4" w:space="0"/>
         </w:tcBorders>
       </w:tcPr>
@@ -25145,10 +25138,10 @@
       <w:tcPr>
         <w:shd w:val="clear" w:color="ffffff" w:themeColor="light1" w:fill="ffffff" w:themeFill="light1"/>
         <w:tcBorders>
-          <w:top w:val="none"/>
-          <w:left w:val="none"/>
+          <w:top w:val="none" w:color="000000" w:sz="4" w:space="0"/>
+          <w:left w:val="none" w:color="000000" w:sz="4" w:space="0"/>
           <w:bottom w:val="single" w:color="000000" w:themeColor="accent2" w:themeTint="97" w:sz="4" w:space="0"/>
-          <w:right w:val="none"/>
+          <w:right w:val="none" w:color="000000" w:sz="4" w:space="0"/>
         </w:tcBorders>
       </w:tcPr>
     </w:tblStylePr>
@@ -25168,12 +25161,12 @@
         <w:tblBorders/>
       </w:tblPr>
       <w:tcPr>
-        <w:shd w:color="ffffff"/>
+        <w:shd w:val="clear" w:color="ffffff"/>
         <w:tcBorders>
-          <w:top w:val="none"/>
+          <w:top w:val="none" w:color="000000" w:sz="4" w:space="0"/>
           <w:left w:val="single" w:color="000000" w:themeColor="accent2" w:themeTint="97" w:sz="4" w:space="0"/>
-          <w:bottom w:val="none"/>
-          <w:right w:val="none"/>
+          <w:bottom w:val="none" w:color="000000" w:sz="4" w:space="0"/>
+          <w:right w:val="none" w:color="000000" w:sz="4" w:space="0"/>
         </w:tcBorders>
       </w:tcPr>
     </w:tblStylePr>
@@ -25196,9 +25189,9 @@
         <w:shd w:val="clear" w:color="ffffff" w:themeColor="light1" w:fill="ffffff" w:themeFill="light1"/>
         <w:tcBorders>
           <w:top w:val="single" w:color="000000" w:themeColor="accent2" w:themeTint="97" w:sz="4" w:space="0"/>
-          <w:left w:val="none"/>
-          <w:bottom w:val="none"/>
-          <w:right w:val="none"/>
+          <w:left w:val="none" w:color="000000" w:sz="4" w:space="0"/>
+          <w:bottom w:val="none" w:color="000000" w:sz="4" w:space="0"/>
+          <w:right w:val="none" w:color="000000" w:sz="4" w:space="0"/>
         </w:tcBorders>
       </w:tcPr>
     </w:tblStylePr>
@@ -25273,9 +25266,9 @@
       </w:tcPr>
     </w:tblStylePr>
   </w:style>
-  <w:style w:type="table" w:styleId="112">
+  <w:style w:type="table" w:styleId="808">
     <w:name w:val="List Table 7 Colorful - Accent 3"/>
-    <w:basedOn w:val="665"/>
+    <w:basedOn w:val="893"/>
     <w:uiPriority w:val="99"/>
     <w:pPr>
       <w:pBdr/>
@@ -25374,11 +25367,11 @@
         <w:tblBorders/>
       </w:tblPr>
       <w:tcPr>
-        <w:shd w:color="ffffff"/>
+        <w:shd w:val="clear" w:color="ffffff"/>
         <w:tcBorders>
-          <w:top w:val="none"/>
-          <w:left w:val="none"/>
-          <w:bottom w:val="none"/>
+          <w:top w:val="none" w:color="000000" w:sz="4" w:space="0"/>
+          <w:left w:val="none" w:color="000000" w:sz="4" w:space="0"/>
+          <w:bottom w:val="none" w:color="000000" w:sz="4" w:space="0"/>
           <w:right w:val="single" w:color="000000" w:themeColor="accent3" w:themeTint="98" w:sz="4" w:space="0"/>
         </w:tcBorders>
       </w:tcPr>
@@ -25401,10 +25394,10 @@
       <w:tcPr>
         <w:shd w:val="clear" w:color="ffffff" w:themeColor="light1" w:fill="ffffff" w:themeFill="light1"/>
         <w:tcBorders>
-          <w:top w:val="none"/>
-          <w:left w:val="none"/>
+          <w:top w:val="none" w:color="000000" w:sz="4" w:space="0"/>
+          <w:left w:val="none" w:color="000000" w:sz="4" w:space="0"/>
           <w:bottom w:val="single" w:color="000000" w:themeColor="accent3" w:themeTint="98" w:sz="4" w:space="0"/>
-          <w:right w:val="none"/>
+          <w:right w:val="none" w:color="000000" w:sz="4" w:space="0"/>
         </w:tcBorders>
       </w:tcPr>
     </w:tblStylePr>
@@ -25424,12 +25417,12 @@
         <w:tblBorders/>
       </w:tblPr>
       <w:tcPr>
-        <w:shd w:color="ffffff"/>
+        <w:shd w:val="clear" w:color="ffffff"/>
         <w:tcBorders>
-          <w:top w:val="none"/>
+          <w:top w:val="none" w:color="000000" w:sz="4" w:space="0"/>
           <w:left w:val="single" w:color="000000" w:themeColor="accent3" w:themeTint="98" w:sz="4" w:space="0"/>
-          <w:bottom w:val="none"/>
-          <w:right w:val="none"/>
+          <w:bottom w:val="none" w:color="000000" w:sz="4" w:space="0"/>
+          <w:right w:val="none" w:color="000000" w:sz="4" w:space="0"/>
         </w:tcBorders>
       </w:tcPr>
     </w:tblStylePr>
@@ -25452,9 +25445,9 @@
         <w:shd w:val="clear" w:color="ffffff" w:themeColor="light1" w:fill="ffffff" w:themeFill="light1"/>
         <w:tcBorders>
           <w:top w:val="single" w:color="000000" w:themeColor="accent3" w:themeTint="98" w:sz="4" w:space="0"/>
-          <w:left w:val="none"/>
-          <w:bottom w:val="none"/>
-          <w:right w:val="none"/>
+          <w:left w:val="none" w:color="000000" w:sz="4" w:space="0"/>
+          <w:bottom w:val="none" w:color="000000" w:sz="4" w:space="0"/>
+          <w:right w:val="none" w:color="000000" w:sz="4" w:space="0"/>
         </w:tcBorders>
       </w:tcPr>
     </w:tblStylePr>
@@ -25529,9 +25522,9 @@
       </w:tcPr>
     </w:tblStylePr>
   </w:style>
-  <w:style w:type="table" w:styleId="113">
+  <w:style w:type="table" w:styleId="809">
     <w:name w:val="List Table 7 Colorful - Accent 4"/>
-    <w:basedOn w:val="665"/>
+    <w:basedOn w:val="893"/>
     <w:uiPriority w:val="99"/>
     <w:pPr>
       <w:pBdr/>
@@ -25630,11 +25623,11 @@
         <w:tblBorders/>
       </w:tblPr>
       <w:tcPr>
-        <w:shd w:color="ffffff"/>
+        <w:shd w:val="clear" w:color="ffffff"/>
         <w:tcBorders>
-          <w:top w:val="none"/>
-          <w:left w:val="none"/>
-          <w:bottom w:val="none"/>
+          <w:top w:val="none" w:color="000000" w:sz="4" w:space="0"/>
+          <w:left w:val="none" w:color="000000" w:sz="4" w:space="0"/>
+          <w:bottom w:val="none" w:color="000000" w:sz="4" w:space="0"/>
           <w:right w:val="single" w:color="000000" w:themeColor="accent4" w:themeTint="9A" w:sz="4" w:space="0"/>
         </w:tcBorders>
       </w:tcPr>
@@ -25657,10 +25650,10 @@
       <w:tcPr>
         <w:shd w:val="clear" w:color="ffffff" w:themeColor="light1" w:fill="ffffff" w:themeFill="light1"/>
         <w:tcBorders>
-          <w:top w:val="none"/>
-          <w:left w:val="none"/>
+          <w:top w:val="none" w:color="000000" w:sz="4" w:space="0"/>
+          <w:left w:val="none" w:color="000000" w:sz="4" w:space="0"/>
           <w:bottom w:val="single" w:color="000000" w:themeColor="accent4" w:themeTint="9A" w:sz="4" w:space="0"/>
-          <w:right w:val="none"/>
+          <w:right w:val="none" w:color="000000" w:sz="4" w:space="0"/>
         </w:tcBorders>
       </w:tcPr>
     </w:tblStylePr>
@@ -25680,12 +25673,12 @@
         <w:tblBorders/>
       </w:tblPr>
       <w:tcPr>
-        <w:shd w:color="ffffff"/>
+        <w:shd w:val="clear" w:color="ffffff"/>
         <w:tcBorders>
-          <w:top w:val="none"/>
+          <w:top w:val="none" w:color="000000" w:sz="4" w:space="0"/>
           <w:left w:val="single" w:color="000000" w:themeColor="accent4" w:themeTint="9A" w:sz="4" w:space="0"/>
-          <w:bottom w:val="none"/>
-          <w:right w:val="none"/>
+          <w:bottom w:val="none" w:color="000000" w:sz="4" w:space="0"/>
+          <w:right w:val="none" w:color="000000" w:sz="4" w:space="0"/>
         </w:tcBorders>
       </w:tcPr>
     </w:tblStylePr>
@@ -25708,9 +25701,9 @@
         <w:shd w:val="clear" w:color="ffffff" w:themeColor="light1" w:fill="ffffff" w:themeFill="light1"/>
         <w:tcBorders>
           <w:top w:val="single" w:color="000000" w:themeColor="accent4" w:themeTint="9A" w:sz="4" w:space="0"/>
-          <w:left w:val="none"/>
-          <w:bottom w:val="none"/>
-          <w:right w:val="none"/>
+          <w:left w:val="none" w:color="000000" w:sz="4" w:space="0"/>
+          <w:bottom w:val="none" w:color="000000" w:sz="4" w:space="0"/>
+          <w:right w:val="none" w:color="000000" w:sz="4" w:space="0"/>
         </w:tcBorders>
       </w:tcPr>
     </w:tblStylePr>
@@ -25785,9 +25778,9 @@
       </w:tcPr>
     </w:tblStylePr>
   </w:style>
-  <w:style w:type="table" w:styleId="114">
+  <w:style w:type="table" w:styleId="810">
     <w:name w:val="List Table 7 Colorful - Accent 5"/>
-    <w:basedOn w:val="665"/>
+    <w:basedOn w:val="893"/>
     <w:uiPriority w:val="99"/>
     <w:pPr>
       <w:pBdr/>
@@ -25886,11 +25879,11 @@
         <w:tblBorders/>
       </w:tblPr>
       <w:tcPr>
-        <w:shd w:color="ffffff"/>
+        <w:shd w:val="clear" w:color="ffffff"/>
         <w:tcBorders>
-          <w:top w:val="none"/>
-          <w:left w:val="none"/>
-          <w:bottom w:val="none"/>
+          <w:top w:val="none" w:color="000000" w:sz="4" w:space="0"/>
+          <w:left w:val="none" w:color="000000" w:sz="4" w:space="0"/>
+          <w:bottom w:val="none" w:color="000000" w:sz="4" w:space="0"/>
           <w:right w:val="single" w:color="000000" w:themeColor="accent5" w:themeTint="9A" w:sz="4" w:space="0"/>
         </w:tcBorders>
       </w:tcPr>
@@ -25913,10 +25906,10 @@
       <w:tcPr>
         <w:shd w:val="clear" w:color="ffffff" w:themeColor="light1" w:fill="ffffff" w:themeFill="light1"/>
         <w:tcBorders>
-          <w:top w:val="none"/>
-          <w:left w:val="none"/>
+          <w:top w:val="none" w:color="000000" w:sz="4" w:space="0"/>
+          <w:left w:val="none" w:color="000000" w:sz="4" w:space="0"/>
           <w:bottom w:val="single" w:color="000000" w:themeColor="accent5" w:themeTint="9A" w:sz="4" w:space="0"/>
-          <w:right w:val="none"/>
+          <w:right w:val="none" w:color="000000" w:sz="4" w:space="0"/>
         </w:tcBorders>
       </w:tcPr>
     </w:tblStylePr>
@@ -25936,12 +25929,12 @@
         <w:tblBorders/>
       </w:tblPr>
       <w:tcPr>
-        <w:shd w:color="ffffff"/>
+        <w:shd w:val="clear" w:color="ffffff"/>
         <w:tcBorders>
-          <w:top w:val="none"/>
+          <w:top w:val="none" w:color="000000" w:sz="4" w:space="0"/>
           <w:left w:val="single" w:color="000000" w:themeColor="accent5" w:themeTint="9A" w:sz="4" w:space="0"/>
-          <w:bottom w:val="none"/>
-          <w:right w:val="none"/>
+          <w:bottom w:val="none" w:color="000000" w:sz="4" w:space="0"/>
+          <w:right w:val="none" w:color="000000" w:sz="4" w:space="0"/>
         </w:tcBorders>
       </w:tcPr>
     </w:tblStylePr>
@@ -25964,9 +25957,9 @@
         <w:shd w:val="clear" w:color="ffffff" w:themeColor="light1" w:fill="ffffff" w:themeFill="light1"/>
         <w:tcBorders>
           <w:top w:val="single" w:color="000000" w:themeColor="accent5" w:themeTint="9A" w:sz="4" w:space="0"/>
-          <w:left w:val="none"/>
-          <w:bottom w:val="none"/>
-          <w:right w:val="none"/>
+          <w:left w:val="none" w:color="000000" w:sz="4" w:space="0"/>
+          <w:bottom w:val="none" w:color="000000" w:sz="4" w:space="0"/>
+          <w:right w:val="none" w:color="000000" w:sz="4" w:space="0"/>
         </w:tcBorders>
       </w:tcPr>
     </w:tblStylePr>
@@ -26041,9 +26034,9 @@
       </w:tcPr>
     </w:tblStylePr>
   </w:style>
-  <w:style w:type="table" w:styleId="115">
+  <w:style w:type="table" w:styleId="811">
     <w:name w:val="List Table 7 Colorful - Accent 6"/>
-    <w:basedOn w:val="665"/>
+    <w:basedOn w:val="893"/>
     <w:uiPriority w:val="99"/>
     <w:pPr>
       <w:pBdr/>
@@ -26142,11 +26135,11 @@
         <w:tblBorders/>
       </w:tblPr>
       <w:tcPr>
-        <w:shd w:color="ffffff"/>
+        <w:shd w:val="clear" w:color="ffffff"/>
         <w:tcBorders>
-          <w:top w:val="none"/>
-          <w:left w:val="none"/>
-          <w:bottom w:val="none"/>
+          <w:top w:val="none" w:color="000000" w:sz="4" w:space="0"/>
+          <w:left w:val="none" w:color="000000" w:sz="4" w:space="0"/>
+          <w:bottom w:val="none" w:color="000000" w:sz="4" w:space="0"/>
           <w:right w:val="single" w:color="000000" w:themeColor="accent6" w:themeTint="98" w:sz="4" w:space="0"/>
         </w:tcBorders>
       </w:tcPr>
@@ -26169,10 +26162,10 @@
       <w:tcPr>
         <w:shd w:val="clear" w:color="ffffff" w:themeColor="light1" w:fill="ffffff" w:themeFill="light1"/>
         <w:tcBorders>
-          <w:top w:val="none"/>
-          <w:left w:val="none"/>
+          <w:top w:val="none" w:color="000000" w:sz="4" w:space="0"/>
+          <w:left w:val="none" w:color="000000" w:sz="4" w:space="0"/>
           <w:bottom w:val="single" w:color="000000" w:themeColor="accent6" w:themeTint="98" w:sz="4" w:space="0"/>
-          <w:right w:val="none"/>
+          <w:right w:val="none" w:color="000000" w:sz="4" w:space="0"/>
         </w:tcBorders>
       </w:tcPr>
     </w:tblStylePr>
@@ -26192,12 +26185,12 @@
         <w:tblBorders/>
       </w:tblPr>
       <w:tcPr>
-        <w:shd w:color="ffffff"/>
+        <w:shd w:val="clear" w:color="ffffff"/>
         <w:tcBorders>
-          <w:top w:val="none"/>
+          <w:top w:val="none" w:color="000000" w:sz="4" w:space="0"/>
           <w:left w:val="single" w:color="000000" w:themeColor="accent6" w:themeTint="98" w:sz="4" w:space="0"/>
-          <w:bottom w:val="none"/>
-          <w:right w:val="none"/>
+          <w:bottom w:val="none" w:color="000000" w:sz="4" w:space="0"/>
+          <w:right w:val="none" w:color="000000" w:sz="4" w:space="0"/>
         </w:tcBorders>
       </w:tcPr>
     </w:tblStylePr>
@@ -26220,9 +26213,9 @@
         <w:shd w:val="clear" w:color="ffffff" w:themeColor="light1" w:fill="ffffff" w:themeFill="light1"/>
         <w:tcBorders>
           <w:top w:val="single" w:color="000000" w:themeColor="accent6" w:themeTint="98" w:sz="4" w:space="0"/>
-          <w:left w:val="none"/>
-          <w:bottom w:val="none"/>
-          <w:right w:val="none"/>
+          <w:left w:val="none" w:color="000000" w:sz="4" w:space="0"/>
+          <w:bottom w:val="none" w:color="000000" w:sz="4" w:space="0"/>
+          <w:right w:val="none" w:color="000000" w:sz="4" w:space="0"/>
         </w:tcBorders>
       </w:tcPr>
     </w:tblStylePr>
@@ -26297,9 +26290,9 @@
       </w:tcPr>
     </w:tblStylePr>
   </w:style>
-  <w:style w:type="table" w:styleId="116">
+  <w:style w:type="table" w:styleId="812">
     <w:name w:val="Lined - Accent"/>
-    <w:basedOn w:val="665"/>
+    <w:basedOn w:val="893"/>
     <w:uiPriority w:val="99"/>
     <w:pPr>
       <w:pBdr/>
@@ -26534,9 +26527,9 @@
       </w:tcPr>
     </w:tblStylePr>
   </w:style>
-  <w:style w:type="table" w:styleId="117">
+  <w:style w:type="table" w:styleId="813">
     <w:name w:val="Lined - Accent 1"/>
-    <w:basedOn w:val="665"/>
+    <w:basedOn w:val="893"/>
     <w:uiPriority w:val="99"/>
     <w:pPr>
       <w:pBdr/>
@@ -26771,9 +26764,9 @@
       </w:tcPr>
     </w:tblStylePr>
   </w:style>
-  <w:style w:type="table" w:styleId="118">
+  <w:style w:type="table" w:styleId="814">
     <w:name w:val="Lined - Accent 2"/>
-    <w:basedOn w:val="665"/>
+    <w:basedOn w:val="893"/>
     <w:uiPriority w:val="99"/>
     <w:pPr>
       <w:pBdr/>
@@ -27008,9 +27001,9 @@
       </w:tcPr>
     </w:tblStylePr>
   </w:style>
-  <w:style w:type="table" w:styleId="119">
+  <w:style w:type="table" w:styleId="815">
     <w:name w:val="Lined - Accent 3"/>
-    <w:basedOn w:val="665"/>
+    <w:basedOn w:val="893"/>
     <w:uiPriority w:val="99"/>
     <w:pPr>
       <w:pBdr/>
@@ -27245,9 +27238,9 @@
       </w:tcPr>
     </w:tblStylePr>
   </w:style>
-  <w:style w:type="table" w:styleId="120">
+  <w:style w:type="table" w:styleId="816">
     <w:name w:val="Lined - Accent 4"/>
-    <w:basedOn w:val="665"/>
+    <w:basedOn w:val="893"/>
     <w:uiPriority w:val="99"/>
     <w:pPr>
       <w:pBdr/>
@@ -27482,9 +27475,9 @@
       </w:tcPr>
     </w:tblStylePr>
   </w:style>
-  <w:style w:type="table" w:styleId="121">
+  <w:style w:type="table" w:styleId="817">
     <w:name w:val="Lined - Accent 5"/>
-    <w:basedOn w:val="665"/>
+    <w:basedOn w:val="893"/>
     <w:uiPriority w:val="99"/>
     <w:pPr>
       <w:pBdr/>
@@ -27719,9 +27712,9 @@
       </w:tcPr>
     </w:tblStylePr>
   </w:style>
-  <w:style w:type="table" w:styleId="122">
+  <w:style w:type="table" w:styleId="818">
     <w:name w:val="Lined - Accent 6"/>
-    <w:basedOn w:val="665"/>
+    <w:basedOn w:val="893"/>
     <w:uiPriority w:val="99"/>
     <w:pPr>
       <w:pBdr/>
@@ -27956,9 +27949,9 @@
       </w:tcPr>
     </w:tblStylePr>
   </w:style>
-  <w:style w:type="table" w:styleId="123">
+  <w:style w:type="table" w:styleId="819">
     <w:name w:val="Bordered &amp; Lined - Accent"/>
-    <w:basedOn w:val="665"/>
+    <w:basedOn w:val="893"/>
     <w:uiPriority w:val="99"/>
     <w:pPr>
       <w:pBdr/>
@@ -28200,9 +28193,9 @@
       </w:tcPr>
     </w:tblStylePr>
   </w:style>
-  <w:style w:type="table" w:styleId="124">
+  <w:style w:type="table" w:styleId="820">
     <w:name w:val="Bordered &amp; Lined - Accent 1"/>
-    <w:basedOn w:val="665"/>
+    <w:basedOn w:val="893"/>
     <w:uiPriority w:val="99"/>
     <w:pPr>
       <w:pBdr/>
@@ -28444,9 +28437,9 @@
       </w:tcPr>
     </w:tblStylePr>
   </w:style>
-  <w:style w:type="table" w:styleId="125">
+  <w:style w:type="table" w:styleId="821">
     <w:name w:val="Bordered &amp; Lined - Accent 2"/>
-    <w:basedOn w:val="665"/>
+    <w:basedOn w:val="893"/>
     <w:uiPriority w:val="99"/>
     <w:pPr>
       <w:pBdr/>
@@ -28688,9 +28681,9 @@
       </w:tcPr>
     </w:tblStylePr>
   </w:style>
-  <w:style w:type="table" w:styleId="126">
+  <w:style w:type="table" w:styleId="822">
     <w:name w:val="Bordered &amp; Lined - Accent 3"/>
-    <w:basedOn w:val="665"/>
+    <w:basedOn w:val="893"/>
     <w:uiPriority w:val="99"/>
     <w:pPr>
       <w:pBdr/>
@@ -28932,9 +28925,9 @@
       </w:tcPr>
     </w:tblStylePr>
   </w:style>
-  <w:style w:type="table" w:styleId="127">
+  <w:style w:type="table" w:styleId="823">
     <w:name w:val="Bordered &amp; Lined - Accent 4"/>
-    <w:basedOn w:val="665"/>
+    <w:basedOn w:val="893"/>
     <w:uiPriority w:val="99"/>
     <w:pPr>
       <w:pBdr/>
@@ -29176,9 +29169,9 @@
       </w:tcPr>
     </w:tblStylePr>
   </w:style>
-  <w:style w:type="table" w:styleId="128">
+  <w:style w:type="table" w:styleId="824">
     <w:name w:val="Bordered &amp; Lined - Accent 5"/>
-    <w:basedOn w:val="665"/>
+    <w:basedOn w:val="893"/>
     <w:uiPriority w:val="99"/>
     <w:pPr>
       <w:pBdr/>
@@ -29420,9 +29413,9 @@
       </w:tcPr>
     </w:tblStylePr>
   </w:style>
-  <w:style w:type="table" w:styleId="129">
+  <w:style w:type="table" w:styleId="825">
     <w:name w:val="Bordered &amp; Lined - Accent 6"/>
-    <w:basedOn w:val="665"/>
+    <w:basedOn w:val="893"/>
     <w:uiPriority w:val="99"/>
     <w:pPr>
       <w:pBdr/>
@@ -29664,9 +29657,9 @@
       </w:tcPr>
     </w:tblStylePr>
   </w:style>
-  <w:style w:type="table" w:styleId="130">
+  <w:style w:type="table" w:styleId="826">
     <w:name w:val="Bordered"/>
-    <w:basedOn w:val="665"/>
+    <w:basedOn w:val="893"/>
     <w:uiPriority w:val="99"/>
     <w:pPr>
       <w:pBdr/>
@@ -29895,9 +29888,9 @@
       </w:tcPr>
     </w:tblStylePr>
   </w:style>
-  <w:style w:type="table" w:styleId="131">
+  <w:style w:type="table" w:styleId="827">
     <w:name w:val="Bordered - Accent 1"/>
-    <w:basedOn w:val="665"/>
+    <w:basedOn w:val="893"/>
     <w:uiPriority w:val="99"/>
     <w:pPr>
       <w:pBdr/>
@@ -30126,9 +30119,9 @@
       </w:tcPr>
     </w:tblStylePr>
   </w:style>
-  <w:style w:type="table" w:styleId="132">
+  <w:style w:type="table" w:styleId="828">
     <w:name w:val="Bordered - Accent 2"/>
-    <w:basedOn w:val="665"/>
+    <w:basedOn w:val="893"/>
     <w:uiPriority w:val="99"/>
     <w:pPr>
       <w:pBdr/>
@@ -30357,9 +30350,9 @@
       </w:tcPr>
     </w:tblStylePr>
   </w:style>
-  <w:style w:type="table" w:styleId="133">
+  <w:style w:type="table" w:styleId="829">
     <w:name w:val="Bordered - Accent 3"/>
-    <w:basedOn w:val="665"/>
+    <w:basedOn w:val="893"/>
     <w:uiPriority w:val="99"/>
     <w:pPr>
       <w:pBdr/>
@@ -30588,9 +30581,9 @@
       </w:tcPr>
     </w:tblStylePr>
   </w:style>
-  <w:style w:type="table" w:styleId="134">
+  <w:style w:type="table" w:styleId="830">
     <w:name w:val="Bordered - Accent 4"/>
-    <w:basedOn w:val="665"/>
+    <w:basedOn w:val="893"/>
     <w:uiPriority w:val="99"/>
     <w:pPr>
       <w:pBdr/>
@@ -30819,9 +30812,9 @@
       </w:tcPr>
     </w:tblStylePr>
   </w:style>
-  <w:style w:type="table" w:styleId="135">
+  <w:style w:type="table" w:styleId="831">
     <w:name w:val="Bordered - Accent 5"/>
-    <w:basedOn w:val="665"/>
+    <w:basedOn w:val="893"/>
     <w:uiPriority w:val="99"/>
     <w:pPr>
       <w:pBdr/>
@@ -31050,9 +31043,9 @@
       </w:tcPr>
     </w:tblStylePr>
   </w:style>
-  <w:style w:type="table" w:styleId="136">
+  <w:style w:type="table" w:styleId="832">
     <w:name w:val="Bordered - Accent 6"/>
-    <w:basedOn w:val="665"/>
+    <w:basedOn w:val="893"/>
     <w:uiPriority w:val="99"/>
     <w:pPr>
       <w:pBdr/>
@@ -31281,11 +31274,11 @@
       </w:tcPr>
     </w:tblStylePr>
   </w:style>
-  <w:style w:type="paragraph" w:styleId="138">
+  <w:style w:type="paragraph" w:styleId="833">
     <w:name w:val="Heading 1"/>
-    <w:basedOn w:val="664"/>
-    <w:next w:val="664"/>
-    <w:link w:val="149"/>
+    <w:basedOn w:val="892"/>
+    <w:next w:val="892"/>
+    <w:link w:val="843"/>
     <w:uiPriority w:val="9"/>
     <w:qFormat/>
     <w:pPr>
@@ -31303,11 +31296,11 @@
       <w:szCs w:val="40"/>
     </w:rPr>
   </w:style>
-  <w:style w:type="paragraph" w:styleId="139">
+  <w:style w:type="paragraph" w:styleId="834">
     <w:name w:val="Heading 2"/>
-    <w:basedOn w:val="664"/>
-    <w:next w:val="664"/>
-    <w:link w:val="150"/>
+    <w:basedOn w:val="892"/>
+    <w:next w:val="892"/>
+    <w:link w:val="844"/>
     <w:uiPriority w:val="9"/>
     <w:unhideWhenUsed/>
     <w:qFormat/>
@@ -31326,11 +31319,11 @@
       <w:szCs w:val="32"/>
     </w:rPr>
   </w:style>
-  <w:style w:type="paragraph" w:styleId="140">
+  <w:style w:type="paragraph" w:styleId="835">
     <w:name w:val="Heading 3"/>
-    <w:basedOn w:val="664"/>
-    <w:next w:val="664"/>
-    <w:link w:val="151"/>
+    <w:basedOn w:val="892"/>
+    <w:next w:val="892"/>
+    <w:link w:val="845"/>
     <w:uiPriority w:val="9"/>
     <w:unhideWhenUsed/>
     <w:qFormat/>
@@ -31349,11 +31342,11 @@
       <w:szCs w:val="28"/>
     </w:rPr>
   </w:style>
-  <w:style w:type="paragraph" w:styleId="141">
+  <w:style w:type="paragraph" w:styleId="836">
     <w:name w:val="Heading 4"/>
-    <w:basedOn w:val="664"/>
-    <w:next w:val="664"/>
-    <w:link w:val="152"/>
+    <w:basedOn w:val="892"/>
+    <w:next w:val="892"/>
+    <w:link w:val="846"/>
     <w:uiPriority w:val="9"/>
     <w:unhideWhenUsed/>
     <w:qFormat/>
@@ -31372,11 +31365,11 @@
       <w:color w:val="0f4761" w:themeColor="accent1" w:themeShade="BF"/>
     </w:rPr>
   </w:style>
-  <w:style w:type="paragraph" w:styleId="142">
+  <w:style w:type="paragraph" w:styleId="837">
     <w:name w:val="Heading 5"/>
-    <w:basedOn w:val="664"/>
-    <w:next w:val="664"/>
-    <w:link w:val="153"/>
+    <w:basedOn w:val="892"/>
+    <w:next w:val="892"/>
+    <w:link w:val="847"/>
     <w:uiPriority w:val="9"/>
     <w:unhideWhenUsed/>
     <w:qFormat/>
@@ -31393,11 +31386,11 @@
       <w:color w:val="0f4761" w:themeColor="accent1" w:themeShade="BF"/>
     </w:rPr>
   </w:style>
-  <w:style w:type="paragraph" w:styleId="143">
+  <w:style w:type="paragraph" w:styleId="838">
     <w:name w:val="Heading 6"/>
-    <w:basedOn w:val="664"/>
-    <w:next w:val="664"/>
-    <w:link w:val="154"/>
+    <w:basedOn w:val="892"/>
+    <w:next w:val="892"/>
+    <w:link w:val="848"/>
     <w:uiPriority w:val="9"/>
     <w:unhideWhenUsed/>
     <w:qFormat/>
@@ -31416,11 +31409,11 @@
       <w:color w:val="595959" w:themeColor="text1" w:themeTint="A6"/>
     </w:rPr>
   </w:style>
-  <w:style w:type="paragraph" w:styleId="144">
+  <w:style w:type="paragraph" w:styleId="839">
     <w:name w:val="Heading 7"/>
-    <w:basedOn w:val="664"/>
-    <w:next w:val="664"/>
-    <w:link w:val="155"/>
+    <w:basedOn w:val="892"/>
+    <w:next w:val="892"/>
+    <w:link w:val="849"/>
     <w:uiPriority w:val="9"/>
     <w:unhideWhenUsed/>
     <w:qFormat/>
@@ -31437,11 +31430,11 @@
       <w:color w:val="595959" w:themeColor="text1" w:themeTint="A6"/>
     </w:rPr>
   </w:style>
-  <w:style w:type="paragraph" w:styleId="145">
+  <w:style w:type="paragraph" w:styleId="840">
     <w:name w:val="Heading 8"/>
-    <w:basedOn w:val="664"/>
-    <w:next w:val="664"/>
-    <w:link w:val="156"/>
+    <w:basedOn w:val="892"/>
+    <w:next w:val="892"/>
+    <w:link w:val="850"/>
     <w:uiPriority w:val="9"/>
     <w:unhideWhenUsed/>
     <w:qFormat/>
@@ -31460,11 +31453,11 @@
       <w:color w:val="272727" w:themeColor="text1" w:themeTint="D8"/>
     </w:rPr>
   </w:style>
-  <w:style w:type="paragraph" w:styleId="146">
+  <w:style w:type="paragraph" w:styleId="841">
     <w:name w:val="Heading 9"/>
-    <w:basedOn w:val="664"/>
-    <w:next w:val="664"/>
-    <w:link w:val="157"/>
+    <w:basedOn w:val="892"/>
+    <w:next w:val="892"/>
+    <w:link w:val="851"/>
     <w:uiPriority w:val="9"/>
     <w:unhideWhenUsed/>
     <w:qFormat/>
@@ -31483,7 +31476,7 @@
       <w:color w:val="272727" w:themeColor="text1" w:themeTint="D8"/>
     </w:rPr>
   </w:style>
-  <w:style w:type="character" w:styleId="147" w:default="1">
+  <w:style w:type="character" w:styleId="842" w:default="1">
     <w:name w:val="Default Paragraph Font"/>
     <w:uiPriority w:val="1"/>
     <w:semiHidden/>
@@ -31494,10 +31487,10 @@
       <w:ind/>
     </w:pPr>
   </w:style>
-  <w:style w:type="character" w:styleId="149">
+  <w:style w:type="character" w:styleId="843">
     <w:name w:val="Heading 1 Char"/>
-    <w:basedOn w:val="147"/>
-    <w:link w:val="138"/>
+    <w:basedOn w:val="842"/>
+    <w:link w:val="833"/>
     <w:uiPriority w:val="9"/>
     <w:pPr>
       <w:pBdr/>
@@ -31511,10 +31504,10 @@
       <w:szCs w:val="40"/>
     </w:rPr>
   </w:style>
-  <w:style w:type="character" w:styleId="150">
+  <w:style w:type="character" w:styleId="844">
     <w:name w:val="Heading 2 Char"/>
-    <w:basedOn w:val="147"/>
-    <w:link w:val="139"/>
+    <w:basedOn w:val="842"/>
+    <w:link w:val="834"/>
     <w:uiPriority w:val="9"/>
     <w:pPr>
       <w:pBdr/>
@@ -31528,10 +31521,10 @@
       <w:szCs w:val="32"/>
     </w:rPr>
   </w:style>
-  <w:style w:type="character" w:styleId="151">
+  <w:style w:type="character" w:styleId="845">
     <w:name w:val="Heading 3 Char"/>
-    <w:basedOn w:val="147"/>
-    <w:link w:val="140"/>
+    <w:basedOn w:val="842"/>
+    <w:link w:val="835"/>
     <w:uiPriority w:val="9"/>
     <w:pPr>
       <w:pBdr/>
@@ -31545,10 +31538,10 @@
       <w:szCs w:val="28"/>
     </w:rPr>
   </w:style>
-  <w:style w:type="character" w:styleId="152">
+  <w:style w:type="character" w:styleId="846">
     <w:name w:val="Heading 4 Char"/>
-    <w:basedOn w:val="147"/>
-    <w:link w:val="141"/>
+    <w:basedOn w:val="842"/>
+    <w:link w:val="836"/>
     <w:uiPriority w:val="9"/>
     <w:pPr>
       <w:pBdr/>
@@ -31562,10 +31555,10 @@
       <w:color w:val="0f4761" w:themeColor="accent1" w:themeShade="BF"/>
     </w:rPr>
   </w:style>
-  <w:style w:type="character" w:styleId="153">
+  <w:style w:type="character" w:styleId="847">
     <w:name w:val="Heading 5 Char"/>
-    <w:basedOn w:val="147"/>
-    <w:link w:val="142"/>
+    <w:basedOn w:val="842"/>
+    <w:link w:val="837"/>
     <w:uiPriority w:val="9"/>
     <w:pPr>
       <w:pBdr/>
@@ -31577,10 +31570,10 @@
       <w:color w:val="0f4761" w:themeColor="accent1" w:themeShade="BF"/>
     </w:rPr>
   </w:style>
-  <w:style w:type="character" w:styleId="154">
+  <w:style w:type="character" w:styleId="848">
     <w:name w:val="Heading 6 Char"/>
-    <w:basedOn w:val="147"/>
-    <w:link w:val="143"/>
+    <w:basedOn w:val="842"/>
+    <w:link w:val="838"/>
     <w:uiPriority w:val="9"/>
     <w:pPr>
       <w:pBdr/>
@@ -31594,10 +31587,10 @@
       <w:color w:val="595959" w:themeColor="text1" w:themeTint="A6"/>
     </w:rPr>
   </w:style>
-  <w:style w:type="character" w:styleId="155">
+  <w:style w:type="character" w:styleId="849">
     <w:name w:val="Heading 7 Char"/>
-    <w:basedOn w:val="147"/>
-    <w:link w:val="144"/>
+    <w:basedOn w:val="842"/>
+    <w:link w:val="839"/>
     <w:uiPriority w:val="9"/>
     <w:pPr>
       <w:pBdr/>
@@ -31609,10 +31602,10 @@
       <w:color w:val="595959" w:themeColor="text1" w:themeTint="A6"/>
     </w:rPr>
   </w:style>
-  <w:style w:type="character" w:styleId="156">
+  <w:style w:type="character" w:styleId="850">
     <w:name w:val="Heading 8 Char"/>
-    <w:basedOn w:val="147"/>
-    <w:link w:val="145"/>
+    <w:basedOn w:val="842"/>
+    <w:link w:val="840"/>
     <w:uiPriority w:val="9"/>
     <w:pPr>
       <w:pBdr/>
@@ -31626,10 +31619,10 @@
       <w:color w:val="272727" w:themeColor="text1" w:themeTint="D8"/>
     </w:rPr>
   </w:style>
-  <w:style w:type="character" w:styleId="157">
+  <w:style w:type="character" w:styleId="851">
     <w:name w:val="Heading 9 Char"/>
-    <w:basedOn w:val="147"/>
-    <w:link w:val="146"/>
+    <w:basedOn w:val="842"/>
+    <w:link w:val="841"/>
     <w:uiPriority w:val="9"/>
     <w:pPr>
       <w:pBdr/>
@@ -31643,11 +31636,11 @@
       <w:color w:val="272727" w:themeColor="text1" w:themeTint="D8"/>
     </w:rPr>
   </w:style>
-  <w:style w:type="paragraph" w:styleId="158">
+  <w:style w:type="paragraph" w:styleId="852">
     <w:name w:val="Title"/>
-    <w:basedOn w:val="664"/>
-    <w:next w:val="664"/>
-    <w:link w:val="159"/>
+    <w:basedOn w:val="892"/>
+    <w:next w:val="892"/>
+    <w:link w:val="853"/>
     <w:uiPriority w:val="10"/>
     <w:qFormat/>
     <w:pPr>
@@ -31663,10 +31656,10 @@
       <w:szCs w:val="56"/>
     </w:rPr>
   </w:style>
-  <w:style w:type="character" w:styleId="159">
+  <w:style w:type="character" w:styleId="853">
     <w:name w:val="Title Char"/>
-    <w:basedOn w:val="147"/>
-    <w:link w:val="158"/>
+    <w:basedOn w:val="842"/>
+    <w:link w:val="852"/>
     <w:uiPriority w:val="10"/>
     <w:pPr>
       <w:pBdr/>
@@ -31680,11 +31673,11 @@
       <w:szCs w:val="56"/>
     </w:rPr>
   </w:style>
-  <w:style w:type="paragraph" w:styleId="160">
+  <w:style w:type="paragraph" w:styleId="854">
     <w:name w:val="Subtitle"/>
-    <w:basedOn w:val="664"/>
-    <w:next w:val="664"/>
-    <w:link w:val="161"/>
+    <w:basedOn w:val="892"/>
+    <w:next w:val="892"/>
+    <w:link w:val="855"/>
     <w:uiPriority w:val="11"/>
     <w:qFormat/>
     <w:pPr>
@@ -31702,10 +31695,10 @@
       <w:szCs w:val="28"/>
     </w:rPr>
   </w:style>
-  <w:style w:type="character" w:styleId="161">
+  <w:style w:type="character" w:styleId="855">
     <w:name w:val="Subtitle Char"/>
-    <w:basedOn w:val="147"/>
-    <w:link w:val="160"/>
+    <w:basedOn w:val="842"/>
+    <w:link w:val="854"/>
     <w:uiPriority w:val="11"/>
     <w:pPr>
       <w:pBdr/>
@@ -31719,11 +31712,11 @@
       <w:szCs w:val="28"/>
     </w:rPr>
   </w:style>
-  <w:style w:type="paragraph" w:styleId="162">
+  <w:style w:type="paragraph" w:styleId="856">
     <w:name w:val="Quote"/>
-    <w:basedOn w:val="664"/>
-    <w:next w:val="664"/>
-    <w:link w:val="163"/>
+    <w:basedOn w:val="892"/>
+    <w:next w:val="892"/>
+    <w:link w:val="857"/>
     <w:uiPriority w:val="29"/>
     <w:qFormat/>
     <w:pPr>
@@ -31738,10 +31731,10 @@
       <w:color w:val="404040" w:themeColor="text1" w:themeTint="BF"/>
     </w:rPr>
   </w:style>
-  <w:style w:type="character" w:styleId="163">
+  <w:style w:type="character" w:styleId="857">
     <w:name w:val="Quote Char"/>
-    <w:basedOn w:val="147"/>
-    <w:link w:val="162"/>
+    <w:basedOn w:val="842"/>
+    <w:link w:val="856"/>
     <w:uiPriority w:val="29"/>
     <w:pPr>
       <w:pBdr/>
@@ -31754,9 +31747,9 @@
       <w:color w:val="404040" w:themeColor="text1" w:themeTint="BF"/>
     </w:rPr>
   </w:style>
-  <w:style w:type="character" w:styleId="165">
+  <w:style w:type="character" w:styleId="858">
     <w:name w:val="Intense Emphasis"/>
-    <w:basedOn w:val="147"/>
+    <w:basedOn w:val="842"/>
     <w:uiPriority w:val="21"/>
     <w:qFormat/>
     <w:pPr>
@@ -31770,11 +31763,11 @@
       <w:color w:val="0f4761" w:themeColor="accent1" w:themeShade="BF"/>
     </w:rPr>
   </w:style>
-  <w:style w:type="paragraph" w:styleId="166">
+  <w:style w:type="paragraph" w:styleId="859">
     <w:name w:val="Intense Quote"/>
-    <w:basedOn w:val="664"/>
-    <w:next w:val="664"/>
-    <w:link w:val="167"/>
+    <w:basedOn w:val="892"/>
+    <w:next w:val="892"/>
+    <w:link w:val="860"/>
     <w:uiPriority w:val="30"/>
     <w:qFormat/>
     <w:pPr>
@@ -31792,10 +31785,10 @@
       <w:color w:val="0f4761" w:themeColor="accent1" w:themeShade="BF"/>
     </w:rPr>
   </w:style>
-  <w:style w:type="character" w:styleId="167">
+  <w:style w:type="character" w:styleId="860">
     <w:name w:val="Intense Quote Char"/>
-    <w:basedOn w:val="147"/>
-    <w:link w:val="166"/>
+    <w:basedOn w:val="842"/>
+    <w:link w:val="859"/>
     <w:uiPriority w:val="30"/>
     <w:pPr>
       <w:pBdr/>
@@ -31808,9 +31801,9 @@
       <w:color w:val="0f4761" w:themeColor="accent1" w:themeShade="BF"/>
     </w:rPr>
   </w:style>
-  <w:style w:type="character" w:styleId="168">
+  <w:style w:type="character" w:styleId="861">
     <w:name w:val="Intense Reference"/>
-    <w:basedOn w:val="147"/>
+    <w:basedOn w:val="842"/>
     <w:uiPriority w:val="32"/>
     <w:qFormat/>
     <w:pPr>
@@ -31826,9 +31819,9 @@
       <w:spacing w:val="5"/>
     </w:rPr>
   </w:style>
-  <w:style w:type="character" w:styleId="170">
+  <w:style w:type="character" w:styleId="862">
     <w:name w:val="Subtle Emphasis"/>
-    <w:basedOn w:val="147"/>
+    <w:basedOn w:val="842"/>
     <w:uiPriority w:val="19"/>
     <w:qFormat/>
     <w:pPr>
@@ -31842,9 +31835,9 @@
       <w:color w:val="404040" w:themeColor="text1" w:themeTint="BF"/>
     </w:rPr>
   </w:style>
-  <w:style w:type="character" w:styleId="171">
+  <w:style w:type="character" w:styleId="863">
     <w:name w:val="Emphasis"/>
-    <w:basedOn w:val="147"/>
+    <w:basedOn w:val="842"/>
     <w:uiPriority w:val="20"/>
     <w:qFormat/>
     <w:pPr>
@@ -31857,9 +31850,9 @@
       <w:iCs/>
     </w:rPr>
   </w:style>
-  <w:style w:type="character" w:styleId="172">
+  <w:style w:type="character" w:styleId="864">
     <w:name w:val="Strong"/>
-    <w:basedOn w:val="147"/>
+    <w:basedOn w:val="842"/>
     <w:uiPriority w:val="22"/>
     <w:qFormat/>
     <w:pPr>
@@ -31872,9 +31865,9 @@
       <w:bCs/>
     </w:rPr>
   </w:style>
-  <w:style w:type="character" w:styleId="173">
+  <w:style w:type="character" w:styleId="865">
     <w:name w:val="Subtle Reference"/>
-    <w:basedOn w:val="147"/>
+    <w:basedOn w:val="842"/>
     <w:uiPriority w:val="31"/>
     <w:qFormat/>
     <w:pPr>
@@ -31887,9 +31880,9 @@
       <w:color w:val="5a5a5a" w:themeColor="text1" w:themeTint="A5"/>
     </w:rPr>
   </w:style>
-  <w:style w:type="character" w:styleId="174">
+  <w:style w:type="character" w:styleId="866">
     <w:name w:val="Book Title"/>
-    <w:basedOn w:val="147"/>
+    <w:basedOn w:val="842"/>
     <w:uiPriority w:val="33"/>
     <w:qFormat/>
     <w:pPr>
@@ -31905,10 +31898,10 @@
       <w:spacing w:val="5"/>
     </w:rPr>
   </w:style>
-  <w:style w:type="paragraph" w:styleId="175">
+  <w:style w:type="paragraph" w:styleId="867">
     <w:name w:val="Header"/>
-    <w:basedOn w:val="664"/>
-    <w:link w:val="176"/>
+    <w:basedOn w:val="892"/>
+    <w:link w:val="868"/>
     <w:uiPriority w:val="99"/>
     <w:unhideWhenUsed/>
     <w:pPr>
@@ -31921,10 +31914,10 @@
       <w:ind/>
     </w:pPr>
   </w:style>
-  <w:style w:type="character" w:styleId="176">
+  <w:style w:type="character" w:styleId="868">
     <w:name w:val="Header Char"/>
-    <w:basedOn w:val="147"/>
-    <w:link w:val="175"/>
+    <w:basedOn w:val="842"/>
+    <w:link w:val="867"/>
     <w:uiPriority w:val="99"/>
     <w:pPr>
       <w:pBdr/>
@@ -31932,10 +31925,10 @@
       <w:ind/>
     </w:pPr>
   </w:style>
-  <w:style w:type="paragraph" w:styleId="177">
+  <w:style w:type="paragraph" w:styleId="869">
     <w:name w:val="Footer"/>
-    <w:basedOn w:val="664"/>
-    <w:link w:val="178"/>
+    <w:basedOn w:val="892"/>
+    <w:link w:val="870"/>
     <w:uiPriority w:val="99"/>
     <w:unhideWhenUsed/>
     <w:pPr>
@@ -31948,10 +31941,10 @@
       <w:ind/>
     </w:pPr>
   </w:style>
-  <w:style w:type="character" w:styleId="178">
+  <w:style w:type="character" w:styleId="870">
     <w:name w:val="Footer Char"/>
-    <w:basedOn w:val="147"/>
-    <w:link w:val="177"/>
+    <w:basedOn w:val="842"/>
+    <w:link w:val="869"/>
     <w:uiPriority w:val="99"/>
     <w:pPr>
       <w:pBdr/>
@@ -31959,10 +31952,10 @@
       <w:ind/>
     </w:pPr>
   </w:style>
-  <w:style w:type="paragraph" w:styleId="179">
+  <w:style w:type="paragraph" w:styleId="871">
     <w:name w:val="Caption"/>
-    <w:basedOn w:val="664"/>
-    <w:next w:val="664"/>
+    <w:basedOn w:val="892"/>
+    <w:next w:val="892"/>
     <w:uiPriority w:val="35"/>
     <w:unhideWhenUsed/>
     <w:qFormat/>
@@ -31979,10 +31972,10 @@
       <w:szCs w:val="18"/>
     </w:rPr>
   </w:style>
-  <w:style w:type="paragraph" w:styleId="180">
+  <w:style w:type="paragraph" w:styleId="872">
     <w:name w:val="footnote text"/>
-    <w:basedOn w:val="664"/>
-    <w:link w:val="181"/>
+    <w:basedOn w:val="892"/>
+    <w:link w:val="873"/>
     <w:uiPriority w:val="99"/>
     <w:semiHidden/>
     <w:unhideWhenUsed/>
@@ -31996,10 +31989,10 @@
       <w:szCs w:val="20"/>
     </w:rPr>
   </w:style>
-  <w:style w:type="character" w:styleId="181">
+  <w:style w:type="character" w:styleId="873">
     <w:name w:val="Footnote Text Char"/>
-    <w:basedOn w:val="147"/>
-    <w:link w:val="180"/>
+    <w:basedOn w:val="842"/>
+    <w:link w:val="872"/>
     <w:uiPriority w:val="99"/>
     <w:semiHidden/>
     <w:pPr>
@@ -32012,9 +32005,9 @@
       <w:szCs w:val="20"/>
     </w:rPr>
   </w:style>
-  <w:style w:type="character" w:styleId="182">
+  <w:style w:type="character" w:styleId="874">
     <w:name w:val="footnote reference"/>
-    <w:basedOn w:val="147"/>
+    <w:basedOn w:val="842"/>
     <w:uiPriority w:val="99"/>
     <w:semiHidden/>
     <w:unhideWhenUsed/>
@@ -32027,10 +32020,10 @@
       <w:vertAlign w:val="superscript"/>
     </w:rPr>
   </w:style>
-  <w:style w:type="paragraph" w:styleId="183">
+  <w:style w:type="paragraph" w:styleId="875">
     <w:name w:val="endnote text"/>
-    <w:basedOn w:val="664"/>
-    <w:link w:val="184"/>
+    <w:basedOn w:val="892"/>
+    <w:link w:val="876"/>
     <w:uiPriority w:val="99"/>
     <w:semiHidden/>
     <w:unhideWhenUsed/>
@@ -32044,10 +32037,10 @@
       <w:szCs w:val="20"/>
     </w:rPr>
   </w:style>
-  <w:style w:type="character" w:styleId="184">
+  <w:style w:type="character" w:styleId="876">
     <w:name w:val="Endnote Text Char"/>
-    <w:basedOn w:val="147"/>
-    <w:link w:val="183"/>
+    <w:basedOn w:val="842"/>
+    <w:link w:val="875"/>
     <w:uiPriority w:val="99"/>
     <w:semiHidden/>
     <w:pPr>
@@ -32060,9 +32053,9 @@
       <w:szCs w:val="20"/>
     </w:rPr>
   </w:style>
-  <w:style w:type="character" w:styleId="185">
+  <w:style w:type="character" w:styleId="877">
     <w:name w:val="endnote reference"/>
-    <w:basedOn w:val="147"/>
+    <w:basedOn w:val="842"/>
     <w:uiPriority w:val="99"/>
     <w:semiHidden/>
     <w:unhideWhenUsed/>
@@ -32075,9 +32068,9 @@
       <w:vertAlign w:val="superscript"/>
     </w:rPr>
   </w:style>
-  <w:style w:type="character" w:styleId="186">
+  <w:style w:type="character" w:styleId="878">
     <w:name w:val="Hyperlink"/>
-    <w:basedOn w:val="147"/>
+    <w:basedOn w:val="842"/>
     <w:uiPriority w:val="99"/>
     <w:unhideWhenUsed/>
     <w:pPr>
@@ -32090,9 +32083,9 @@
       <w:u w:val="single"/>
     </w:rPr>
   </w:style>
-  <w:style w:type="character" w:styleId="187">
+  <w:style w:type="character" w:styleId="879">
     <w:name w:val="FollowedHyperlink"/>
-    <w:basedOn w:val="147"/>
+    <w:basedOn w:val="842"/>
     <w:uiPriority w:val="99"/>
     <w:semiHidden/>
     <w:unhideWhenUsed/>
@@ -32106,10 +32099,10 @@
       <w:u w:val="single"/>
     </w:rPr>
   </w:style>
-  <w:style w:type="paragraph" w:styleId="188">
+  <w:style w:type="paragraph" w:styleId="880">
     <w:name w:val="toc 1"/>
-    <w:basedOn w:val="664"/>
-    <w:next w:val="664"/>
+    <w:basedOn w:val="892"/>
+    <w:next w:val="892"/>
     <w:uiPriority w:val="39"/>
     <w:unhideWhenUsed/>
     <w:pPr>
@@ -32118,10 +32111,10 @@
       <w:ind/>
     </w:pPr>
   </w:style>
-  <w:style w:type="paragraph" w:styleId="189">
+  <w:style w:type="paragraph" w:styleId="881">
     <w:name w:val="toc 2"/>
-    <w:basedOn w:val="664"/>
-    <w:next w:val="664"/>
+    <w:basedOn w:val="892"/>
+    <w:next w:val="892"/>
     <w:uiPriority w:val="39"/>
     <w:unhideWhenUsed/>
     <w:pPr>
@@ -32130,10 +32123,10 @@
       <w:ind w:left="220"/>
     </w:pPr>
   </w:style>
-  <w:style w:type="paragraph" w:styleId="190">
+  <w:style w:type="paragraph" w:styleId="882">
     <w:name w:val="toc 3"/>
-    <w:basedOn w:val="664"/>
-    <w:next w:val="664"/>
+    <w:basedOn w:val="892"/>
+    <w:next w:val="892"/>
     <w:uiPriority w:val="39"/>
     <w:unhideWhenUsed/>
     <w:pPr>
@@ -32142,10 +32135,10 @@
       <w:ind w:left="440"/>
     </w:pPr>
   </w:style>
-  <w:style w:type="paragraph" w:styleId="191">
+  <w:style w:type="paragraph" w:styleId="883">
     <w:name w:val="toc 4"/>
-    <w:basedOn w:val="664"/>
-    <w:next w:val="664"/>
+    <w:basedOn w:val="892"/>
+    <w:next w:val="892"/>
     <w:uiPriority w:val="39"/>
     <w:unhideWhenUsed/>
     <w:pPr>
@@ -32154,10 +32147,10 @@
       <w:ind w:left="660"/>
     </w:pPr>
   </w:style>
-  <w:style w:type="paragraph" w:styleId="192">
+  <w:style w:type="paragraph" w:styleId="884">
     <w:name w:val="toc 5"/>
-    <w:basedOn w:val="664"/>
-    <w:next w:val="664"/>
+    <w:basedOn w:val="892"/>
+    <w:next w:val="892"/>
     <w:uiPriority w:val="39"/>
     <w:unhideWhenUsed/>
     <w:pPr>
@@ -32166,10 +32159,10 @@
       <w:ind w:left="880"/>
     </w:pPr>
   </w:style>
-  <w:style w:type="paragraph" w:styleId="193">
+  <w:style w:type="paragraph" w:styleId="885">
     <w:name w:val="toc 6"/>
-    <w:basedOn w:val="664"/>
-    <w:next w:val="664"/>
+    <w:basedOn w:val="892"/>
+    <w:next w:val="892"/>
     <w:uiPriority w:val="39"/>
     <w:unhideWhenUsed/>
     <w:pPr>
@@ -32178,10 +32171,10 @@
       <w:ind w:left="1100"/>
     </w:pPr>
   </w:style>
-  <w:style w:type="paragraph" w:styleId="194">
+  <w:style w:type="paragraph" w:styleId="886">
     <w:name w:val="toc 7"/>
-    <w:basedOn w:val="664"/>
-    <w:next w:val="664"/>
+    <w:basedOn w:val="892"/>
+    <w:next w:val="892"/>
     <w:uiPriority w:val="39"/>
     <w:unhideWhenUsed/>
     <w:pPr>
@@ -32190,10 +32183,10 @@
       <w:ind w:left="1320"/>
     </w:pPr>
   </w:style>
-  <w:style w:type="paragraph" w:styleId="195">
+  <w:style w:type="paragraph" w:styleId="887">
     <w:name w:val="toc 8"/>
-    <w:basedOn w:val="664"/>
-    <w:next w:val="664"/>
+    <w:basedOn w:val="892"/>
+    <w:next w:val="892"/>
     <w:uiPriority w:val="39"/>
     <w:unhideWhenUsed/>
     <w:pPr>
@@ -32202,10 +32195,10 @@
       <w:ind w:left="1540"/>
     </w:pPr>
   </w:style>
-  <w:style w:type="paragraph" w:styleId="196">
+  <w:style w:type="paragraph" w:styleId="888">
     <w:name w:val="toc 9"/>
-    <w:basedOn w:val="664"/>
-    <w:next w:val="664"/>
+    <w:basedOn w:val="892"/>
+    <w:next w:val="892"/>
     <w:uiPriority w:val="39"/>
     <w:unhideWhenUsed/>
     <w:pPr>
@@ -32214,9 +32207,9 @@
       <w:ind w:left="1760"/>
     </w:pPr>
   </w:style>
-  <w:style w:type="character" w:styleId="197">
+  <w:style w:type="character" w:styleId="889">
     <w:name w:val="Placeholder Text"/>
-    <w:basedOn w:val="147"/>
+    <w:basedOn w:val="842"/>
     <w:uiPriority w:val="99"/>
     <w:semiHidden/>
     <w:pPr>
@@ -32228,7 +32221,7 @@
       <w:color w:val="666666"/>
     </w:rPr>
   </w:style>
-  <w:style w:type="paragraph" w:styleId="207">
+  <w:style w:type="paragraph" w:styleId="890">
     <w:name w:val="TOC Heading"/>
     <w:uiPriority w:val="39"/>
     <w:unhideWhenUsed/>
@@ -32238,10 +32231,10 @@
       <w:ind/>
     </w:pPr>
   </w:style>
-  <w:style w:type="paragraph" w:styleId="208">
+  <w:style w:type="paragraph" w:styleId="891">
     <w:name w:val="table of figures"/>
-    <w:basedOn w:val="664"/>
-    <w:next w:val="664"/>
+    <w:basedOn w:val="892"/>
+    <w:next w:val="892"/>
     <w:uiPriority w:val="99"/>
     <w:unhideWhenUsed/>
     <w:pPr>
@@ -32250,7 +32243,7 @@
       <w:ind/>
     </w:pPr>
   </w:style>
-  <w:style w:type="paragraph" w:styleId="664" w:default="1">
+  <w:style w:type="paragraph" w:styleId="892" w:default="1">
     <w:name w:val="Normal"/>
     <w:qFormat/>
     <w:pPr>
@@ -32259,7 +32252,7 @@
       <w:ind/>
     </w:pPr>
   </w:style>
-  <w:style w:type="table" w:styleId="665" w:default="1">
+  <w:style w:type="table" w:styleId="893" w:default="1">
     <w:name w:val="Normal Table"/>
     <w:uiPriority w:val="99"/>
     <w:semiHidden/>
@@ -32452,7 +32445,7 @@
       </w:tcPr>
     </w:tblStylePr>
   </w:style>
-  <w:style w:type="numbering" w:styleId="666" w:default="1">
+  <w:style w:type="numbering" w:styleId="894" w:default="1">
     <w:name w:val="No List"/>
     <w:uiPriority w:val="99"/>
     <w:semiHidden/>
@@ -32463,9 +32456,9 @@
       <w:ind/>
     </w:pPr>
   </w:style>
-  <w:style w:type="paragraph" w:styleId="667">
+  <w:style w:type="paragraph" w:styleId="895">
     <w:name w:val="No Spacing"/>
-    <w:basedOn w:val="664"/>
+    <w:basedOn w:val="892"/>
     <w:uiPriority w:val="1"/>
     <w:qFormat/>
     <w:pPr>
@@ -32474,9 +32467,9 @@
       <w:ind/>
     </w:pPr>
   </w:style>
-  <w:style w:type="paragraph" w:styleId="668">
+  <w:style w:type="paragraph" w:styleId="896">
     <w:name w:val="List Paragraph"/>
-    <w:basedOn w:val="664"/>
+    <w:basedOn w:val="892"/>
     <w:uiPriority w:val="34"/>
     <w:qFormat/>
     <w:pPr>

</xml_diff>

<commit_message>
^Fix soft-soft-col: Live circumsphere in broad phase, + broad phase
</commit_message>
<xml_diff>
--- a/Assets/Soft_Tricks.docx
+++ b/Assets/Soft_Tricks.docx
@@ -22,7 +22,7 @@
           <w:color w:val="000000"/>
           <w:sz w:val="36"/>
         </w:rPr>
-        <w:t xml:space="preserve">The correct workflow</w:t>
+        <w:t xml:space="preserve">correct workflow</w:t>
       </w:r>
       <w:r/>
     </w:p>
@@ -197,10 +197,8 @@
       <w:r>
         <w:rPr>
           <w:rFonts w:ascii="Times New Roman" w:hAnsi="Times New Roman" w:eastAsia="Times New Roman" w:cs="Times New Roman"/>
-          <w:b/>
-          <w:color w:val="000000"/>
           <w:sz w:val="24"/>
-          <w:highlight w:val="none"/>
+          <w:szCs w:val="24"/>
         </w:rPr>
       </w:r>
       <w:r>
@@ -239,6 +237,17 @@
           <w:sz w:val="24"/>
         </w:rPr>
         <w:t xml:space="preserve">Crystal clear.</w:t>
+      </w:r>
+      <w:r>
+        <w:rPr>
+          <w:rFonts w:ascii="Times New Roman" w:hAnsi="Times New Roman" w:eastAsia="Times New Roman" w:cs="Times New Roman"/>
+          <w:b/>
+          <w:bCs/>
+          <w:color w:val="000000"/>
+          <w:sz w:val="24"/>
+          <w:szCs w:val="24"/>
+          <w:highlight w:val="none"/>
+        </w:rPr>
       </w:r>
       <w:r>
         <w:rPr>
@@ -1115,7 +1124,9 @@
         <w:pBdr/>
         <w:spacing/>
         <w:ind/>
-        <w:rPr/>
+        <w:rPr>
+          <w:highlight w:val="none"/>
+        </w:rPr>
       </w:pPr>
       <w:r>
         <mc:AlternateContent>
@@ -1187,6 +1198,603 @@
         </mc:AlternateContent>
       </w:r>
       <w:r/>
+    </w:p>
+    <w:p>
+      <w:pPr>
+        <w:pStyle w:val="834"/>
+        <w:pBdr/>
+        <w:spacing/>
+        <w:ind/>
+        <w:rPr/>
+      </w:pPr>
+      <w:r>
+        <w:rPr>
+          <w:rFonts w:ascii="Times New Roman" w:hAnsi="Times New Roman" w:eastAsia="Times New Roman" w:cs="Times New Roman"/>
+          <w:b/>
+          <w:color w:val="000000"/>
+          <w:sz w:val="24"/>
+          <w:highlight w:val="none"/>
+          <w:lang w:val="zh-CN"/>
+        </w:rPr>
+        <w:t xml:space="preserve">Claude For Xpbd Soft</w:t>
+      </w:r>
+      <w:r/>
+      <w:r/>
+    </w:p>
+    <w:p>
+      <w:pPr>
+        <w:pBdr/>
+        <w:spacing/>
+        <w:ind/>
+        <w:rPr>
+          <w:highlight w:val="none"/>
+        </w:rPr>
+      </w:pPr>
+      <w:r>
+        <w:rPr>
+          <w:lang w:val="zh-CN"/>
+        </w:rPr>
+        <w:t xml:space="preserve">Q : </w:t>
+      </w:r>
+      <w:r>
+        <w:rPr>
+          <w:rFonts w:ascii="Arial" w:hAnsi="Arial" w:eastAsia="Arial" w:cs="Arial"/>
+          <w:b/>
+          <w:color w:val="141413"/>
+          <w:sz w:val="24"/>
+          <w:highlight w:val="none"/>
+        </w:rPr>
+        <w:t xml:space="preserve">could u desc the soft-soft- collision principle for me ? is bodyA all particles vs bodyB All particles check dist by the radius (default : SoftSoftDefaultRadius) ? is already take account for the particle to pass-through face case in low-resolution case &lt;E</w:t>
+      </w:r>
+      <w:r>
+        <w:rPr>
+          <w:rFonts w:ascii="Arial" w:hAnsi="Arial" w:eastAsia="Arial" w:cs="Arial"/>
+          <w:b/>
+          <w:color w:val="141413"/>
+          <w:sz w:val="24"/>
+          <w:highlight w:val="none"/>
+        </w:rPr>
+        <w:t xml:space="preserve">ven the particle to particle is still relative too far&gt;?  it more good do bound-phase like u mentioned AABB or circums-sphere? </w:t>
+      </w:r>
+      <w:r>
+        <w:rPr>
+          <w:rFonts w:ascii="Arial" w:hAnsi="Arial" w:eastAsia="Arial" w:cs="Arial"/>
+          <w:b/>
+          <w:color w:val="8a2424"/>
+          <w:sz w:val="22"/>
+          <w:highlight w:val="none"/>
+        </w:rPr>
+        <w:t xml:space="preserve">BoundingRadius is similar to </w:t>
+      </w:r>
+      <w:r>
+        <w:rPr>
+          <w:rFonts w:ascii="Arial" w:hAnsi="Arial" w:eastAsia="Arial" w:cs="Arial"/>
+          <w:b/>
+          <w:color w:val="141413"/>
+          <w:sz w:val="24"/>
+          <w:highlight w:val="none"/>
+        </w:rPr>
+        <w:t xml:space="preserve"> circums-sphere means? if so . u said only init once when AddBody BUT is deformed  the Bounding still correct?</w:t>
+      </w:r>
+      <w:r>
+        <w:rPr>
+          <w:lang w:val="zh-CN"/>
+        </w:rPr>
+      </w:r>
+      <w:r/>
+      <w:r/>
+    </w:p>
+    <w:p>
+      <w:pPr>
+        <w:pBdr>
+          <w:top w:val="none" w:color="000000" w:sz="4" w:space="0"/>
+          <w:left w:val="none" w:color="000000" w:sz="4" w:space="0"/>
+          <w:bottom w:val="none" w:color="000000" w:sz="4" w:space="0"/>
+          <w:right w:val="none" w:color="000000" w:sz="4" w:space="0"/>
+        </w:pBdr>
+        <w:spacing/>
+        <w:ind w:right="0" w:firstLine="0" w:left="0"/>
+        <w:rPr/>
+      </w:pPr>
+      <w:r>
+        <w:rPr>
+          <w:rFonts w:ascii="Times New Roman" w:hAnsi="Times New Roman" w:eastAsia="Times New Roman" w:cs="Times New Roman"/>
+          <w:color w:val="000000"/>
+          <w:sz w:val="24"/>
+        </w:rPr>
+        <w:t xml:space="preserve">Here are clean answers to your questions:</w:t>
+      </w:r>
+      <w:r/>
+    </w:p>
+    <w:p>
+      <w:pPr>
+        <w:pBdr>
+          <w:top w:val="none" w:color="000000" w:sz="4" w:space="0"/>
+          <w:left w:val="none" w:color="000000" w:sz="4" w:space="0"/>
+          <w:bottom w:val="none" w:color="000000" w:sz="4" w:space="0"/>
+          <w:right w:val="none" w:color="000000" w:sz="4" w:space="0"/>
+        </w:pBdr>
+        <w:spacing/>
+        <w:ind w:right="0" w:firstLine="0" w:left="0"/>
+        <w:rPr/>
+      </w:pPr>
+      <w:r>
+        <w:rPr>
+          <w:rFonts w:ascii="Times New Roman" w:hAnsi="Times New Roman" w:eastAsia="Times New Roman" w:cs="Times New Roman"/>
+          <w:b/>
+          <w:color w:val="000000"/>
+          <w:sz w:val="24"/>
+        </w:rPr>
+        <w:t xml:space="preserve">Q: Is it bodyA all particles vs bodyB all particles?</w:t>
+      </w:r>
+      <w:r>
+        <w:rPr>
+          <w:rFonts w:ascii="Times New Roman" w:hAnsi="Times New Roman" w:eastAsia="Times New Roman" w:cs="Times New Roman"/>
+          <w:color w:val="000000"/>
+          <w:sz w:val="24"/>
+        </w:rPr>
+        <w:t xml:space="preserve"> Yes — exactly. Every particle of A is tested against every particle of B. That's O(N×M) = 97,969 pairs for two 313-particle spheres. This runs in parallel on the GPU via an 8×8 thread tile. The test is purely: </w:t>
+      </w:r>
+      <w:r>
+        <w:rPr>
+          <w:rFonts w:ascii="Courier New" w:hAnsi="Courier New" w:eastAsia="Courier New" w:cs="Courier New"/>
+          <w:color w:val="000000"/>
+          <w:sz w:val="20"/>
+        </w:rPr>
+        <w:t xml:space="preserve">distance(pA, pB) &lt; ColRadius → push apart</w:t>
+      </w:r>
+      <w:r>
+        <w:rPr>
+          <w:rFonts w:ascii="Times New Roman" w:hAnsi="Times New Roman" w:eastAsia="Times New Roman" w:cs="Times New Roman"/>
+          <w:color w:val="000000"/>
+          <w:sz w:val="24"/>
+        </w:rPr>
+        <w:t xml:space="preserve">.</w:t>
+      </w:r>
+      <w:r/>
+    </w:p>
+    <w:p>
+      <w:pPr>
+        <w:pBdr>
+          <w:top w:val="none" w:color="000000" w:sz="4" w:space="0"/>
+          <w:left w:val="none" w:color="000000" w:sz="4" w:space="0"/>
+          <w:bottom w:val="none" w:color="000000" w:sz="4" w:space="0"/>
+          <w:right w:val="none" w:color="000000" w:sz="4" w:space="0"/>
+        </w:pBdr>
+        <w:spacing/>
+        <w:ind w:right="0" w:firstLine="0" w:left="0"/>
+        <w:rPr/>
+      </w:pPr>
+      <w:r>
+        <w:rPr>
+          <w:rFonts w:ascii="Times New Roman" w:hAnsi="Times New Roman" w:eastAsia="Times New Roman" w:cs="Times New Roman"/>
+          <w:b/>
+          <w:color w:val="000000"/>
+          <w:sz w:val="24"/>
+        </w:rPr>
+        <w:t xml:space="preserve">Q: Does it handle particle-through-face tunnelling in low-res meshes?</w:t>
+      </w:r>
+      <w:r>
+        <w:rPr>
+          <w:rFonts w:ascii="Times New Roman" w:hAnsi="Times New Roman" w:eastAsia="Times New Roman" w:cs="Times New Roman"/>
+          <w:color w:val="000000"/>
+          <w:sz w:val="24"/>
+        </w:rPr>
+        <w:t xml:space="preserve"> Not directly — there is no face test, only point-point proximity. It handles tunnelling </w:t>
+      </w:r>
+      <w:r>
+        <w:rPr>
+          <w:rFonts w:ascii="Times New Roman" w:hAnsi="Times New Roman" w:eastAsia="Times New Roman" w:cs="Times New Roman"/>
+          <w:i/>
+          <w:color w:val="000000"/>
+          <w:sz w:val="24"/>
+        </w:rPr>
+        <w:t xml:space="preserve">implicitly</w:t>
+      </w:r>
+      <w:r>
+        <w:rPr>
+          <w:rFonts w:ascii="Times New Roman" w:hAnsi="Times New Roman" w:eastAsia="Times New Roman" w:cs="Times New Roman"/>
+          <w:color w:val="000000"/>
+          <w:sz w:val="24"/>
+        </w:rPr>
+        <w:t xml:space="preserve"> if </w:t>
+      </w:r>
+      <w:r>
+        <w:rPr>
+          <w:rFonts w:ascii="Courier New" w:hAnsi="Courier New" w:eastAsia="Courier New" w:cs="Courier New"/>
+          <w:color w:val="000000"/>
+          <w:sz w:val="20"/>
+        </w:rPr>
+        <w:t xml:space="preserve">ColRadius</w:t>
+      </w:r>
+      <w:r>
+        <w:rPr>
+          <w:rFonts w:ascii="Times New Roman" w:hAnsi="Times New Roman" w:eastAsia="Times New Roman" w:cs="Times New Roman"/>
+          <w:color w:val="000000"/>
+          <w:sz w:val="24"/>
+        </w:rPr>
+        <w:t xml:space="preserve"> is large enough that the contact is detected before the particle crosses the gap. With the auto-formula giving </w:t>
+      </w:r>
+      <w:r>
+        <w:rPr>
+          <w:rFonts w:ascii="Courier New" w:hAnsi="Courier New" w:eastAsia="Courier New" w:cs="Courier New"/>
+          <w:color w:val="000000"/>
+          <w:sz w:val="20"/>
+        </w:rPr>
+        <w:t xml:space="preserve">ColRadius ≈ 0.30m</w:t>
+      </w:r>
+      <w:r>
+        <w:rPr>
+          <w:rFonts w:ascii="Times New Roman" w:hAnsi="Times New Roman" w:eastAsia="Times New Roman" w:cs="Times New Roman"/>
+          <w:color w:val="000000"/>
+          <w:sz w:val="24"/>
+        </w:rPr>
+        <w:t xml:space="preserve"> for unit spheres, a particle would have to move more than ~0.15m per substep to tunnel — that's ~180 m/s at 20 substeps/60fps, far beyond normal simulation. For genuinely fast impacts you'd increase SubSteps.</w:t>
+      </w:r>
+      <w:r/>
+    </w:p>
+    <w:p>
+      <w:pPr>
+        <w:pBdr>
+          <w:top w:val="none" w:color="000000" w:sz="4" w:space="0"/>
+          <w:left w:val="none" w:color="000000" w:sz="4" w:space="0"/>
+          <w:bottom w:val="none" w:color="000000" w:sz="4" w:space="0"/>
+          <w:right w:val="none" w:color="000000" w:sz="4" w:space="0"/>
+        </w:pBdr>
+        <w:spacing/>
+        <w:ind w:right="0" w:firstLine="0" w:left="0"/>
+        <w:rPr/>
+      </w:pPr>
+      <w:r>
+        <w:rPr>
+          <w:rFonts w:ascii="Times New Roman" w:hAnsi="Times New Roman" w:eastAsia="Times New Roman" w:cs="Times New Roman"/>
+          <w:b/>
+          <w:color w:val="000000"/>
+          <w:sz w:val="24"/>
+        </w:rPr>
+        <w:t xml:space="preserve">Q: Is </w:t>
+      </w:r>
+      <w:r>
+        <w:rPr>
+          <w:rFonts w:ascii="Courier New" w:hAnsi="Courier New" w:eastAsia="Courier New" w:cs="Courier New"/>
+          <w:b/>
+          <w:color w:val="000000"/>
+          <w:sz w:val="20"/>
+        </w:rPr>
+        <w:t xml:space="preserve">BoundingRadius</w:t>
+      </w:r>
+      <w:r>
+        <w:rPr>
+          <w:rFonts w:ascii="Times New Roman" w:hAnsi="Times New Roman" w:eastAsia="Times New Roman" w:cs="Times New Roman"/>
+          <w:b/>
+          <w:color w:val="000000"/>
+          <w:sz w:val="24"/>
+        </w:rPr>
+        <w:t xml:space="preserve"> the same as a circumsphere?</w:t>
+      </w:r>
+      <w:r>
+        <w:rPr>
+          <w:rFonts w:ascii="Times New Roman" w:hAnsi="Times New Roman" w:eastAsia="Times New Roman" w:cs="Times New Roman"/>
+          <w:color w:val="000000"/>
+          <w:sz w:val="24"/>
+        </w:rPr>
+        <w:t xml:space="preserve"> Yes, exactly. But the old version computed it once at rest pose and never updated it. That's wrong — a squashed sphere has a different extent than its rest shape. The new </w:t>
+      </w:r>
+      <w:r>
+        <w:rPr>
+          <w:rFonts w:ascii="Courier New" w:hAnsi="Courier New" w:eastAsia="Courier New" w:cs="Courier New"/>
+          <w:color w:val="000000"/>
+          <w:sz w:val="20"/>
+        </w:rPr>
+        <w:t xml:space="preserve">ComputeBounds</w:t>
+      </w:r>
+      <w:r>
+        <w:rPr>
+          <w:rFonts w:ascii="Times New Roman" w:hAnsi="Times New Roman" w:eastAsia="Times New Roman" w:cs="Times New Roman"/>
+          <w:color w:val="000000"/>
+          <w:sz w:val="24"/>
+        </w:rPr>
+        <w:t xml:space="preserve"> GPU kernel runs every substep and recomputes the centroid + max-particle-distance from current </w:t>
+      </w:r>
+      <w:r>
+        <w:rPr>
+          <w:rFonts w:ascii="Courier New" w:hAnsi="Courier New" w:eastAsia="Courier New" w:cs="Courier New"/>
+          <w:color w:val="000000"/>
+          <w:sz w:val="20"/>
+        </w:rPr>
+        <w:t xml:space="preserve">predict</w:t>
+      </w:r>
+      <w:r>
+        <w:rPr>
+          <w:rFonts w:ascii="Times New Roman" w:hAnsi="Times New Roman" w:eastAsia="Times New Roman" w:cs="Times New Roman"/>
+          <w:color w:val="000000"/>
+          <w:sz w:val="24"/>
+        </w:rPr>
+        <w:t xml:space="preserve"> positions. This live circumsphere is what the broad phase uses.</w:t>
+      </w:r>
+      <w:r/>
+    </w:p>
+    <w:p>
+      <w:pPr>
+        <w:pBdr>
+          <w:top w:val="none" w:color="000000" w:sz="4" w:space="0"/>
+          <w:left w:val="none" w:color="000000" w:sz="4" w:space="0"/>
+          <w:bottom w:val="none" w:color="000000" w:sz="4" w:space="0"/>
+          <w:right w:val="none" w:color="000000" w:sz="4" w:space="0"/>
+        </w:pBdr>
+        <w:spacing/>
+        <w:ind w:right="0" w:firstLine="0" w:left="0"/>
+        <w:rPr/>
+      </w:pPr>
+      <w:r>
+        <w:rPr>
+          <w:rFonts w:ascii="Times New Roman" w:hAnsi="Times New Roman" w:eastAsia="Times New Roman" w:cs="Times New Roman"/>
+          <w:b/>
+          <w:color w:val="000000"/>
+          <w:sz w:val="24"/>
+        </w:rPr>
+        <w:t xml:space="preserve">Q: How does the broad phase work now?</w:t>
+      </w:r>
+      <w:r/>
+    </w:p>
+    <w:p>
+      <w:pPr>
+        <w:pBdr>
+          <w:top w:val="none" w:color="000000" w:sz="4" w:space="0"/>
+          <w:left w:val="none" w:color="000000" w:sz="4" w:space="0"/>
+          <w:bottom w:val="none" w:color="000000" w:sz="4" w:space="0"/>
+          <w:right w:val="none" w:color="000000" w:sz="4" w:space="0"/>
+        </w:pBdr>
+        <w:spacing/>
+        <w:ind w:right="0" w:firstLine="0" w:left="0"/>
+        <w:rPr/>
+      </w:pPr>
+      <w:r>
+        <w:rPr>
+          <w:rFonts w:ascii="Times New Roman" w:hAnsi="Times New Roman" w:eastAsia="Times New Roman" w:cs="Times New Roman"/>
+          <w:color w:val="14181f"/>
+          <w:sz w:val="24"/>
+        </w:rPr>
+        <w:t xml:space="preserve">Per substep, Phase 1 (after DispatchIntegrate per body):</w:t>
+      </w:r>
+      <w:r/>
+    </w:p>
+    <w:p>
+      <w:pPr>
+        <w:pBdr>
+          <w:top w:val="none" w:color="000000" w:sz="4" w:space="0"/>
+          <w:left w:val="none" w:color="000000" w:sz="4" w:space="0"/>
+          <w:bottom w:val="none" w:color="000000" w:sz="4" w:space="0"/>
+          <w:right w:val="none" w:color="000000" w:sz="4" w:space="0"/>
+        </w:pBdr>
+        <w:spacing/>
+        <w:ind w:right="0" w:firstLine="0" w:left="0"/>
+        <w:rPr/>
+      </w:pPr>
+      <w:r>
+        <w:rPr>
+          <w:rFonts w:ascii="Times New Roman" w:hAnsi="Times New Roman" w:eastAsia="Times New Roman" w:cs="Times New Roman"/>
+          <w:color w:val="14181f"/>
+          <w:sz w:val="24"/>
+        </w:rPr>
+        <w:t xml:space="preserve">  GPU: ComputeBounds → accumulate centroid + maxDistSq into a 32-byte buffer</w:t>
+      </w:r>
+      <w:r/>
+    </w:p>
+    <w:p>
+      <w:pPr>
+        <w:pBdr>
+          <w:top w:val="none" w:color="000000" w:sz="4" w:space="0"/>
+          <w:left w:val="none" w:color="000000" w:sz="4" w:space="0"/>
+          <w:bottom w:val="none" w:color="000000" w:sz="4" w:space="0"/>
+          <w:right w:val="none" w:color="000000" w:sz="4" w:space="0"/>
+        </w:pBdr>
+        <w:spacing/>
+        <w:ind w:right="0" w:firstLine="0" w:left="0"/>
+        <w:rPr/>
+      </w:pPr>
+      <w:r>
+        <w:rPr>
+          <w:rFonts w:ascii="Times New Roman" w:hAnsi="Times New Roman" w:eastAsia="Times New Roman" w:cs="Times New Roman"/>
+          <w:sz w:val="24"/>
+        </w:rPr>
+      </w:r>
+      <w:r/>
+    </w:p>
+    <w:p>
+      <w:pPr>
+        <w:pBdr>
+          <w:top w:val="none" w:color="000000" w:sz="4" w:space="0"/>
+          <w:left w:val="none" w:color="000000" w:sz="4" w:space="0"/>
+          <w:bottom w:val="none" w:color="000000" w:sz="4" w:space="0"/>
+          <w:right w:val="none" w:color="000000" w:sz="4" w:space="0"/>
+        </w:pBdr>
+        <w:spacing/>
+        <w:ind w:right="0" w:firstLine="0" w:left="0"/>
+        <w:rPr/>
+      </w:pPr>
+      <w:r>
+        <w:rPr>
+          <w:rFonts w:ascii="Times New Roman" w:hAnsi="Times New Roman" w:eastAsia="Times New Roman" w:cs="Times New Roman"/>
+          <w:color w:val="14181f"/>
+          <w:sz w:val="24"/>
+        </w:rPr>
+        <w:t xml:space="preserve">Phase 2, per pair (A,B), before the O(N×M) dispatch:</w:t>
+      </w:r>
+      <w:r/>
+    </w:p>
+    <w:p>
+      <w:pPr>
+        <w:pBdr>
+          <w:top w:val="none" w:color="000000" w:sz="4" w:space="0"/>
+          <w:left w:val="none" w:color="000000" w:sz="4" w:space="0"/>
+          <w:bottom w:val="none" w:color="000000" w:sz="4" w:space="0"/>
+          <w:right w:val="none" w:color="000000" w:sz="4" w:space="0"/>
+        </w:pBdr>
+        <w:spacing/>
+        <w:ind w:right="0" w:firstLine="0" w:left="0"/>
+        <w:rPr/>
+      </w:pPr>
+      <w:r>
+        <w:rPr>
+          <w:rFonts w:ascii="Times New Roman" w:hAnsi="Times New Roman" w:eastAsia="Times New Roman" w:cs="Times New Roman"/>
+          <w:color w:val="14181f"/>
+          <w:sz w:val="24"/>
+        </w:rPr>
+        <w:t xml:space="preserve">  CPU reads both bounds buffers (32 bytes each — negligible)</w:t>
+      </w:r>
+      <w:r/>
+    </w:p>
+    <w:p>
+      <w:pPr>
+        <w:pBdr>
+          <w:top w:val="none" w:color="000000" w:sz="4" w:space="0"/>
+          <w:left w:val="none" w:color="000000" w:sz="4" w:space="0"/>
+          <w:bottom w:val="none" w:color="000000" w:sz="4" w:space="0"/>
+          <w:right w:val="none" w:color="000000" w:sz="4" w:space="0"/>
+        </w:pBdr>
+        <w:spacing/>
+        <w:ind w:right="0" w:firstLine="0" w:left="0"/>
+        <w:rPr/>
+      </w:pPr>
+      <w:r>
+        <w:rPr>
+          <w:rFonts w:ascii="Times New Roman" w:hAnsi="Times New Roman" w:eastAsia="Times New Roman" w:cs="Times New Roman"/>
+          <w:color w:val="14181f"/>
+          <w:sz w:val="24"/>
+        </w:rPr>
+        <w:t xml:space="preserve">  if distance(centreA, centreB) &gt; radA + radB + colRadius:</w:t>
+      </w:r>
+      <w:r/>
+    </w:p>
+    <w:p>
+      <w:pPr>
+        <w:pBdr>
+          <w:top w:val="none" w:color="000000" w:sz="4" w:space="0"/>
+          <w:left w:val="none" w:color="000000" w:sz="4" w:space="0"/>
+          <w:bottom w:val="none" w:color="000000" w:sz="4" w:space="0"/>
+          <w:right w:val="none" w:color="000000" w:sz="4" w:space="0"/>
+        </w:pBdr>
+        <w:spacing/>
+        <w:ind w:right="0" w:firstLine="0" w:left="0"/>
+        <w:rPr/>
+      </w:pPr>
+      <w:r>
+        <w:rPr>
+          <w:rFonts w:ascii="Times New Roman" w:hAnsi="Times New Roman" w:eastAsia="Times New Roman" w:cs="Times New Roman"/>
+          <w:color w:val="14181f"/>
+          <w:sz w:val="24"/>
+        </w:rPr>
+        <w:t xml:space="preserve">      skip the entire N×M detect → 0 GPU threads wasted</w:t>
+      </w:r>
+      <w:r/>
+    </w:p>
+    <w:p>
+      <w:pPr>
+        <w:pBdr>
+          <w:top w:val="none" w:color="000000" w:sz="4" w:space="0"/>
+          <w:left w:val="none" w:color="000000" w:sz="4" w:space="0"/>
+          <w:bottom w:val="none" w:color="000000" w:sz="4" w:space="0"/>
+          <w:right w:val="none" w:color="000000" w:sz="4" w:space="0"/>
+        </w:pBdr>
+        <w:spacing/>
+        <w:ind w:right="0" w:firstLine="0" w:left="0"/>
+        <w:rPr/>
+      </w:pPr>
+      <w:r>
+        <w:rPr>
+          <w:rFonts w:ascii="Times New Roman" w:hAnsi="Times New Roman" w:eastAsia="Times New Roman" w:cs="Times New Roman"/>
+          <w:color w:val="14181f"/>
+          <w:sz w:val="24"/>
+        </w:rPr>
+        <w:t xml:space="preserve">  else:</w:t>
+      </w:r>
+      <w:r/>
+    </w:p>
+    <w:p>
+      <w:pPr>
+        <w:pBdr>
+          <w:top w:val="none" w:color="000000" w:sz="4" w:space="0"/>
+          <w:left w:val="none" w:color="000000" w:sz="4" w:space="0"/>
+          <w:bottom w:val="none" w:color="000000" w:sz="4" w:space="0"/>
+          <w:right w:val="none" w:color="000000" w:sz="4" w:space="0"/>
+        </w:pBdr>
+        <w:spacing/>
+        <w:ind w:right="0" w:firstLine="0" w:left="0"/>
+        <w:rPr/>
+      </w:pPr>
+      <w:r>
+        <w:rPr>
+          <w:rFonts w:ascii="Times New Roman" w:hAnsi="Times New Roman" w:eastAsia="Times New Roman" w:cs="Times New Roman"/>
+          <w:color w:val="14181f"/>
+          <w:sz w:val="24"/>
+        </w:rPr>
+        <w:t xml:space="preserve">      dispatch DetectSoftSoft normally</w:t>
+      </w:r>
+      <w:r/>
+    </w:p>
+    <w:p>
+      <w:pPr>
+        <w:pBdr>
+          <w:top w:val="none" w:color="000000" w:sz="4" w:space="0"/>
+          <w:left w:val="none" w:color="000000" w:sz="4" w:space="0"/>
+          <w:bottom w:val="none" w:color="000000" w:sz="4" w:space="0"/>
+          <w:right w:val="none" w:color="000000" w:sz="4" w:space="0"/>
+        </w:pBdr>
+        <w:spacing/>
+        <w:ind w:right="0" w:firstLine="0" w:left="0"/>
+        <w:rPr/>
+      </w:pPr>
+      <w:r>
+        <w:rPr>
+          <w:rFonts w:ascii="Times New Roman" w:hAnsi="Times New Roman" w:eastAsia="Times New Roman" w:cs="Times New Roman"/>
+          <w:color w:val="000000"/>
+          <w:sz w:val="24"/>
+        </w:rPr>
+        <w:t xml:space="preserve">The circumsphere radii are computed from the live deformed shape, so a squashed sphere that extends further sideways than its rest radius will correctly trigger contact with a neighbour it wouldn't have touched at rest.</w:t>
+      </w:r>
+      <w:r/>
+    </w:p>
+    <w:p>
+      <w:pPr>
+        <w:pBdr/>
+        <w:spacing/>
+        <w:ind/>
+        <w:rPr/>
+      </w:pPr>
+      <w:r>
+        <w:rPr>
+          <w:highlight w:val="none"/>
+        </w:rPr>
+      </w:r>
+      <w:r>
+        <w:rPr>
+          <w:highlight w:val="none"/>
+        </w:rPr>
+      </w:r>
+    </w:p>
+    <w:p>
+      <w:pPr>
+        <w:pBdr/>
+        <w:spacing/>
+        <w:ind/>
+        <w:rPr/>
+      </w:pPr>
+      <w:r>
+        <w:rPr>
+          <w:highlight w:val="none"/>
+        </w:rPr>
+      </w:r>
+      <w:r>
+        <w:rPr>
+          <w:highlight w:val="none"/>
+        </w:rPr>
+      </w:r>
+      <w:r>
+        <w:rPr>
+          <w:highlight w:val="none"/>
+        </w:rPr>
+      </w:r>
     </w:p>
     <w:sectPr>
       <w:footnotePr/>

</xml_diff>